<commit_message>
Actualiza metadata y propiedades de Informe Técnico
</commit_message>
<xml_diff>
--- a/docs/Informe_Tecnico_Sumativa1_Grupo2.docx
+++ b/docs/Informe_Tecnico_Sumativa1_Grupo2.docx
@@ -4090,6 +4090,9 @@
     <w:p>
       <w:pPr>
         <w:pStyle w:val="Sinespaciado"/>
+        <w:rPr>
+          <w:lang w:val="es-CL"/>
+        </w:rPr>
       </w:pPr>
     </w:p>
     <w:p>
@@ -5795,6 +5798,7 @@
   <w:style w:type="character" w:default="1" w:styleId="Fuentedeprrafopredeter">
     <w:name w:val="Default Paragraph Font"/>
     <w:uiPriority w:val="1"/>
+    <w:semiHidden/>
     <w:unhideWhenUsed/>
   </w:style>
   <w:style w:type="table" w:default="1" w:styleId="Tablanormal">

</xml_diff>

<commit_message>
docs: Agrega mapa conceptual y portada a Informe_Técnico_Sumativa1_Grupo2
</commit_message>
<xml_diff>
--- a/docs/Informe_Tecnico_Sumativa1_Grupo2.docx
+++ b/docs/Informe_Tecnico_Sumativa1_Grupo2.docx
@@ -4,272 +4,1416 @@
   <w:body>
     <w:p>
       <w:pPr>
-        <w:spacing w:after="0" w:line="240" w:lineRule="auto"/>
-        <w:jc w:val="center"/>
+        <w:ind w:left="3566"/>
         <w:rPr>
-          <w:b/>
-          <w:sz w:val="40"/>
+          <w:sz w:val="20"/>
         </w:rPr>
       </w:pPr>
+      <w:r>
+        <w:rPr>
+          <w:noProof/>
+          <w:position w:val="1"/>
+          <w:sz w:val="20"/>
+        </w:rPr>
+        <w:drawing>
+          <wp:inline distT="0" distB="0" distL="0" distR="0" wp14:anchorId="67450A60" wp14:editId="5EAC00F4">
+            <wp:extent cx="790255" cy="638175"/>
+            <wp:effectExtent l="0" t="0" r="0" b="0"/>
+            <wp:docPr id="1" name="Image 1"/>
+            <wp:cNvGraphicFramePr>
+              <a:graphicFrameLocks xmlns:a="http://schemas.openxmlformats.org/drawingml/2006/main"/>
+            </wp:cNvGraphicFramePr>
+            <a:graphic xmlns:a="http://schemas.openxmlformats.org/drawingml/2006/main">
+              <a:graphicData uri="http://schemas.openxmlformats.org/drawingml/2006/picture">
+                <pic:pic xmlns:pic="http://schemas.openxmlformats.org/drawingml/2006/picture">
+                  <pic:nvPicPr>
+                    <pic:cNvPr id="1" name="Image 1"/>
+                    <pic:cNvPicPr/>
+                  </pic:nvPicPr>
+                  <pic:blipFill>
+                    <a:blip r:embed="rId8" cstate="print"/>
+                    <a:stretch>
+                      <a:fillRect/>
+                    </a:stretch>
+                  </pic:blipFill>
+                  <pic:spPr>
+                    <a:xfrm>
+                      <a:off x="0" y="0"/>
+                      <a:ext cx="790255" cy="638175"/>
+                    </a:xfrm>
+                    <a:prstGeom prst="rect">
+                      <a:avLst/>
+                    </a:prstGeom>
+                  </pic:spPr>
+                </pic:pic>
+              </a:graphicData>
+            </a:graphic>
+          </wp:inline>
+        </w:drawing>
+      </w:r>
+      <w:r>
+        <w:rPr>
+          <w:spacing w:val="63"/>
+          <w:position w:val="1"/>
+          <w:sz w:val="20"/>
+        </w:rPr>
+        <w:t xml:space="preserve"> </w:t>
+      </w:r>
+      <w:r>
+        <w:rPr>
+          <w:noProof/>
+          <w:spacing w:val="63"/>
+          <w:sz w:val="20"/>
+        </w:rPr>
+        <mc:AlternateContent>
+          <mc:Choice Requires="wpg">
+            <w:drawing>
+              <wp:inline distT="0" distB="0" distL="0" distR="0" wp14:anchorId="07AD890E" wp14:editId="276F8D98">
+                <wp:extent cx="1085215" cy="654685"/>
+                <wp:effectExtent l="0" t="0" r="0" b="2540"/>
+                <wp:docPr id="2" name="Group 2"/>
+                <wp:cNvGraphicFramePr>
+                  <a:graphicFrameLocks xmlns:a="http://schemas.openxmlformats.org/drawingml/2006/main"/>
+                </wp:cNvGraphicFramePr>
+                <a:graphic xmlns:a="http://schemas.openxmlformats.org/drawingml/2006/main">
+                  <a:graphicData uri="http://schemas.microsoft.com/office/word/2010/wordprocessingGroup">
+                    <wpg:wgp>
+                      <wpg:cNvGrpSpPr>
+                        <a:grpSpLocks/>
+                      </wpg:cNvGrpSpPr>
+                      <wpg:grpSpPr>
+                        <a:xfrm>
+                          <a:off x="0" y="0"/>
+                          <a:ext cx="1085215" cy="654685"/>
+                          <a:chOff x="0" y="0"/>
+                          <a:chExt cx="1085215" cy="654685"/>
+                        </a:xfrm>
+                      </wpg:grpSpPr>
+                      <wps:wsp>
+                        <wps:cNvPr id="3" name="Graphic 3"/>
+                        <wps:cNvSpPr/>
+                        <wps:spPr>
+                          <a:xfrm>
+                            <a:off x="12211" y="16729"/>
+                            <a:ext cx="210185" cy="309880"/>
+                          </a:xfrm>
+                          <a:custGeom>
+                            <a:avLst/>
+                            <a:gdLst/>
+                            <a:ahLst/>
+                            <a:cxnLst/>
+                            <a:rect l="l" t="t" r="r" b="b"/>
+                            <a:pathLst>
+                              <a:path w="210185" h="309880">
+                                <a:moveTo>
+                                  <a:pt x="209791" y="0"/>
+                                </a:moveTo>
+                                <a:lnTo>
+                                  <a:pt x="188086" y="0"/>
+                                </a:lnTo>
+                                <a:lnTo>
+                                  <a:pt x="188086" y="184061"/>
+                                </a:lnTo>
+                                <a:lnTo>
+                                  <a:pt x="181850" y="232548"/>
+                                </a:lnTo>
+                                <a:lnTo>
+                                  <a:pt x="164334" y="266028"/>
+                                </a:lnTo>
+                                <a:lnTo>
+                                  <a:pt x="137327" y="285432"/>
+                                </a:lnTo>
+                                <a:lnTo>
+                                  <a:pt x="102615" y="291693"/>
+                                </a:lnTo>
+                                <a:lnTo>
+                                  <a:pt x="71098" y="285811"/>
+                                </a:lnTo>
+                                <a:lnTo>
+                                  <a:pt x="45396" y="267038"/>
+                                </a:lnTo>
+                                <a:lnTo>
+                                  <a:pt x="28085" y="233684"/>
+                                </a:lnTo>
+                                <a:lnTo>
+                                  <a:pt x="21742" y="184061"/>
+                                </a:lnTo>
+                                <a:lnTo>
+                                  <a:pt x="21742" y="0"/>
+                                </a:lnTo>
+                                <a:lnTo>
+                                  <a:pt x="0" y="0"/>
+                                </a:lnTo>
+                                <a:lnTo>
+                                  <a:pt x="0" y="185381"/>
+                                </a:lnTo>
+                                <a:lnTo>
+                                  <a:pt x="8392" y="244318"/>
+                                </a:lnTo>
+                                <a:lnTo>
+                                  <a:pt x="30862" y="282681"/>
+                                </a:lnTo>
+                                <a:lnTo>
+                                  <a:pt x="63345" y="303487"/>
+                                </a:lnTo>
+                                <a:lnTo>
+                                  <a:pt x="101777" y="309753"/>
+                                </a:lnTo>
+                                <a:lnTo>
+                                  <a:pt x="142845" y="302991"/>
+                                </a:lnTo>
+                                <a:lnTo>
+                                  <a:pt x="177287" y="281095"/>
+                                </a:lnTo>
+                                <a:lnTo>
+                                  <a:pt x="200977" y="241644"/>
+                                </a:lnTo>
+                                <a:lnTo>
+                                  <a:pt x="209791" y="182219"/>
+                                </a:lnTo>
+                                <a:lnTo>
+                                  <a:pt x="209791" y="0"/>
+                                </a:lnTo>
+                                <a:close/>
+                              </a:path>
+                            </a:pathLst>
+                          </a:custGeom>
+                          <a:solidFill>
+                            <a:srgbClr val="C6C4C4"/>
+                          </a:solidFill>
+                        </wps:spPr>
+                        <wps:bodyPr wrap="square" lIns="0" tIns="0" rIns="0" bIns="0" rtlCol="0">
+                          <a:prstTxWarp prst="textNoShape">
+                            <a:avLst/>
+                          </a:prstTxWarp>
+                          <a:noAutofit/>
+                        </wps:bodyPr>
+                      </wps:wsp>
+                      <pic:pic xmlns:pic="http://schemas.openxmlformats.org/drawingml/2006/picture">
+                        <pic:nvPicPr>
+                          <pic:cNvPr id="4" name="Image 4"/>
+                          <pic:cNvPicPr/>
+                        </pic:nvPicPr>
+                        <pic:blipFill>
+                          <a:blip r:embed="rId9" cstate="print"/>
+                          <a:stretch>
+                            <a:fillRect/>
+                          </a:stretch>
+                        </pic:blipFill>
+                        <pic:spPr>
+                          <a:xfrm>
+                            <a:off x="268118" y="99496"/>
+                            <a:ext cx="173164" cy="222034"/>
+                          </a:xfrm>
+                          <a:prstGeom prst="rect">
+                            <a:avLst/>
+                          </a:prstGeom>
+                        </pic:spPr>
+                      </pic:pic>
+                      <pic:pic xmlns:pic="http://schemas.openxmlformats.org/drawingml/2006/picture">
+                        <pic:nvPicPr>
+                          <pic:cNvPr id="5" name="Image 5"/>
+                          <pic:cNvPicPr/>
+                        </pic:nvPicPr>
+                        <pic:blipFill>
+                          <a:blip r:embed="rId10" cstate="print"/>
+                          <a:stretch>
+                            <a:fillRect/>
+                          </a:stretch>
+                        </pic:blipFill>
+                        <pic:spPr>
+                          <a:xfrm>
+                            <a:off x="467959" y="99490"/>
+                            <a:ext cx="157403" cy="226999"/>
+                          </a:xfrm>
+                          <a:prstGeom prst="rect">
+                            <a:avLst/>
+                          </a:prstGeom>
+                        </pic:spPr>
+                      </pic:pic>
+                      <wps:wsp>
+                        <wps:cNvPr id="6" name="Graphic 6"/>
+                        <wps:cNvSpPr/>
+                        <wps:spPr>
+                          <a:xfrm>
+                            <a:off x="664693" y="0"/>
+                            <a:ext cx="196850" cy="327025"/>
+                          </a:xfrm>
+                          <a:custGeom>
+                            <a:avLst/>
+                            <a:gdLst/>
+                            <a:ahLst/>
+                            <a:cxnLst/>
+                            <a:rect l="l" t="t" r="r" b="b"/>
+                            <a:pathLst>
+                              <a:path w="196850" h="327025">
+                                <a:moveTo>
+                                  <a:pt x="41738" y="282625"/>
+                                </a:moveTo>
+                                <a:lnTo>
+                                  <a:pt x="22123" y="282625"/>
+                                </a:lnTo>
+                                <a:lnTo>
+                                  <a:pt x="36555" y="301872"/>
+                                </a:lnTo>
+                                <a:lnTo>
+                                  <a:pt x="54225" y="315574"/>
+                                </a:lnTo>
+                                <a:lnTo>
+                                  <a:pt x="75301" y="323768"/>
+                                </a:lnTo>
+                                <a:lnTo>
+                                  <a:pt x="99949" y="326491"/>
+                                </a:lnTo>
+                                <a:lnTo>
+                                  <a:pt x="135065" y="319274"/>
+                                </a:lnTo>
+                                <a:lnTo>
+                                  <a:pt x="150576" y="308432"/>
+                                </a:lnTo>
+                                <a:lnTo>
+                                  <a:pt x="96710" y="308432"/>
+                                </a:lnTo>
+                                <a:lnTo>
+                                  <a:pt x="72587" y="304520"/>
+                                </a:lnTo>
+                                <a:lnTo>
+                                  <a:pt x="51852" y="293436"/>
+                                </a:lnTo>
+                                <a:lnTo>
+                                  <a:pt x="41738" y="282625"/>
+                                </a:lnTo>
+                                <a:close/>
+                              </a:path>
+                              <a:path w="196850" h="327025">
+                                <a:moveTo>
+                                  <a:pt x="23469" y="0"/>
+                                </a:moveTo>
+                                <a:lnTo>
+                                  <a:pt x="1765" y="0"/>
+                                </a:lnTo>
+                                <a:lnTo>
+                                  <a:pt x="1673" y="283490"/>
+                                </a:lnTo>
+                                <a:lnTo>
+                                  <a:pt x="1444" y="293436"/>
+                                </a:lnTo>
+                                <a:lnTo>
+                                  <a:pt x="1328" y="297599"/>
+                                </a:lnTo>
+                                <a:lnTo>
+                                  <a:pt x="827" y="309409"/>
+                                </a:lnTo>
+                                <a:lnTo>
+                                  <a:pt x="0" y="321525"/>
+                                </a:lnTo>
+                                <a:lnTo>
+                                  <a:pt x="19418" y="321525"/>
+                                </a:lnTo>
+                                <a:lnTo>
+                                  <a:pt x="21170" y="282625"/>
+                                </a:lnTo>
+                                <a:lnTo>
+                                  <a:pt x="41738" y="282625"/>
+                                </a:lnTo>
+                                <a:lnTo>
+                                  <a:pt x="35686" y="276156"/>
+                                </a:lnTo>
+                                <a:lnTo>
+                                  <a:pt x="25273" y="253657"/>
+                                </a:lnTo>
+                                <a:lnTo>
+                                  <a:pt x="23926" y="248246"/>
+                                </a:lnTo>
+                                <a:lnTo>
+                                  <a:pt x="23469" y="242824"/>
+                                </a:lnTo>
+                                <a:lnTo>
+                                  <a:pt x="23469" y="186766"/>
+                                </a:lnTo>
+                                <a:lnTo>
+                                  <a:pt x="24803" y="180860"/>
+                                </a:lnTo>
+                                <a:lnTo>
+                                  <a:pt x="26187" y="175463"/>
+                                </a:lnTo>
+                                <a:lnTo>
+                                  <a:pt x="37444" y="151159"/>
+                                </a:lnTo>
+                                <a:lnTo>
+                                  <a:pt x="43036" y="145161"/>
+                                </a:lnTo>
+                                <a:lnTo>
+                                  <a:pt x="23469" y="145161"/>
+                                </a:lnTo>
+                                <a:lnTo>
+                                  <a:pt x="23469" y="0"/>
+                                </a:lnTo>
+                                <a:close/>
+                              </a:path>
+                              <a:path w="196850" h="327025">
+                                <a:moveTo>
+                                  <a:pt x="154103" y="117576"/>
+                                </a:moveTo>
+                                <a:lnTo>
+                                  <a:pt x="98539" y="117576"/>
+                                </a:lnTo>
+                                <a:lnTo>
+                                  <a:pt x="131296" y="125205"/>
+                                </a:lnTo>
+                                <a:lnTo>
+                                  <a:pt x="155270" y="145721"/>
+                                </a:lnTo>
+                                <a:lnTo>
+                                  <a:pt x="169994" y="175564"/>
+                                </a:lnTo>
+                                <a:lnTo>
+                                  <a:pt x="175006" y="211175"/>
+                                </a:lnTo>
+                                <a:lnTo>
+                                  <a:pt x="169771" y="250224"/>
+                                </a:lnTo>
+                                <a:lnTo>
+                                  <a:pt x="154522" y="281006"/>
+                                </a:lnTo>
+                                <a:lnTo>
+                                  <a:pt x="129941" y="301186"/>
+                                </a:lnTo>
+                                <a:lnTo>
+                                  <a:pt x="96710" y="308432"/>
+                                </a:lnTo>
+                                <a:lnTo>
+                                  <a:pt x="150576" y="308432"/>
+                                </a:lnTo>
+                                <a:lnTo>
+                                  <a:pt x="166073" y="297599"/>
+                                </a:lnTo>
+                                <a:lnTo>
+                                  <a:pt x="188186" y="261426"/>
+                                </a:lnTo>
+                                <a:lnTo>
+                                  <a:pt x="196621" y="210718"/>
+                                </a:lnTo>
+                                <a:lnTo>
+                                  <a:pt x="189841" y="165885"/>
+                                </a:lnTo>
+                                <a:lnTo>
+                                  <a:pt x="170822" y="130702"/>
+                                </a:lnTo>
+                                <a:lnTo>
+                                  <a:pt x="154103" y="117576"/>
+                                </a:lnTo>
+                                <a:close/>
+                              </a:path>
+                              <a:path w="196850" h="327025">
+                                <a:moveTo>
+                                  <a:pt x="104000" y="99491"/>
+                                </a:moveTo>
+                                <a:lnTo>
+                                  <a:pt x="77361" y="102680"/>
+                                </a:lnTo>
+                                <a:lnTo>
+                                  <a:pt x="55192" y="111801"/>
+                                </a:lnTo>
+                                <a:lnTo>
+                                  <a:pt x="37536" y="126184"/>
+                                </a:lnTo>
+                                <a:lnTo>
+                                  <a:pt x="24434" y="145161"/>
+                                </a:lnTo>
+                                <a:lnTo>
+                                  <a:pt x="43036" y="145161"/>
+                                </a:lnTo>
+                                <a:lnTo>
+                                  <a:pt x="54414" y="132956"/>
+                                </a:lnTo>
+                                <a:lnTo>
+                                  <a:pt x="75359" y="121535"/>
+                                </a:lnTo>
+                                <a:lnTo>
+                                  <a:pt x="98539" y="117576"/>
+                                </a:lnTo>
+                                <a:lnTo>
+                                  <a:pt x="154103" y="117576"/>
+                                </a:lnTo>
+                                <a:lnTo>
+                                  <a:pt x="141548" y="107719"/>
+                                </a:lnTo>
+                                <a:lnTo>
+                                  <a:pt x="104000" y="99491"/>
+                                </a:lnTo>
+                                <a:close/>
+                              </a:path>
+                            </a:pathLst>
+                          </a:custGeom>
+                          <a:solidFill>
+                            <a:srgbClr val="C6C4C4"/>
+                          </a:solidFill>
+                        </wps:spPr>
+                        <wps:bodyPr wrap="square" lIns="0" tIns="0" rIns="0" bIns="0" rtlCol="0">
+                          <a:prstTxWarp prst="textNoShape">
+                            <a:avLst/>
+                          </a:prstTxWarp>
+                          <a:noAutofit/>
+                        </wps:bodyPr>
+                      </wps:wsp>
+                      <wps:wsp>
+                        <wps:cNvPr id="7" name="Graphic 7"/>
+                        <wps:cNvSpPr/>
+                        <wps:spPr>
+                          <a:xfrm>
+                            <a:off x="0" y="359087"/>
+                            <a:ext cx="262255" cy="295275"/>
+                          </a:xfrm>
+                          <a:custGeom>
+                            <a:avLst/>
+                            <a:gdLst/>
+                            <a:ahLst/>
+                            <a:cxnLst/>
+                            <a:rect l="l" t="t" r="r" b="b"/>
+                            <a:pathLst>
+                              <a:path w="262255" h="295275">
+                                <a:moveTo>
+                                  <a:pt x="132892" y="0"/>
+                                </a:moveTo>
+                                <a:lnTo>
+                                  <a:pt x="91646" y="6225"/>
+                                </a:lnTo>
+                                <a:lnTo>
+                                  <a:pt x="56397" y="24345"/>
+                                </a:lnTo>
+                                <a:lnTo>
+                                  <a:pt x="28735" y="52464"/>
+                                </a:lnTo>
+                                <a:lnTo>
+                                  <a:pt x="9702" y="89522"/>
+                                </a:lnTo>
+                                <a:lnTo>
+                                  <a:pt x="605" y="133933"/>
+                                </a:lnTo>
+                                <a:lnTo>
+                                  <a:pt x="0" y="150075"/>
+                                </a:lnTo>
+                                <a:lnTo>
+                                  <a:pt x="591" y="165818"/>
+                                </a:lnTo>
+                                <a:lnTo>
+                                  <a:pt x="9499" y="208889"/>
+                                </a:lnTo>
+                                <a:lnTo>
+                                  <a:pt x="27934" y="244708"/>
+                                </a:lnTo>
+                                <a:lnTo>
+                                  <a:pt x="65180" y="278774"/>
+                                </a:lnTo>
+                                <a:lnTo>
+                                  <a:pt x="101544" y="292596"/>
+                                </a:lnTo>
+                                <a:lnTo>
+                                  <a:pt x="128841" y="295236"/>
+                                </a:lnTo>
+                                <a:lnTo>
+                                  <a:pt x="142614" y="294629"/>
+                                </a:lnTo>
+                                <a:lnTo>
+                                  <a:pt x="181089" y="285534"/>
+                                </a:lnTo>
+                                <a:lnTo>
+                                  <a:pt x="213700" y="265749"/>
+                                </a:lnTo>
+                                <a:lnTo>
+                                  <a:pt x="216872" y="262674"/>
+                                </a:lnTo>
+                                <a:lnTo>
+                                  <a:pt x="131127" y="262674"/>
+                                </a:lnTo>
+                                <a:lnTo>
+                                  <a:pt x="120483" y="262054"/>
+                                </a:lnTo>
+                                <a:lnTo>
+                                  <a:pt x="84634" y="247719"/>
+                                </a:lnTo>
+                                <a:lnTo>
+                                  <a:pt x="59335" y="218899"/>
+                                </a:lnTo>
+                                <a:lnTo>
+                                  <a:pt x="45218" y="180565"/>
+                                </a:lnTo>
+                                <a:lnTo>
+                                  <a:pt x="42092" y="150075"/>
+                                </a:lnTo>
+                                <a:lnTo>
+                                  <a:pt x="42197" y="144678"/>
+                                </a:lnTo>
+                                <a:lnTo>
+                                  <a:pt x="47269" y="106692"/>
+                                </a:lnTo>
+                                <a:lnTo>
+                                  <a:pt x="63525" y="69405"/>
+                                </a:lnTo>
+                                <a:lnTo>
+                                  <a:pt x="91541" y="42976"/>
+                                </a:lnTo>
+                                <a:lnTo>
+                                  <a:pt x="131533" y="32981"/>
+                                </a:lnTo>
+                                <a:lnTo>
+                                  <a:pt x="219551" y="32981"/>
+                                </a:lnTo>
+                                <a:lnTo>
+                                  <a:pt x="217382" y="30794"/>
+                                </a:lnTo>
+                                <a:lnTo>
+                                  <a:pt x="173401" y="5845"/>
+                                </a:lnTo>
+                                <a:lnTo>
+                                  <a:pt x="147044" y="649"/>
+                                </a:lnTo>
+                                <a:lnTo>
+                                  <a:pt x="132892" y="0"/>
+                                </a:lnTo>
+                                <a:close/>
+                              </a:path>
+                              <a:path w="262255" h="295275">
+                                <a:moveTo>
+                                  <a:pt x="219551" y="32981"/>
+                                </a:moveTo>
+                                <a:lnTo>
+                                  <a:pt x="131533" y="32981"/>
+                                </a:lnTo>
+                                <a:lnTo>
+                                  <a:pt x="142500" y="33609"/>
+                                </a:lnTo>
+                                <a:lnTo>
+                                  <a:pt x="152714" y="35488"/>
+                                </a:lnTo>
+                                <a:lnTo>
+                                  <a:pt x="186229" y="54538"/>
+                                </a:lnTo>
+                                <a:lnTo>
+                                  <a:pt x="207991" y="86467"/>
+                                </a:lnTo>
+                                <a:lnTo>
+                                  <a:pt x="218830" y="126145"/>
+                                </a:lnTo>
+                                <a:lnTo>
+                                  <a:pt x="220119" y="144678"/>
+                                </a:lnTo>
+                                <a:lnTo>
+                                  <a:pt x="220071" y="150075"/>
+                                </a:lnTo>
+                                <a:lnTo>
+                                  <a:pt x="214998" y="188988"/>
+                                </a:lnTo>
+                                <a:lnTo>
+                                  <a:pt x="198704" y="226313"/>
+                                </a:lnTo>
+                                <a:lnTo>
+                                  <a:pt x="170903" y="252717"/>
+                                </a:lnTo>
+                                <a:lnTo>
+                                  <a:pt x="131127" y="262674"/>
+                                </a:lnTo>
+                                <a:lnTo>
+                                  <a:pt x="216872" y="262674"/>
+                                </a:lnTo>
+                                <a:lnTo>
+                                  <a:pt x="246331" y="221751"/>
+                                </a:lnTo>
+                                <a:lnTo>
+                                  <a:pt x="259297" y="178192"/>
+                                </a:lnTo>
+                                <a:lnTo>
+                                  <a:pt x="261785" y="144678"/>
+                                </a:lnTo>
+                                <a:lnTo>
+                                  <a:pt x="261204" y="128758"/>
+                                </a:lnTo>
+                                <a:lnTo>
+                                  <a:pt x="252514" y="85458"/>
+                                </a:lnTo>
+                                <a:lnTo>
+                                  <a:pt x="234268" y="49741"/>
+                                </a:lnTo>
+                                <a:lnTo>
+                                  <a:pt x="226263" y="39750"/>
+                                </a:lnTo>
+                                <a:lnTo>
+                                  <a:pt x="219551" y="32981"/>
+                                </a:lnTo>
+                                <a:close/>
+                              </a:path>
+                            </a:pathLst>
+                          </a:custGeom>
+                          <a:solidFill>
+                            <a:srgbClr val="AF0F1E"/>
+                          </a:solidFill>
+                        </wps:spPr>
+                        <wps:bodyPr wrap="square" lIns="0" tIns="0" rIns="0" bIns="0" rtlCol="0">
+                          <a:prstTxWarp prst="textNoShape">
+                            <a:avLst/>
+                          </a:prstTxWarp>
+                          <a:noAutofit/>
+                        </wps:bodyPr>
+                      </wps:wsp>
+                      <pic:pic xmlns:pic="http://schemas.openxmlformats.org/drawingml/2006/picture">
+                        <pic:nvPicPr>
+                          <pic:cNvPr id="8" name="Image 8"/>
+                          <pic:cNvPicPr/>
+                        </pic:nvPicPr>
+                        <pic:blipFill>
+                          <a:blip r:embed="rId11" cstate="print"/>
+                          <a:stretch>
+                            <a:fillRect/>
+                          </a:stretch>
+                        </pic:blipFill>
+                        <pic:spPr>
+                          <a:xfrm>
+                            <a:off x="292969" y="425991"/>
+                            <a:ext cx="188099" cy="223354"/>
+                          </a:xfrm>
+                          <a:prstGeom prst="rect">
+                            <a:avLst/>
+                          </a:prstGeom>
+                        </pic:spPr>
+                      </pic:pic>
+                      <wps:wsp>
+                        <wps:cNvPr id="9" name="Graphic 9"/>
+                        <wps:cNvSpPr/>
+                        <wps:spPr>
+                          <a:xfrm>
+                            <a:off x="520406" y="354528"/>
+                            <a:ext cx="121285" cy="295275"/>
+                          </a:xfrm>
+                          <a:custGeom>
+                            <a:avLst/>
+                            <a:gdLst/>
+                            <a:ahLst/>
+                            <a:cxnLst/>
+                            <a:rect l="l" t="t" r="r" b="b"/>
+                            <a:pathLst>
+                              <a:path w="121285" h="295275">
+                                <a:moveTo>
+                                  <a:pt x="39789" y="0"/>
+                                </a:moveTo>
+                                <a:lnTo>
+                                  <a:pt x="0" y="0"/>
+                                </a:lnTo>
+                                <a:lnTo>
+                                  <a:pt x="0" y="294817"/>
+                                </a:lnTo>
+                                <a:lnTo>
+                                  <a:pt x="39789" y="294817"/>
+                                </a:lnTo>
+                                <a:lnTo>
+                                  <a:pt x="39789" y="0"/>
+                                </a:lnTo>
+                                <a:close/>
+                              </a:path>
+                              <a:path w="121285" h="295275">
+                                <a:moveTo>
+                                  <a:pt x="121208" y="71894"/>
+                                </a:moveTo>
+                                <a:lnTo>
+                                  <a:pt x="81419" y="71894"/>
+                                </a:lnTo>
+                                <a:lnTo>
+                                  <a:pt x="81419" y="294817"/>
+                                </a:lnTo>
+                                <a:lnTo>
+                                  <a:pt x="121208" y="294817"/>
+                                </a:lnTo>
+                                <a:lnTo>
+                                  <a:pt x="121208" y="71894"/>
+                                </a:lnTo>
+                                <a:close/>
+                              </a:path>
+                              <a:path w="121285" h="295275">
+                                <a:moveTo>
+                                  <a:pt x="121208" y="21717"/>
+                                </a:moveTo>
+                                <a:lnTo>
+                                  <a:pt x="81419" y="21717"/>
+                                </a:lnTo>
+                                <a:lnTo>
+                                  <a:pt x="81419" y="52946"/>
+                                </a:lnTo>
+                                <a:lnTo>
+                                  <a:pt x="121208" y="52946"/>
+                                </a:lnTo>
+                                <a:lnTo>
+                                  <a:pt x="121208" y="21717"/>
+                                </a:lnTo>
+                                <a:close/>
+                              </a:path>
+                            </a:pathLst>
+                          </a:custGeom>
+                          <a:solidFill>
+                            <a:srgbClr val="AF0F1E"/>
+                          </a:solidFill>
+                        </wps:spPr>
+                        <wps:bodyPr wrap="square" lIns="0" tIns="0" rIns="0" bIns="0" rtlCol="0">
+                          <a:prstTxWarp prst="textNoShape">
+                            <a:avLst/>
+                          </a:prstTxWarp>
+                          <a:noAutofit/>
+                        </wps:bodyPr>
+                      </wps:wsp>
+                      <pic:pic xmlns:pic="http://schemas.openxmlformats.org/drawingml/2006/picture">
+                        <pic:nvPicPr>
+                          <pic:cNvPr id="10" name="Image 10"/>
+                          <pic:cNvPicPr/>
+                        </pic:nvPicPr>
+                        <pic:blipFill>
+                          <a:blip r:embed="rId12" cstate="print"/>
+                          <a:stretch>
+                            <a:fillRect/>
+                          </a:stretch>
+                        </pic:blipFill>
+                        <pic:spPr>
+                          <a:xfrm>
+                            <a:off x="680515" y="425991"/>
+                            <a:ext cx="188112" cy="223354"/>
+                          </a:xfrm>
+                          <a:prstGeom prst="rect">
+                            <a:avLst/>
+                          </a:prstGeom>
+                        </pic:spPr>
+                      </pic:pic>
+                      <pic:pic xmlns:pic="http://schemas.openxmlformats.org/drawingml/2006/picture">
+                        <pic:nvPicPr>
+                          <pic:cNvPr id="11" name="Image 11"/>
+                          <pic:cNvPicPr/>
+                        </pic:nvPicPr>
+                        <pic:blipFill>
+                          <a:blip r:embed="rId13" cstate="print"/>
+                          <a:stretch>
+                            <a:fillRect/>
+                          </a:stretch>
+                        </pic:blipFill>
+                        <pic:spPr>
+                          <a:xfrm>
+                            <a:off x="892149" y="425985"/>
+                            <a:ext cx="193021" cy="227914"/>
+                          </a:xfrm>
+                          <a:prstGeom prst="rect">
+                            <a:avLst/>
+                          </a:prstGeom>
+                        </pic:spPr>
+                      </pic:pic>
+                    </wpg:wgp>
+                  </a:graphicData>
+                </a:graphic>
+              </wp:inline>
+            </w:drawing>
+          </mc:Choice>
+          <mc:Fallback>
+            <w:pict>
+              <v:group w14:anchorId="1BFFF753" id="Group 2" o:spid="_x0000_s1026" style="width:85.45pt;height:51.55pt;mso-position-horizontal-relative:char;mso-position-vertical-relative:line" coordsize="10852,6546" o:gfxdata="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">
+                <v:shape id="Graphic 3" o:spid="_x0000_s1027" style="position:absolute;left:122;top:167;width:2101;height:3099;visibility:visible;mso-wrap-style:square;v-text-anchor:top" coordsize="210185,309880" o:gfxdata="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" path="m209791,l188086,r,184061l181850,232548r-17516,33480l137327,285432r-34712,6261l71098,285811,45396,267038,28085,233684,21742,184061,21742,,,,,185381r8392,58937l30862,282681r32483,20806l101777,309753r41068,-6762l177287,281095r23690,-39451l209791,182219,209791,xe" fillcolor="#c6c4c4" stroked="f">
+                  <v:path arrowok="t"/>
+                </v:shape>
+                <v:shapetype id="_x0000_t75" coordsize="21600,21600" o:spt="75" o:preferrelative="t" path="m@4@5l@4@11@9@11@9@5xe" filled="f" stroked="f">
+                  <v:stroke joinstyle="miter"/>
+                  <v:formulas>
+                    <v:f eqn="if lineDrawn pixelLineWidth 0"/>
+                    <v:f eqn="sum @0 1 0"/>
+                    <v:f eqn="sum 0 0 @1"/>
+                    <v:f eqn="prod @2 1 2"/>
+                    <v:f eqn="prod @3 21600 pixelWidth"/>
+                    <v:f eqn="prod @3 21600 pixelHeight"/>
+                    <v:f eqn="sum @0 0 1"/>
+                    <v:f eqn="prod @6 1 2"/>
+                    <v:f eqn="prod @7 21600 pixelWidth"/>
+                    <v:f eqn="sum @8 21600 0"/>
+                    <v:f eqn="prod @7 21600 pixelHeight"/>
+                    <v:f eqn="sum @10 21600 0"/>
+                  </v:formulas>
+                  <v:path o:extrusionok="f" gradientshapeok="t" o:connecttype="rect"/>
+                  <o:lock v:ext="edit" aspectratio="t"/>
+                </v:shapetype>
+                <v:shape id="Image 4" o:spid="_x0000_s1028" type="#_x0000_t75" style="position:absolute;left:2681;top:994;width:1731;height:2221;visibility:visible;mso-wrap-style:square" o:gfxdata="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">
+                  <v:imagedata r:id="rId14" o:title=""/>
+                </v:shape>
+                <v:shape id="Image 5" o:spid="_x0000_s1029" type="#_x0000_t75" style="position:absolute;left:4679;top:994;width:1574;height:2270;visibility:visible;mso-wrap-style:square" o:gfxdata="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">
+                  <v:imagedata r:id="rId15" o:title=""/>
+                </v:shape>
+                <v:shape id="Graphic 6" o:spid="_x0000_s1030" style="position:absolute;left:6646;width:1969;height:3270;visibility:visible;mso-wrap-style:square;v-text-anchor:top" coordsize="196850,327025" o:gfxdata="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" path="m41738,282625r-19615,l36555,301872r17670,13702l75301,323768r24648,2723l135065,319274r15511,-10842l96710,308432,72587,304520,51852,293436,41738,282625xem23469,l1765,r-92,283490l1444,293436r-116,4163l827,309409,,321525r19418,l21170,282625r20568,l35686,276156,25273,253657r-1347,-5411l23469,242824r,-56058l24803,180860r1384,-5397l37444,151159r5592,-5998l23469,145161,23469,xem154103,117576r-55564,l131296,125205r23974,20516l169994,175564r5012,35611l169771,250224r-15249,30782l129941,301186r-33231,7246l150576,308432r15497,-10833l188186,261426r8435,-50708l189841,165885,170822,130702,154103,117576xem104000,99491r-26639,3189l55192,111801,37536,126184,24434,145161r18602,l54414,132956,75359,121535r23180,-3959l154103,117576r-12555,-9857l104000,99491xe" fillcolor="#c6c4c4" stroked="f">
+                  <v:path arrowok="t"/>
+                </v:shape>
+                <v:shape id="Graphic 7" o:spid="_x0000_s1031" style="position:absolute;top:3590;width:2622;height:2953;visibility:visible;mso-wrap-style:square;v-text-anchor:top" coordsize="262255,295275" o:gfxdata="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" path="m132892,l91646,6225,56397,24345,28735,52464,9702,89522,605,133933,,150075r591,15743l9499,208889r18435,35819l65180,278774r36364,13822l128841,295236r13773,-607l181089,285534r32611,-19785l216872,262674r-85745,l120483,262054,84634,247719,59335,218899,45218,180565,42092,150075r105,-5397l47269,106692,63525,69405,91541,42976r39992,-9995l219551,32981r-2169,-2187l173401,5845,147044,649,132892,xem219551,32981r-88018,l142500,33609r10214,1879l186229,54538r21762,31929l218830,126145r1289,18533l220071,150075r-5073,38913l198704,226313r-27801,26404l131127,262674r85745,l246331,221751r12966,-43559l261785,144678r-581,-15920l252514,85458,234268,49741r-8005,-9991l219551,32981xe" fillcolor="#af0f1e" stroked="f">
+                  <v:path arrowok="t"/>
+                </v:shape>
+                <v:shape id="Image 8" o:spid="_x0000_s1032" type="#_x0000_t75" style="position:absolute;left:2929;top:4259;width:1881;height:2234;visibility:visible;mso-wrap-style:square" o:gfxdata="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">
+                  <v:imagedata r:id="rId16" o:title=""/>
+                </v:shape>
+                <v:shape id="Graphic 9" o:spid="_x0000_s1033" style="position:absolute;left:5204;top:3545;width:1212;height:2953;visibility:visible;mso-wrap-style:square;v-text-anchor:top" coordsize="121285,295275" o:gfxdata="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" path="m39789,l,,,294817r39789,l39789,xem121208,71894r-39789,l81419,294817r39789,l121208,71894xem121208,21717r-39789,l81419,52946r39789,l121208,21717xe" fillcolor="#af0f1e" stroked="f">
+                  <v:path arrowok="t"/>
+                </v:shape>
+                <v:shape id="Image 10" o:spid="_x0000_s1034" type="#_x0000_t75" style="position:absolute;left:6805;top:4259;width:1881;height:2234;visibility:visible;mso-wrap-style:square" o:gfxdata="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">
+                  <v:imagedata r:id="rId17" o:title=""/>
+                </v:shape>
+                <v:shape id="Image 11" o:spid="_x0000_s1035" type="#_x0000_t75" style="position:absolute;left:8921;top:4259;width:1930;height:2279;visibility:visible;mso-wrap-style:square" o:gfxdata="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">
+                  <v:imagedata r:id="rId18" o:title=""/>
+                </v:shape>
+                <w10:anchorlock/>
+              </v:group>
+            </w:pict>
+          </mc:Fallback>
+        </mc:AlternateContent>
+      </w:r>
     </w:p>
     <w:p>
       <w:pPr>
-        <w:spacing w:after="0" w:line="240" w:lineRule="auto"/>
-        <w:jc w:val="center"/>
+        <w:pStyle w:val="Textoindependiente"/>
         <w:rPr>
-          <w:b/>
-          <w:sz w:val="40"/>
+          <w:sz w:val="20"/>
         </w:rPr>
       </w:pPr>
     </w:p>
     <w:p>
       <w:pPr>
-        <w:spacing w:after="0" w:line="240" w:lineRule="auto"/>
-        <w:jc w:val="center"/>
+        <w:pStyle w:val="Textoindependiente"/>
         <w:rPr>
-          <w:b/>
-          <w:sz w:val="40"/>
+          <w:sz w:val="20"/>
         </w:rPr>
       </w:pPr>
     </w:p>
     <w:p>
       <w:pPr>
-        <w:spacing w:after="0" w:line="240" w:lineRule="auto"/>
-        <w:jc w:val="center"/>
+        <w:pStyle w:val="Textoindependiente"/>
         <w:rPr>
-          <w:b/>
-          <w:sz w:val="40"/>
+          <w:sz w:val="20"/>
         </w:rPr>
       </w:pPr>
     </w:p>
     <w:p>
       <w:pPr>
-        <w:spacing w:after="0" w:line="240" w:lineRule="auto"/>
-        <w:jc w:val="center"/>
+        <w:pStyle w:val="Textoindependiente"/>
         <w:rPr>
-          <w:b/>
-          <w:sz w:val="40"/>
+          <w:sz w:val="20"/>
         </w:rPr>
       </w:pPr>
     </w:p>
     <w:p>
       <w:pPr>
-        <w:spacing w:after="0" w:line="240" w:lineRule="auto"/>
-        <w:jc w:val="center"/>
+        <w:pStyle w:val="Textoindependiente"/>
         <w:rPr>
-          <w:b/>
-          <w:sz w:val="40"/>
+          <w:sz w:val="20"/>
         </w:rPr>
       </w:pPr>
     </w:p>
     <w:p>
       <w:pPr>
-        <w:spacing w:after="0" w:line="240" w:lineRule="auto"/>
-        <w:jc w:val="center"/>
+        <w:pStyle w:val="Textoindependiente"/>
         <w:rPr>
-          <w:b/>
-          <w:sz w:val="40"/>
+          <w:sz w:val="20"/>
         </w:rPr>
       </w:pPr>
-      <w:r>
-        <w:rPr>
-          <w:b/>
-          <w:sz w:val="40"/>
-        </w:rPr>
-        <w:t>SUMATIVA 1</w:t>
-      </w:r>
     </w:p>
     <w:p>
       <w:pPr>
-        <w:spacing w:after="0" w:line="240" w:lineRule="auto"/>
-        <w:jc w:val="center"/>
-        <w:rPr>
-          <w:b/>
-          <w:sz w:val="36"/>
-        </w:rPr>
-      </w:pPr>
-      <w:r>
-        <w:rPr>
-          <w:b/>
-          <w:sz w:val="36"/>
-        </w:rPr>
-        <w:t>Proyecto de Ciencia de Datos</w:t>
-      </w:r>
-    </w:p>
-    <w:p>
-      <w:pPr>
-        <w:spacing w:after="0" w:line="240" w:lineRule="auto"/>
-        <w:jc w:val="center"/>
-      </w:pPr>
-    </w:p>
-    <w:p>
-      <w:pPr>
-        <w:spacing w:after="0" w:line="240" w:lineRule="auto"/>
-        <w:jc w:val="center"/>
-      </w:pPr>
-      <w:r>
-        <w:t>Patrones temporales de generación eléctrica en centrales TER CMPC</w:t>
-      </w:r>
-    </w:p>
-    <w:p>
-      <w:pPr>
-        <w:spacing w:after="0" w:line="240" w:lineRule="auto"/>
-        <w:jc w:val="center"/>
-        <w:rPr>
-          <w:b/>
-        </w:rPr>
-      </w:pPr>
-      <w:r>
-        <w:rPr>
-          <w:b/>
-        </w:rPr>
-        <w:t>Laja, Pacífico y Santa Fe - enero a agosto de 2026</w:t>
-      </w:r>
-    </w:p>
-    <w:p>
-      <w:pPr>
-        <w:spacing w:after="0" w:line="240" w:lineRule="auto"/>
-        <w:jc w:val="center"/>
-      </w:pPr>
-    </w:p>
-    <w:p>
-      <w:pPr>
-        <w:spacing w:after="0" w:line="240" w:lineRule="auto"/>
-        <w:jc w:val="center"/>
-      </w:pPr>
-      <w:r>
-        <w:t>Magíster en Ciencia de Datos e Inteligencia Artificial</w:t>
-      </w:r>
-    </w:p>
-    <w:p>
-      <w:pPr>
-        <w:spacing w:after="0" w:line="240" w:lineRule="auto"/>
-        <w:jc w:val="center"/>
-      </w:pPr>
-      <w:r>
-        <w:t>Asignatura</w:t>
-      </w:r>
-      <w:r>
+        <w:pBdr>
+          <w:top w:val="nil"/>
+          <w:left w:val="nil"/>
+          <w:bottom w:val="nil"/>
+          <w:right w:val="nil"/>
+          <w:between w:val="nil"/>
+        </w:pBdr>
+        <w:spacing w:before="210"/>
         <w:rPr>
           <w:b/>
           <w:bCs/>
+          <w:color w:val="000000"/>
+          <w:sz w:val="48"/>
+          <w:szCs w:val="48"/>
         </w:rPr>
-        <w:t>:</w:t>
-      </w:r>
-      <w:r>
-        <w:t xml:space="preserve"> Programación para la Ciencia de Datos</w:t>
-      </w:r>
-    </w:p>
-    <w:p>
-      <w:pPr>
-        <w:spacing w:after="0" w:line="240" w:lineRule="auto"/>
-        <w:jc w:val="center"/>
-      </w:pPr>
-      <w:r>
-        <w:t>Código</w:t>
-      </w:r>
+      </w:pPr>
       <w:r>
         <w:rPr>
           <w:b/>
           <w:bCs/>
+          <w:color w:val="000000" w:themeColor="text1"/>
+          <w:sz w:val="48"/>
+          <w:szCs w:val="48"/>
         </w:rPr>
-        <w:t>:</w:t>
-      </w:r>
-      <w:r>
-        <w:t xml:space="preserve"> MCDIA500</w:t>
+        <w:t>MCDI500 </w:t>
       </w:r>
     </w:p>
     <w:p>
       <w:pPr>
-        <w:spacing w:after="0" w:line="240" w:lineRule="auto"/>
-        <w:jc w:val="center"/>
-      </w:pPr>
-      <w:r>
-        <w:t>Docente</w:t>
-      </w:r>
-      <w:r>
+        <w:pBdr>
+          <w:top w:val="nil"/>
+          <w:left w:val="nil"/>
+          <w:bottom w:val="nil"/>
+          <w:right w:val="nil"/>
+          <w:between w:val="nil"/>
+        </w:pBdr>
+        <w:spacing w:before="210"/>
         <w:rPr>
           <w:b/>
           <w:bCs/>
+          <w:color w:val="000000" w:themeColor="text1"/>
+          <w:sz w:val="48"/>
+          <w:szCs w:val="48"/>
+          <w:lang w:eastAsia="es-ES" w:bidi="es-ES"/>
         </w:rPr>
-        <w:t>:</w:t>
-      </w:r>
-      <w:r>
-        <w:t xml:space="preserve"> Omar Salinas Silva</w:t>
+      </w:pPr>
+      <w:r>
+        <w:rPr>
+          <w:b/>
+          <w:bCs/>
+          <w:color w:val="000000" w:themeColor="text1"/>
+          <w:sz w:val="48"/>
+          <w:szCs w:val="48"/>
+          <w:lang w:eastAsia="es-ES" w:bidi="es-ES"/>
+        </w:rPr>
+        <w:t>PROGRAMACIÓN PARA LA CIENCIA DE DATOS</w:t>
       </w:r>
     </w:p>
     <w:p>
       <w:pPr>
-        <w:spacing w:after="0" w:line="240" w:lineRule="auto"/>
-        <w:jc w:val="center"/>
-      </w:pPr>
+        <w:pBdr>
+          <w:top w:val="nil"/>
+          <w:left w:val="nil"/>
+          <w:bottom w:val="nil"/>
+          <w:right w:val="nil"/>
+          <w:between w:val="nil"/>
+        </w:pBdr>
+        <w:spacing w:before="210"/>
+        <w:rPr>
+          <w:b/>
+          <w:bCs/>
+          <w:color w:val="000000" w:themeColor="text1"/>
+          <w:sz w:val="48"/>
+          <w:szCs w:val="48"/>
+          <w:lang w:eastAsia="es-ES" w:bidi="es-ES"/>
+        </w:rPr>
+      </w:pPr>
+      <w:r>
+        <w:rPr>
+          <w:b/>
+          <w:bCs/>
+          <w:color w:val="000000" w:themeColor="text1"/>
+          <w:sz w:val="48"/>
+          <w:szCs w:val="48"/>
+          <w:lang w:eastAsia="es-ES" w:bidi="es-ES"/>
+        </w:rPr>
+        <w:t>EVALUACIÓN SUMATIVA 1</w:t>
+      </w:r>
     </w:p>
     <w:p>
       <w:pPr>
-        <w:spacing w:after="0" w:line="240" w:lineRule="auto"/>
-        <w:jc w:val="center"/>
-      </w:pPr>
-      <w:r>
-        <w:t>Integrantes:</w:t>
+        <w:pBdr>
+          <w:top w:val="nil"/>
+          <w:left w:val="nil"/>
+          <w:bottom w:val="nil"/>
+          <w:right w:val="nil"/>
+          <w:between w:val="nil"/>
+        </w:pBdr>
+        <w:spacing w:before="210"/>
+        <w:rPr>
+          <w:b/>
+          <w:bCs/>
+          <w:color w:val="000000" w:themeColor="text1"/>
+          <w:sz w:val="28"/>
+          <w:szCs w:val="28"/>
+          <w:lang w:eastAsia="es-ES" w:bidi="es-ES"/>
+        </w:rPr>
+      </w:pPr>
+      <w:r>
+        <w:rPr>
+          <w:b/>
+          <w:bCs/>
+          <w:color w:val="000000" w:themeColor="text1"/>
+          <w:sz w:val="28"/>
+          <w:szCs w:val="28"/>
+          <w:lang w:eastAsia="es-ES" w:bidi="es-ES"/>
+        </w:rPr>
+        <w:t>PATRONES TEMPORALES DE GENERACIÓN ELÉCTRICA EN CENTRALES TER CMPC</w:t>
       </w:r>
     </w:p>
     <w:p>
       <w:pPr>
-        <w:spacing w:after="0" w:line="240" w:lineRule="auto"/>
-        <w:jc w:val="center"/>
-      </w:pPr>
-      <w:r>
-        <w:t>Verónica Durán Cisterna</w:t>
+        <w:pBdr>
+          <w:top w:val="nil"/>
+          <w:left w:val="nil"/>
+          <w:bottom w:val="nil"/>
+          <w:right w:val="nil"/>
+          <w:between w:val="nil"/>
+        </w:pBdr>
+        <w:spacing w:before="210"/>
+        <w:rPr>
+          <w:b/>
+          <w:bCs/>
+          <w:color w:val="000000" w:themeColor="text1"/>
+          <w:sz w:val="28"/>
+          <w:szCs w:val="28"/>
+          <w:lang w:eastAsia="es-ES" w:bidi="es-ES"/>
+        </w:rPr>
+      </w:pPr>
+      <w:r>
+        <w:rPr>
+          <w:b/>
+          <w:bCs/>
+          <w:color w:val="000000" w:themeColor="text1"/>
+          <w:sz w:val="28"/>
+          <w:szCs w:val="28"/>
+          <w:lang w:eastAsia="es-ES" w:bidi="es-ES"/>
+        </w:rPr>
+        <w:t>LAJA, PACÍFICO Y SANTA FE – ENERO A AGOSTO 2026</w:t>
       </w:r>
     </w:p>
     <w:p>
       <w:pPr>
-        <w:spacing w:after="0" w:line="240" w:lineRule="auto"/>
-        <w:jc w:val="center"/>
-      </w:pPr>
-      <w:r>
-        <w:t>Raúl Moya Arriagada</w:t>
-      </w:r>
+        <w:pStyle w:val="Textoindependiente"/>
+        <w:rPr>
+          <w:b/>
+          <w:sz w:val="20"/>
+        </w:rPr>
+      </w:pPr>
     </w:p>
     <w:p>
       <w:pPr>
-        <w:spacing w:after="0" w:line="240" w:lineRule="auto"/>
-        <w:jc w:val="center"/>
-      </w:pPr>
-      <w:r>
-        <w:t>Daniela Rojas Vilches</w:t>
-      </w:r>
+        <w:pStyle w:val="Textoindependiente"/>
+        <w:rPr>
+          <w:b/>
+          <w:sz w:val="20"/>
+        </w:rPr>
+      </w:pPr>
     </w:p>
     <w:p>
       <w:pPr>
-        <w:spacing w:after="0" w:line="240" w:lineRule="auto"/>
-        <w:jc w:val="center"/>
-      </w:pPr>
-      <w:r>
-        <w:t>Manuel Sánchez Cárcamo</w:t>
-      </w:r>
+        <w:pStyle w:val="Textoindependiente"/>
+        <w:spacing w:before="1"/>
+        <w:rPr>
+          <w:b/>
+          <w:sz w:val="27"/>
+        </w:rPr>
+      </w:pPr>
     </w:p>
     <w:p>
       <w:pPr>
-        <w:spacing w:after="0" w:line="240" w:lineRule="auto"/>
-        <w:jc w:val="center"/>
-      </w:pPr>
+        <w:spacing w:before="93"/>
+        <w:ind w:left="113"/>
+        <w:rPr>
+          <w:b/>
+          <w:bCs/>
+          <w:color w:val="231F20"/>
+          <w:spacing w:val="-2"/>
+        </w:rPr>
+      </w:pPr>
+      <w:r>
+        <w:rPr>
+          <w:b/>
+          <w:bCs/>
+          <w:color w:val="231F20"/>
+        </w:rPr>
+        <w:t>Nombre</w:t>
+      </w:r>
+      <w:r>
+        <w:rPr>
+          <w:b/>
+          <w:bCs/>
+          <w:color w:val="231F20"/>
+          <w:spacing w:val="-5"/>
+        </w:rPr>
+        <w:t xml:space="preserve"> </w:t>
+      </w:r>
+      <w:r>
+        <w:rPr>
+          <w:b/>
+          <w:bCs/>
+          <w:color w:val="231F20"/>
+          <w:spacing w:val="-2"/>
+        </w:rPr>
+        <w:t>integrante/s:</w:t>
+      </w:r>
     </w:p>
     <w:p>
       <w:pPr>
-        <w:spacing w:after="0" w:line="240" w:lineRule="auto"/>
-        <w:jc w:val="center"/>
-      </w:pPr>
-      <w:r>
-        <w:t>Repositorio GitHub:</w:t>
+        <w:pStyle w:val="Prrafodelista"/>
+        <w:numPr>
+          <w:ilvl w:val="0"/>
+          <w:numId w:val="14"/>
+        </w:numPr>
+        <w:spacing w:before="93"/>
+        <w:rPr>
+          <w:b/>
+          <w:bCs/>
+          <w:color w:val="231F20"/>
+        </w:rPr>
+      </w:pPr>
+      <w:r>
+        <w:rPr>
+          <w:b/>
+          <w:bCs/>
+          <w:color w:val="231F20"/>
+        </w:rPr>
+        <w:t>Verónica Durán Cisterna</w:t>
       </w:r>
     </w:p>
     <w:p>
       <w:pPr>
-        <w:spacing w:after="0" w:line="240" w:lineRule="auto"/>
-        <w:jc w:val="center"/>
-      </w:pPr>
-      <w:hyperlink r:id="rId8" w:history="1">
+        <w:pStyle w:val="Prrafodelista"/>
+        <w:widowControl w:val="0"/>
+        <w:numPr>
+          <w:ilvl w:val="0"/>
+          <w:numId w:val="14"/>
+        </w:numPr>
+        <w:autoSpaceDE w:val="0"/>
+        <w:autoSpaceDN w:val="0"/>
+        <w:spacing w:before="93" w:after="0" w:line="240" w:lineRule="auto"/>
+        <w:contextualSpacing w:val="0"/>
+        <w:jc w:val="both"/>
+        <w:rPr>
+          <w:b/>
+          <w:bCs/>
+          <w:color w:val="231F20"/>
+        </w:rPr>
+      </w:pPr>
+      <w:r>
+        <w:rPr>
+          <w:b/>
+          <w:bCs/>
+          <w:color w:val="231F20"/>
+        </w:rPr>
+        <w:t>Raúl Moya Arriagada</w:t>
+      </w:r>
+    </w:p>
+    <w:p>
+      <w:pPr>
+        <w:pStyle w:val="Prrafodelista"/>
+        <w:widowControl w:val="0"/>
+        <w:numPr>
+          <w:ilvl w:val="0"/>
+          <w:numId w:val="14"/>
+        </w:numPr>
+        <w:autoSpaceDE w:val="0"/>
+        <w:autoSpaceDN w:val="0"/>
+        <w:spacing w:before="93" w:after="0" w:line="240" w:lineRule="auto"/>
+        <w:contextualSpacing w:val="0"/>
+        <w:jc w:val="both"/>
+        <w:rPr>
+          <w:b/>
+          <w:bCs/>
+          <w:color w:val="231F20"/>
+        </w:rPr>
+      </w:pPr>
+      <w:r>
+        <w:rPr>
+          <w:b/>
+          <w:bCs/>
+          <w:color w:val="231F20"/>
+        </w:rPr>
+        <w:t>Daniela Rojas Vilches</w:t>
+      </w:r>
+    </w:p>
+    <w:p>
+      <w:pPr>
+        <w:pStyle w:val="Prrafodelista"/>
+        <w:widowControl w:val="0"/>
+        <w:numPr>
+          <w:ilvl w:val="0"/>
+          <w:numId w:val="14"/>
+        </w:numPr>
+        <w:autoSpaceDE w:val="0"/>
+        <w:autoSpaceDN w:val="0"/>
+        <w:spacing w:before="93" w:after="0" w:line="240" w:lineRule="auto"/>
+        <w:contextualSpacing w:val="0"/>
+        <w:jc w:val="both"/>
+        <w:rPr>
+          <w:b/>
+          <w:bCs/>
+          <w:color w:val="231F20"/>
+        </w:rPr>
+      </w:pPr>
+      <w:r>
+        <w:rPr>
+          <w:b/>
+          <w:bCs/>
+          <w:color w:val="231F20"/>
+        </w:rPr>
+        <w:t>Manuel Sánchez Cárcamo</w:t>
+      </w:r>
+    </w:p>
+    <w:p>
+      <w:pPr>
+        <w:widowControl w:val="0"/>
+        <w:autoSpaceDE w:val="0"/>
+        <w:autoSpaceDN w:val="0"/>
+        <w:spacing w:before="93" w:after="0" w:line="240" w:lineRule="auto"/>
+        <w:ind w:left="113"/>
+        <w:jc w:val="both"/>
+        <w:rPr>
+          <w:b/>
+          <w:bCs/>
+          <w:color w:val="231F20"/>
+        </w:rPr>
+      </w:pPr>
+      <w:r>
+        <w:rPr>
+          <w:b/>
+          <w:bCs/>
+          <w:color w:val="231F20"/>
+        </w:rPr>
+        <w:t xml:space="preserve">Curso: </w:t>
+      </w:r>
+    </w:p>
+    <w:p>
+      <w:pPr>
+        <w:widowControl w:val="0"/>
+        <w:autoSpaceDE w:val="0"/>
+        <w:autoSpaceDN w:val="0"/>
+        <w:spacing w:before="93" w:after="0" w:line="240" w:lineRule="auto"/>
+        <w:ind w:left="113"/>
+        <w:jc w:val="both"/>
+        <w:rPr>
+          <w:b/>
+          <w:bCs/>
+          <w:color w:val="231F20"/>
+        </w:rPr>
+      </w:pPr>
+      <w:r>
+        <w:rPr>
+          <w:b/>
+          <w:bCs/>
+          <w:color w:val="231F20"/>
+        </w:rPr>
+        <w:t>MCDI500</w:t>
+      </w:r>
+      <w:r>
+        <w:rPr>
+          <w:b/>
+          <w:bCs/>
+          <w:color w:val="231F20"/>
+        </w:rPr>
+        <w:t xml:space="preserve"> - Progr</w:t>
+      </w:r>
+      <w:r>
+        <w:rPr>
+          <w:b/>
+          <w:bCs/>
+          <w:color w:val="231F20"/>
+        </w:rPr>
+        <w:t>amación para la ciencia de datos</w:t>
+      </w:r>
+    </w:p>
+    <w:p>
+      <w:pPr>
+        <w:widowControl w:val="0"/>
+        <w:autoSpaceDE w:val="0"/>
+        <w:autoSpaceDN w:val="0"/>
+        <w:spacing w:before="93" w:after="0" w:line="240" w:lineRule="auto"/>
+        <w:ind w:left="113"/>
+        <w:jc w:val="both"/>
+        <w:rPr>
+          <w:b/>
+          <w:bCs/>
+          <w:color w:val="231F20"/>
+        </w:rPr>
+      </w:pPr>
+      <w:r>
+        <w:rPr>
+          <w:b/>
+          <w:bCs/>
+          <w:color w:val="231F20"/>
+        </w:rPr>
+        <w:t xml:space="preserve">Docente: </w:t>
+      </w:r>
+    </w:p>
+    <w:p>
+      <w:pPr>
+        <w:widowControl w:val="0"/>
+        <w:autoSpaceDE w:val="0"/>
+        <w:autoSpaceDN w:val="0"/>
+        <w:spacing w:before="93" w:after="0" w:line="240" w:lineRule="auto"/>
+        <w:ind w:left="113"/>
+        <w:jc w:val="both"/>
+        <w:rPr>
+          <w:b/>
+          <w:bCs/>
+          <w:color w:val="231F20"/>
+        </w:rPr>
+      </w:pPr>
+      <w:r>
+        <w:rPr>
+          <w:b/>
+          <w:bCs/>
+          <w:color w:val="231F20"/>
+        </w:rPr>
+        <w:t>- Dr. Omar Salinas Silva</w:t>
+      </w:r>
+    </w:p>
+    <w:p>
+      <w:pPr>
+        <w:widowControl w:val="0"/>
+        <w:autoSpaceDE w:val="0"/>
+        <w:autoSpaceDN w:val="0"/>
+        <w:spacing w:before="93" w:after="0" w:line="240" w:lineRule="auto"/>
+        <w:ind w:left="113"/>
+        <w:jc w:val="both"/>
+        <w:rPr>
+          <w:b/>
+          <w:bCs/>
+          <w:color w:val="231F20"/>
+        </w:rPr>
+      </w:pPr>
+      <w:r>
+        <w:rPr>
+          <w:b/>
+          <w:bCs/>
+          <w:color w:val="231F20"/>
+        </w:rPr>
+        <w:t xml:space="preserve">Fecha: </w:t>
+      </w:r>
+    </w:p>
+    <w:p>
+      <w:pPr>
+        <w:widowControl w:val="0"/>
+        <w:autoSpaceDE w:val="0"/>
+        <w:autoSpaceDN w:val="0"/>
+        <w:spacing w:before="93" w:after="0" w:line="240" w:lineRule="auto"/>
+        <w:ind w:left="113"/>
+        <w:jc w:val="both"/>
+        <w:rPr>
+          <w:b/>
+          <w:bCs/>
+          <w:color w:val="231F20"/>
+        </w:rPr>
+      </w:pPr>
+      <w:r>
+        <w:rPr>
+          <w:b/>
+          <w:bCs/>
+          <w:color w:val="231F20"/>
+        </w:rPr>
+        <w:t>16 de septiembre de 2026</w:t>
+      </w:r>
+    </w:p>
+    <w:p>
+      <w:pPr>
+        <w:widowControl w:val="0"/>
+        <w:autoSpaceDE w:val="0"/>
+        <w:autoSpaceDN w:val="0"/>
+        <w:spacing w:before="93" w:after="0" w:line="240" w:lineRule="auto"/>
+        <w:ind w:left="113"/>
+        <w:jc w:val="both"/>
+        <w:rPr>
+          <w:b/>
+          <w:bCs/>
+          <w:color w:val="231F20"/>
+        </w:rPr>
+      </w:pPr>
+      <w:r>
+        <w:rPr>
+          <w:b/>
+          <w:bCs/>
+          <w:color w:val="231F20"/>
+        </w:rPr>
+        <w:t xml:space="preserve">URL Proyecto: </w:t>
+      </w:r>
+      <w:hyperlink r:id="rId19" w:history="1">
         <w:r>
           <w:rPr>
             <w:rStyle w:val="Hipervnculo"/>
@@ -280,39 +1424,20 @@
     </w:p>
     <w:p>
       <w:pPr>
-        <w:spacing w:after="0" w:line="240" w:lineRule="auto"/>
-        <w:jc w:val="center"/>
+        <w:widowControl w:val="0"/>
+        <w:autoSpaceDE w:val="0"/>
+        <w:autoSpaceDN w:val="0"/>
+        <w:spacing w:before="93" w:after="0" w:line="240" w:lineRule="auto"/>
+        <w:ind w:left="113"/>
+        <w:jc w:val="both"/>
+        <w:rPr>
+          <w:b/>
+          <w:bCs/>
+          <w:color w:val="231F20"/>
+        </w:rPr>
       </w:pPr>
     </w:p>
-    <w:p>
-      <w:pPr>
-        <w:spacing w:after="0" w:line="240" w:lineRule="auto"/>
-        <w:jc w:val="center"/>
-      </w:pPr>
-      <w:r>
-        <w:t>Fecha: septiembre de 2026</w:t>
-      </w:r>
-    </w:p>
-    <w:p>
-      <w:pPr>
-        <w:spacing w:after="0" w:line="240" w:lineRule="auto"/>
-        <w:jc w:val="center"/>
-      </w:pPr>
-      <w:r>
-        <w:t>Institución: Universidad Andrés Bello (UNAB)</w:t>
-      </w:r>
-    </w:p>
-    <w:p>
-      <w:pPr>
-        <w:jc w:val="center"/>
-      </w:pPr>
-    </w:p>
-    <w:p>
-      <w:r>
-        <w:br w:type="page"/>
-      </w:r>
-    </w:p>
-    <w:bookmarkStart w:id="0" w:name="_Toc240476974" w:displacedByCustomXml="next"/>
+    <w:bookmarkStart w:id="0" w:name="_Toc240490908" w:displacedByCustomXml="next"/>
     <w:sdt>
       <w:sdtPr>
         <w:rPr>
@@ -364,7 +1489,7 @@
           <w:r>
             <w:fldChar w:fldCharType="separate"/>
           </w:r>
-          <w:hyperlink w:anchor="_Toc240476974" w:history="1">
+          <w:hyperlink w:anchor="_Toc240490908" w:history="1">
             <w:r>
               <w:rPr>
                 <w:rStyle w:val="Hipervnculo"/>
@@ -391,7 +1516,7 @@
                 <w:noProof/>
                 <w:webHidden/>
               </w:rPr>
-              <w:instrText xml:space="preserve"> PAGEREF _Toc240476974 \h </w:instrText>
+              <w:instrText xml:space="preserve"> PAGEREF _Toc240490908 \h </w:instrText>
             </w:r>
             <w:r>
               <w:rPr>
@@ -438,7 +1563,7 @@
               <w14:ligatures w14:val="standardContextual"/>
             </w:rPr>
           </w:pPr>
-          <w:hyperlink w:anchor="_Toc240476975" w:history="1">
+          <w:hyperlink w:anchor="_Toc240490909" w:history="1">
             <w:r>
               <w:rPr>
                 <w:rStyle w:val="Hipervnculo"/>
@@ -465,7 +1590,7 @@
                 <w:noProof/>
                 <w:webHidden/>
               </w:rPr>
-              <w:instrText xml:space="preserve"> PAGEREF _Toc240476975 \h </w:instrText>
+              <w:instrText xml:space="preserve"> PAGEREF _Toc240490909 \h </w:instrText>
             </w:r>
             <w:r>
               <w:rPr>
@@ -512,7 +1637,7 @@
               <w14:ligatures w14:val="standardContextual"/>
             </w:rPr>
           </w:pPr>
-          <w:hyperlink w:anchor="_Toc240476976" w:history="1">
+          <w:hyperlink w:anchor="_Toc240490910" w:history="1">
             <w:r>
               <w:rPr>
                 <w:rStyle w:val="Hipervnculo"/>
@@ -539,7 +1664,7 @@
                 <w:noProof/>
                 <w:webHidden/>
               </w:rPr>
-              <w:instrText xml:space="preserve"> PAGEREF _Toc240476976 \h </w:instrText>
+              <w:instrText xml:space="preserve"> PAGEREF _Toc240490910 \h </w:instrText>
             </w:r>
             <w:r>
               <w:rPr>
@@ -586,7 +1711,7 @@
               <w14:ligatures w14:val="standardContextual"/>
             </w:rPr>
           </w:pPr>
-          <w:hyperlink w:anchor="_Toc240476977" w:history="1">
+          <w:hyperlink w:anchor="_Toc240490911" w:history="1">
             <w:r>
               <w:rPr>
                 <w:rStyle w:val="Hipervnculo"/>
@@ -613,7 +1738,7 @@
                 <w:noProof/>
                 <w:webHidden/>
               </w:rPr>
-              <w:instrText xml:space="preserve"> PAGEREF _Toc240476977 \h </w:instrText>
+              <w:instrText xml:space="preserve"> PAGEREF _Toc240490911 \h </w:instrText>
             </w:r>
             <w:r>
               <w:rPr>
@@ -660,7 +1785,7 @@
               <w14:ligatures w14:val="standardContextual"/>
             </w:rPr>
           </w:pPr>
-          <w:hyperlink w:anchor="_Toc240476978" w:history="1">
+          <w:hyperlink w:anchor="_Toc240490912" w:history="1">
             <w:r>
               <w:rPr>
                 <w:rStyle w:val="Hipervnculo"/>
@@ -687,7 +1812,7 @@
                 <w:noProof/>
                 <w:webHidden/>
               </w:rPr>
-              <w:instrText xml:space="preserve"> PAGEREF _Toc240476978 \h </w:instrText>
+              <w:instrText xml:space="preserve"> PAGEREF _Toc240490912 \h </w:instrText>
             </w:r>
             <w:r>
               <w:rPr>
@@ -734,7 +1859,7 @@
               <w14:ligatures w14:val="standardContextual"/>
             </w:rPr>
           </w:pPr>
-          <w:hyperlink w:anchor="_Toc240476979" w:history="1">
+          <w:hyperlink w:anchor="_Toc240490913" w:history="1">
             <w:r>
               <w:rPr>
                 <w:rStyle w:val="Hipervnculo"/>
@@ -761,7 +1886,7 @@
                 <w:noProof/>
                 <w:webHidden/>
               </w:rPr>
-              <w:instrText xml:space="preserve"> PAGEREF _Toc240476979 \h </w:instrText>
+              <w:instrText xml:space="preserve"> PAGEREF _Toc240490913 \h </w:instrText>
             </w:r>
             <w:r>
               <w:rPr>
@@ -808,7 +1933,7 @@
               <w14:ligatures w14:val="standardContextual"/>
             </w:rPr>
           </w:pPr>
-          <w:hyperlink w:anchor="_Toc240476980" w:history="1">
+          <w:hyperlink w:anchor="_Toc240490914" w:history="1">
             <w:r>
               <w:rPr>
                 <w:rStyle w:val="Hipervnculo"/>
@@ -835,7 +1960,7 @@
                 <w:noProof/>
                 <w:webHidden/>
               </w:rPr>
-              <w:instrText xml:space="preserve"> PAGEREF _Toc240476980 \h </w:instrText>
+              <w:instrText xml:space="preserve"> PAGEREF _Toc240490914 \h </w:instrText>
             </w:r>
             <w:r>
               <w:rPr>
@@ -882,7 +2007,7 @@
               <w14:ligatures w14:val="standardContextual"/>
             </w:rPr>
           </w:pPr>
-          <w:hyperlink w:anchor="_Toc240476981" w:history="1">
+          <w:hyperlink w:anchor="_Toc240490915" w:history="1">
             <w:r>
               <w:rPr>
                 <w:rStyle w:val="Hipervnculo"/>
@@ -909,7 +2034,7 @@
                 <w:noProof/>
                 <w:webHidden/>
               </w:rPr>
-              <w:instrText xml:space="preserve"> PAGEREF _Toc240476981 \h </w:instrText>
+              <w:instrText xml:space="preserve"> PAGEREF _Toc240490915 \h </w:instrText>
             </w:r>
             <w:r>
               <w:rPr>
@@ -956,7 +2081,7 @@
               <w14:ligatures w14:val="standardContextual"/>
             </w:rPr>
           </w:pPr>
-          <w:hyperlink w:anchor="_Toc240476982" w:history="1">
+          <w:hyperlink w:anchor="_Toc240490916" w:history="1">
             <w:r>
               <w:rPr>
                 <w:rStyle w:val="Hipervnculo"/>
@@ -983,7 +2108,7 @@
                 <w:noProof/>
                 <w:webHidden/>
               </w:rPr>
-              <w:instrText xml:space="preserve"> PAGEREF _Toc240476982 \h </w:instrText>
+              <w:instrText xml:space="preserve"> PAGEREF _Toc240490916 \h </w:instrText>
             </w:r>
             <w:r>
               <w:rPr>
@@ -1030,7 +2155,7 @@
               <w14:ligatures w14:val="standardContextual"/>
             </w:rPr>
           </w:pPr>
-          <w:hyperlink w:anchor="_Toc240476983" w:history="1">
+          <w:hyperlink w:anchor="_Toc240490917" w:history="1">
             <w:r>
               <w:rPr>
                 <w:rStyle w:val="Hipervnculo"/>
@@ -1057,7 +2182,7 @@
                 <w:noProof/>
                 <w:webHidden/>
               </w:rPr>
-              <w:instrText xml:space="preserve"> PAGEREF _Toc240476983 \h </w:instrText>
+              <w:instrText xml:space="preserve"> PAGEREF _Toc240490917 \h </w:instrText>
             </w:r>
             <w:r>
               <w:rPr>
@@ -1104,7 +2229,7 @@
               <w14:ligatures w14:val="standardContextual"/>
             </w:rPr>
           </w:pPr>
-          <w:hyperlink w:anchor="_Toc240476984" w:history="1">
+          <w:hyperlink w:anchor="_Toc240490918" w:history="1">
             <w:r>
               <w:rPr>
                 <w:rStyle w:val="Hipervnculo"/>
@@ -1131,7 +2256,7 @@
                 <w:noProof/>
                 <w:webHidden/>
               </w:rPr>
-              <w:instrText xml:space="preserve"> PAGEREF _Toc240476984 \h </w:instrText>
+              <w:instrText xml:space="preserve"> PAGEREF _Toc240490918 \h </w:instrText>
             </w:r>
             <w:r>
               <w:rPr>
@@ -1178,7 +2303,7 @@
               <w14:ligatures w14:val="standardContextual"/>
             </w:rPr>
           </w:pPr>
-          <w:hyperlink w:anchor="_Toc240476985" w:history="1">
+          <w:hyperlink w:anchor="_Toc240490919" w:history="1">
             <w:r>
               <w:rPr>
                 <w:rStyle w:val="Hipervnculo"/>
@@ -1205,7 +2330,7 @@
                 <w:noProof/>
                 <w:webHidden/>
               </w:rPr>
-              <w:instrText xml:space="preserve"> PAGEREF _Toc240476985 \h </w:instrText>
+              <w:instrText xml:space="preserve"> PAGEREF _Toc240490919 \h </w:instrText>
             </w:r>
             <w:r>
               <w:rPr>
@@ -1252,7 +2377,7 @@
               <w14:ligatures w14:val="standardContextual"/>
             </w:rPr>
           </w:pPr>
-          <w:hyperlink w:anchor="_Toc240476986" w:history="1">
+          <w:hyperlink w:anchor="_Toc240490920" w:history="1">
             <w:r>
               <w:rPr>
                 <w:rStyle w:val="Hipervnculo"/>
@@ -1279,7 +2404,7 @@
                 <w:noProof/>
                 <w:webHidden/>
               </w:rPr>
-              <w:instrText xml:space="preserve"> PAGEREF _Toc240476986 \h </w:instrText>
+              <w:instrText xml:space="preserve"> PAGEREF _Toc240490920 \h </w:instrText>
             </w:r>
             <w:r>
               <w:rPr>
@@ -1326,7 +2451,7 @@
               <w14:ligatures w14:val="standardContextual"/>
             </w:rPr>
           </w:pPr>
-          <w:hyperlink w:anchor="_Toc240476987" w:history="1">
+          <w:hyperlink w:anchor="_Toc240490921" w:history="1">
             <w:r>
               <w:rPr>
                 <w:rStyle w:val="Hipervnculo"/>
@@ -1353,7 +2478,7 @@
                 <w:noProof/>
                 <w:webHidden/>
               </w:rPr>
-              <w:instrText xml:space="preserve"> PAGEREF _Toc240476987 \h </w:instrText>
+              <w:instrText xml:space="preserve"> PAGEREF _Toc240490921 \h </w:instrText>
             </w:r>
             <w:r>
               <w:rPr>
@@ -1400,7 +2525,7 @@
               <w14:ligatures w14:val="standardContextual"/>
             </w:rPr>
           </w:pPr>
-          <w:hyperlink w:anchor="_Toc240476988" w:history="1">
+          <w:hyperlink w:anchor="_Toc240490922" w:history="1">
             <w:r>
               <w:rPr>
                 <w:rStyle w:val="Hipervnculo"/>
@@ -1427,7 +2552,7 @@
                 <w:noProof/>
                 <w:webHidden/>
               </w:rPr>
-              <w:instrText xml:space="preserve"> PAGEREF _Toc240476988 \h </w:instrText>
+              <w:instrText xml:space="preserve"> PAGEREF _Toc240490922 \h </w:instrText>
             </w:r>
             <w:r>
               <w:rPr>
@@ -1474,7 +2599,7 @@
               <w14:ligatures w14:val="standardContextual"/>
             </w:rPr>
           </w:pPr>
-          <w:hyperlink w:anchor="_Toc240476989" w:history="1">
+          <w:hyperlink w:anchor="_Toc240490923" w:history="1">
             <w:r>
               <w:rPr>
                 <w:rStyle w:val="Hipervnculo"/>
@@ -1501,7 +2626,7 @@
                 <w:noProof/>
                 <w:webHidden/>
               </w:rPr>
-              <w:instrText xml:space="preserve"> PAGEREF _Toc240476989 \h </w:instrText>
+              <w:instrText xml:space="preserve"> PAGEREF _Toc240490923 \h </w:instrText>
             </w:r>
             <w:r>
               <w:rPr>
@@ -1548,7 +2673,7 @@
               <w14:ligatures w14:val="standardContextual"/>
             </w:rPr>
           </w:pPr>
-          <w:hyperlink w:anchor="_Toc240476990" w:history="1">
+          <w:hyperlink w:anchor="_Toc240490924" w:history="1">
             <w:r>
               <w:rPr>
                 <w:rStyle w:val="Hipervnculo"/>
@@ -1575,7 +2700,7 @@
                 <w:noProof/>
                 <w:webHidden/>
               </w:rPr>
-              <w:instrText xml:space="preserve"> PAGEREF _Toc240476990 \h </w:instrText>
+              <w:instrText xml:space="preserve"> PAGEREF _Toc240490924 \h </w:instrText>
             </w:r>
             <w:r>
               <w:rPr>
@@ -1622,7 +2747,7 @@
               <w14:ligatures w14:val="standardContextual"/>
             </w:rPr>
           </w:pPr>
-          <w:hyperlink w:anchor="_Toc240476991" w:history="1">
+          <w:hyperlink w:anchor="_Toc240490925" w:history="1">
             <w:r>
               <w:rPr>
                 <w:rStyle w:val="Hipervnculo"/>
@@ -1649,7 +2774,7 @@
                 <w:noProof/>
                 <w:webHidden/>
               </w:rPr>
-              <w:instrText xml:space="preserve"> PAGEREF _Toc240476991 \h </w:instrText>
+              <w:instrText xml:space="preserve"> PAGEREF _Toc240490925 \h </w:instrText>
             </w:r>
             <w:r>
               <w:rPr>
@@ -1696,7 +2821,7 @@
               <w14:ligatures w14:val="standardContextual"/>
             </w:rPr>
           </w:pPr>
-          <w:hyperlink w:anchor="_Toc240476992" w:history="1">
+          <w:hyperlink w:anchor="_Toc240490926" w:history="1">
             <w:r>
               <w:rPr>
                 <w:rStyle w:val="Hipervnculo"/>
@@ -1723,7 +2848,7 @@
                 <w:noProof/>
                 <w:webHidden/>
               </w:rPr>
-              <w:instrText xml:space="preserve"> PAGEREF _Toc240476992 \h </w:instrText>
+              <w:instrText xml:space="preserve"> PAGEREF _Toc240490926 \h </w:instrText>
             </w:r>
             <w:r>
               <w:rPr>
@@ -1774,7 +2899,7 @@
       <w:pPr>
         <w:pStyle w:val="Ttulo1"/>
       </w:pPr>
-      <w:bookmarkStart w:id="1" w:name="_Toc240476975"/>
+      <w:bookmarkStart w:id="1" w:name="_Toc240490909"/>
       <w:r>
         <w:lastRenderedPageBreak/>
         <w:t>1. Introducción y contextualización</w:t>
@@ -1836,7 +2961,7 @@
       <w:pPr>
         <w:pStyle w:val="Ttulo1"/>
       </w:pPr>
-      <w:bookmarkStart w:id="2" w:name="_Toc240476976"/>
+      <w:bookmarkStart w:id="2" w:name="_Toc240490910"/>
       <w:r>
         <w:t>2. Definición de la problemática y objetivos</w:t>
       </w:r>
@@ -1846,7 +2971,7 @@
       <w:pPr>
         <w:pStyle w:val="Ttulo2"/>
       </w:pPr>
-      <w:bookmarkStart w:id="3" w:name="_Toc240476977"/>
+      <w:bookmarkStart w:id="3" w:name="_Toc240490911"/>
       <w:r>
         <w:t>2.1 Pregunta de investigación</w:t>
       </w:r>
@@ -1874,7 +2999,7 @@
       <w:pPr>
         <w:pStyle w:val="Ttulo2"/>
       </w:pPr>
-      <w:bookmarkStart w:id="4" w:name="_Toc240476978"/>
+      <w:bookmarkStart w:id="4" w:name="_Toc240490912"/>
       <w:r>
         <w:t>2.2 Objetivo general</w:t>
       </w:r>
@@ -1893,7 +3018,7 @@
       <w:pPr>
         <w:pStyle w:val="Ttulo2"/>
       </w:pPr>
-      <w:bookmarkStart w:id="5" w:name="_Toc240476979"/>
+      <w:bookmarkStart w:id="5" w:name="_Toc240490913"/>
       <w:r>
         <w:t>2.3 Objetivos específicos</w:t>
       </w:r>
@@ -1968,7 +3093,7 @@
       <w:pPr>
         <w:pStyle w:val="Ttulo2"/>
       </w:pPr>
-      <w:bookmarkStart w:id="6" w:name="_Toc240476980"/>
+      <w:bookmarkStart w:id="6" w:name="_Toc240490914"/>
       <w:r>
         <w:t>2.4 Alcance, restricciones y supuestos</w:t>
       </w:r>
@@ -2013,7 +3138,7 @@
       <w:pPr>
         <w:pStyle w:val="Ttulo1"/>
       </w:pPr>
-      <w:bookmarkStart w:id="7" w:name="_Toc240476981"/>
+      <w:bookmarkStart w:id="7" w:name="_Toc240490915"/>
       <w:r>
         <w:t>3. Datos, alcance y variables</w:t>
       </w:r>
@@ -2358,7 +3483,7 @@
       <w:pPr>
         <w:pStyle w:val="Ttulo2"/>
       </w:pPr>
-      <w:bookmarkStart w:id="8" w:name="_Toc240476982"/>
+      <w:bookmarkStart w:id="8" w:name="_Toc240490916"/>
       <w:r>
         <w:lastRenderedPageBreak/>
         <w:t>3.1 Condiciones de uso de los datos</w:t>
@@ -2378,7 +3503,7 @@
       <w:pPr>
         <w:pStyle w:val="Ttulo1"/>
       </w:pPr>
-      <w:bookmarkStart w:id="9" w:name="_Toc240476983"/>
+      <w:bookmarkStart w:id="9" w:name="_Toc240490917"/>
       <w:r>
         <w:t>4. Aplicación de herramientas científicas</w:t>
       </w:r>
@@ -2470,7 +3595,7 @@
       <w:pPr>
         <w:pStyle w:val="Ttulo1"/>
       </w:pPr>
-      <w:bookmarkStart w:id="10" w:name="_Toc240476984"/>
+      <w:bookmarkStart w:id="10" w:name="_Toc240490918"/>
       <w:r>
         <w:t>5. Reproducibilidad técnica</w:t>
       </w:r>
@@ -2482,13 +3607,18 @@
         <w:jc w:val="both"/>
       </w:pPr>
       <w:r>
-        <w:t>El proyecto utiliza un entorno virtual .</w:t>
+        <w:t xml:space="preserve">El proyecto utiliza un entorno </w:t>
+      </w:r>
+      <w:proofErr w:type="gramStart"/>
+      <w:r>
+        <w:t>virtual .</w:t>
       </w:r>
       <w:proofErr w:type="spellStart"/>
       <w:r>
         <w:t>venv</w:t>
       </w:r>
       <w:proofErr w:type="spellEnd"/>
+      <w:proofErr w:type="gramEnd"/>
       <w:r>
         <w:t xml:space="preserve"> con Python 3.14.</w:t>
       </w:r>
@@ -2577,13 +3707,18 @@
       </w:r>
       <w:proofErr w:type="spellEnd"/>
       <w:r>
-        <w:t>/evidencias/ y src/. A esta estructura se suman archivos de apoyo técnico como README.md, requirements.txt y .</w:t>
+        <w:t xml:space="preserve">/evidencias/ y src/. A esta estructura se suman archivos de apoyo técnico como README.md, requirements.txt </w:t>
+      </w:r>
+      <w:proofErr w:type="gramStart"/>
+      <w:r>
+        <w:t>y .</w:t>
       </w:r>
       <w:proofErr w:type="spellStart"/>
       <w:r>
         <w:t>gitignore</w:t>
       </w:r>
       <w:proofErr w:type="spellEnd"/>
+      <w:proofErr w:type="gramEnd"/>
       <w:r>
         <w:t>.</w:t>
       </w:r>
@@ -2592,7 +3727,7 @@
       <w:pPr>
         <w:pStyle w:val="Ttulo1"/>
       </w:pPr>
-      <w:bookmarkStart w:id="11" w:name="_Toc240476985"/>
+      <w:bookmarkStart w:id="11" w:name="_Toc240490919"/>
       <w:r>
         <w:t>6. Control de versiones y trazabilidad</w:t>
       </w:r>
@@ -2687,7 +3822,7 @@
       <w:pPr>
         <w:pStyle w:val="Ttulo1"/>
       </w:pPr>
-      <w:bookmarkStart w:id="12" w:name="_Toc240476986"/>
+      <w:bookmarkStart w:id="12" w:name="_Toc240490920"/>
       <w:r>
         <w:t>7. Fase 1 - Definición del proyecto</w:t>
       </w:r>
@@ -2699,7 +3834,15 @@
         <w:jc w:val="both"/>
       </w:pPr>
       <w:r>
-        <w:t>F1_definicion.ipynb reúne la definición inicial del proyecto. Allí se establece la pregunta de investigación, los objetivos, el alcance, la fuente de datos, la unidad de observación, los roles de las variables, los supuestos y las principales decisiones metodológicas.</w:t>
+        <w:t>F1_</w:t>
+      </w:r>
+      <w:proofErr w:type="gramStart"/>
+      <w:r>
+        <w:t>definicion.ipynb</w:t>
+      </w:r>
+      <w:proofErr w:type="gramEnd"/>
+      <w:r>
+        <w:t xml:space="preserve"> reúne la definición inicial del proyecto. Allí se establece la pregunta de investigación, los objetivos, el alcance, la fuente de datos, la unidad de observación, los roles de las variables, los supuestos y las principales decisiones metodológicas.</w:t>
       </w:r>
     </w:p>
     <w:p>
@@ -2715,7 +3858,7 @@
       <w:pPr>
         <w:pStyle w:val="Ttulo1"/>
       </w:pPr>
-      <w:bookmarkStart w:id="13" w:name="_Toc240476987"/>
+      <w:bookmarkStart w:id="13" w:name="_Toc240490921"/>
       <w:r>
         <w:t>8. Fase 2 - Preparación, transformación y validación</w:t>
       </w:r>
@@ -2727,7 +3870,15 @@
         <w:jc w:val="both"/>
       </w:pPr>
       <w:r>
-        <w:t xml:space="preserve">F2_preparacion_datos.ipynb desarrolla el flujo de preparación de los datos. Incluye la carga y exploración inicial, el filtrado de las centrales y fechas seleccionadas, la transformación desde formato ancho a largo, la creación de variables derivadas, las validaciones y la exportación del </w:t>
+        <w:t>F2_preparacion_</w:t>
+      </w:r>
+      <w:proofErr w:type="gramStart"/>
+      <w:r>
+        <w:t>datos.ipynb</w:t>
+      </w:r>
+      <w:proofErr w:type="gramEnd"/>
+      <w:r>
+        <w:t xml:space="preserve"> desarrolla el flujo de preparación de los datos. Incluye la carga y exploración inicial, el filtrado de las centrales y fechas seleccionadas, la transformación desde formato ancho a largo, la creación de variables derivadas, las validaciones y la exportación del </w:t>
       </w:r>
       <w:proofErr w:type="spellStart"/>
       <w:r>
@@ -2792,7 +3943,7 @@
       <w:pPr>
         <w:pStyle w:val="Ttulo1"/>
       </w:pPr>
-      <w:bookmarkStart w:id="14" w:name="_Toc240476988"/>
+      <w:bookmarkStart w:id="14" w:name="_Toc240490922"/>
       <w:r>
         <w:t>9. Validación técnica y evidencias</w:t>
       </w:r>
@@ -2982,8 +4133,13 @@
             <w:tcW w:w="3652" w:type="dxa"/>
           </w:tcPr>
           <w:p>
-            <w:r>
-              <w:t>Casos normal, límite y excepción</w:t>
+            <w:proofErr w:type="gramStart"/>
+            <w:r>
+              <w:t>Casos normal</w:t>
+            </w:r>
+            <w:proofErr w:type="gramEnd"/>
+            <w:r>
+              <w:t>, límite y excepción</w:t>
             </w:r>
           </w:p>
         </w:tc>
@@ -3090,7 +4246,7 @@
         </w:rPr>
         <w:t xml:space="preserve">Evidencias disponibles en el repositorio </w:t>
       </w:r>
-      <w:hyperlink r:id="rId9" w:history="1">
+      <w:hyperlink r:id="rId20" w:history="1">
         <w:r>
           <w:rPr>
             <w:rStyle w:val="Hipervnculo"/>
@@ -3120,7 +4276,7 @@
       <w:pPr>
         <w:pStyle w:val="Ttulo1"/>
       </w:pPr>
-      <w:bookmarkStart w:id="15" w:name="_Toc240476989"/>
+      <w:bookmarkStart w:id="15" w:name="_Toc240490923"/>
       <w:r>
         <w:t>10. Vinculación con el mapa conceptual</w:t>
       </w:r>
@@ -3158,39 +4314,25 @@
           <w:i/>
         </w:rPr>
       </w:pPr>
-    </w:p>
-    <w:p>
-      <w:pPr>
-        <w:spacing w:after="0" w:line="240" w:lineRule="auto"/>
+      <w:r>
         <w:rPr>
           <w:i/>
-        </w:rPr>
-      </w:pPr>
-      <w:r>
-        <w:rPr>
           <w:noProof/>
         </w:rPr>
+        <w:lastRenderedPageBreak/>
         <w:drawing>
-          <wp:anchor distT="0" distB="0" distL="114300" distR="114300" simplePos="0" relativeHeight="251658240" behindDoc="1" locked="0" layoutInCell="1" allowOverlap="1" wp14:anchorId="3E152C95" wp14:editId="17011BFA">
+          <wp:anchor distT="0" distB="0" distL="114300" distR="114300" simplePos="0" relativeHeight="251658240" behindDoc="1" locked="0" layoutInCell="1" allowOverlap="1" wp14:anchorId="769DC81D" wp14:editId="5B975851">
             <wp:simplePos x="0" y="0"/>
             <wp:positionH relativeFrom="column">
-              <wp:posOffset>109855</wp:posOffset>
+              <wp:posOffset>-892167</wp:posOffset>
             </wp:positionH>
             <wp:positionV relativeFrom="paragraph">
-              <wp:posOffset>167640</wp:posOffset>
+              <wp:posOffset>178435</wp:posOffset>
             </wp:positionV>
-            <wp:extent cx="5759450" cy="6237605"/>
-            <wp:effectExtent l="0" t="0" r="0" b="0"/>
-            <wp:wrapTight wrapText="bothSides">
-              <wp:wrapPolygon edited="0">
-                <wp:start x="0" y="0"/>
-                <wp:lineTo x="0" y="21505"/>
-                <wp:lineTo x="21505" y="21505"/>
-                <wp:lineTo x="21505" y="0"/>
-                <wp:lineTo x="0" y="0"/>
-              </wp:wrapPolygon>
-            </wp:wrapTight>
-            <wp:docPr id="1" name="Picture 1"/>
+            <wp:extent cx="7749212" cy="8166100"/>
+            <wp:effectExtent l="0" t="0" r="4445" b="6350"/>
+            <wp:wrapNone/>
+            <wp:docPr id="1513594226" name="Imagen 3"/>
             <wp:cNvGraphicFramePr>
               <a:graphicFrameLocks xmlns:a="http://schemas.openxmlformats.org/drawingml/2006/main" noChangeAspect="1"/>
             </wp:cNvGraphicFramePr>
@@ -3198,30 +4340,53 @@
               <a:graphicData uri="http://schemas.openxmlformats.org/drawingml/2006/picture">
                 <pic:pic xmlns:pic="http://schemas.openxmlformats.org/drawingml/2006/picture">
                   <pic:nvPicPr>
-                    <pic:cNvPr id="0" name="a_clean_infographic_concept_map_diagram_on_a_whi.png"/>
+                    <pic:cNvPr id="1513594226" name="Imagen 1513594226"/>
                     <pic:cNvPicPr/>
                   </pic:nvPicPr>
-                  <pic:blipFill>
-                    <a:blip r:embed="rId10"/>
+                  <pic:blipFill rotWithShape="1">
+                    <a:blip r:embed="rId21"/>
+                    <a:srcRect l="8982" t="38543" r="8349" b="1573"/>
                     <a:stretch>
                       <a:fillRect/>
                     </a:stretch>
                   </pic:blipFill>
-                  <pic:spPr>
+                  <pic:spPr bwMode="auto">
                     <a:xfrm>
                       <a:off x="0" y="0"/>
-                      <a:ext cx="5759450" cy="6237605"/>
+                      <a:ext cx="7751578" cy="8168593"/>
                     </a:xfrm>
                     <a:prstGeom prst="rect">
                       <a:avLst/>
                     </a:prstGeom>
+                    <a:ln>
+                      <a:noFill/>
+                    </a:ln>
+                    <a:extLst>
+                      <a:ext uri="{53640926-AAD7-44D8-BBD7-CCE9431645EC}">
+                        <a14:shadowObscured xmlns:a14="http://schemas.microsoft.com/office/drawing/2010/main"/>
+                      </a:ext>
+                    </a:extLst>
                   </pic:spPr>
                 </pic:pic>
               </a:graphicData>
             </a:graphic>
+            <wp14:sizeRelH relativeFrom="page">
+              <wp14:pctWidth>0</wp14:pctWidth>
+            </wp14:sizeRelH>
+            <wp14:sizeRelV relativeFrom="page">
+              <wp14:pctHeight>0</wp14:pctHeight>
+            </wp14:sizeRelV>
           </wp:anchor>
         </w:drawing>
       </w:r>
+    </w:p>
+    <w:p>
+      <w:pPr>
+        <w:spacing w:after="0" w:line="240" w:lineRule="auto"/>
+        <w:rPr>
+          <w:i/>
+        </w:rPr>
+      </w:pPr>
     </w:p>
     <w:p>
       <w:pPr>
@@ -3230,31 +4395,203 @@
           <w:i/>
         </w:rPr>
       </w:pPr>
+    </w:p>
+    <w:p>
+      <w:pPr>
+        <w:jc w:val="center"/>
+        <w:rPr>
+          <w:i/>
+        </w:rPr>
+      </w:pPr>
+    </w:p>
+    <w:p>
+      <w:pPr>
+        <w:jc w:val="center"/>
+        <w:rPr>
+          <w:i/>
+        </w:rPr>
+      </w:pPr>
+    </w:p>
+    <w:p>
+      <w:pPr>
+        <w:jc w:val="center"/>
+        <w:rPr>
+          <w:i/>
+        </w:rPr>
+      </w:pPr>
+    </w:p>
+    <w:p>
+      <w:pPr>
+        <w:jc w:val="center"/>
+        <w:rPr>
+          <w:i/>
+        </w:rPr>
+      </w:pPr>
+    </w:p>
+    <w:p>
+      <w:pPr>
+        <w:jc w:val="center"/>
+        <w:rPr>
+          <w:i/>
+        </w:rPr>
+      </w:pPr>
+    </w:p>
+    <w:p>
+      <w:pPr>
+        <w:jc w:val="center"/>
+        <w:rPr>
+          <w:i/>
+        </w:rPr>
+      </w:pPr>
+    </w:p>
+    <w:p>
+      <w:pPr>
+        <w:jc w:val="center"/>
+        <w:rPr>
+          <w:i/>
+        </w:rPr>
+      </w:pPr>
+    </w:p>
+    <w:p>
+      <w:pPr>
+        <w:jc w:val="center"/>
+        <w:rPr>
+          <w:i/>
+        </w:rPr>
+      </w:pPr>
+    </w:p>
+    <w:p>
+      <w:pPr>
+        <w:jc w:val="center"/>
+        <w:rPr>
+          <w:i/>
+        </w:rPr>
+      </w:pPr>
+    </w:p>
+    <w:p>
+      <w:pPr>
+        <w:jc w:val="center"/>
+        <w:rPr>
+          <w:i/>
+        </w:rPr>
+      </w:pPr>
+    </w:p>
+    <w:p>
+      <w:pPr>
+        <w:jc w:val="center"/>
+        <w:rPr>
+          <w:i/>
+        </w:rPr>
+      </w:pPr>
+    </w:p>
+    <w:p>
+      <w:pPr>
+        <w:jc w:val="center"/>
+        <w:rPr>
+          <w:i/>
+        </w:rPr>
+      </w:pPr>
+    </w:p>
+    <w:p>
+      <w:pPr>
+        <w:jc w:val="center"/>
+        <w:rPr>
+          <w:i/>
+        </w:rPr>
+      </w:pPr>
+    </w:p>
+    <w:p>
+      <w:pPr>
+        <w:jc w:val="center"/>
+        <w:rPr>
+          <w:i/>
+        </w:rPr>
+      </w:pPr>
+    </w:p>
+    <w:p>
+      <w:pPr>
+        <w:jc w:val="center"/>
+        <w:rPr>
+          <w:i/>
+        </w:rPr>
+      </w:pPr>
+    </w:p>
+    <w:p>
+      <w:pPr>
+        <w:jc w:val="center"/>
+        <w:rPr>
+          <w:i/>
+        </w:rPr>
+      </w:pPr>
+    </w:p>
+    <w:p>
+      <w:pPr>
+        <w:jc w:val="center"/>
+        <w:rPr>
+          <w:i/>
+        </w:rPr>
+      </w:pPr>
+    </w:p>
+    <w:p>
+      <w:pPr>
+        <w:jc w:val="center"/>
+        <w:rPr>
+          <w:i/>
+        </w:rPr>
+      </w:pPr>
+    </w:p>
+    <w:p>
+      <w:pPr>
+        <w:jc w:val="center"/>
+        <w:rPr>
+          <w:i/>
+        </w:rPr>
+      </w:pPr>
+    </w:p>
+    <w:p>
+      <w:pPr>
+        <w:jc w:val="center"/>
+        <w:rPr>
+          <w:i/>
+        </w:rPr>
+      </w:pPr>
+    </w:p>
+    <w:p>
+      <w:pPr>
+        <w:jc w:val="center"/>
+        <w:rPr>
+          <w:i/>
+        </w:rPr>
+      </w:pPr>
+    </w:p>
+    <w:p>
+      <w:pPr>
+        <w:jc w:val="center"/>
+        <w:rPr>
+          <w:i/>
+        </w:rPr>
+      </w:pPr>
+    </w:p>
+    <w:p>
+      <w:pPr>
+        <w:jc w:val="center"/>
+        <w:rPr>
+          <w:i/>
+        </w:rPr>
+      </w:pPr>
+    </w:p>
+    <w:p>
+      <w:pPr>
+        <w:jc w:val="center"/>
+        <w:rPr>
+          <w:iCs/>
+        </w:rPr>
+      </w:pPr>
       <w:r>
         <w:rPr>
           <w:i/>
         </w:rPr>
         <w:t>Figura 1. Mapa conceptual actualizado del proyecto.</w:t>
-      </w:r>
-    </w:p>
-    <w:p>
-      <w:pPr>
-        <w:rPr>
-          <w:iCs/>
-        </w:rPr>
-      </w:pPr>
-    </w:p>
-    <w:p>
-      <w:pPr>
-        <w:rPr>
-          <w:iCs/>
-        </w:rPr>
-      </w:pPr>
-      <w:r>
-        <w:rPr>
-          <w:iCs/>
-        </w:rPr>
-        <w:br w:type="page"/>
       </w:r>
     </w:p>
     <w:p>
@@ -3553,8 +4890,13 @@
             <w:tcW w:w="2435" w:type="dxa"/>
           </w:tcPr>
           <w:p>
-            <w:r>
-              <w:t>Pruebas normal/límite/excepción</w:t>
+            <w:proofErr w:type="gramStart"/>
+            <w:r>
+              <w:t>Pruebas normal</w:t>
+            </w:r>
+            <w:proofErr w:type="gramEnd"/>
+            <w:r>
+              <w:t>/límite/excepción</w:t>
             </w:r>
           </w:p>
         </w:tc>
@@ -3783,7 +5125,7 @@
       <w:pPr>
         <w:pStyle w:val="Ttulo1"/>
       </w:pPr>
-      <w:bookmarkStart w:id="16" w:name="_Toc240476990"/>
+      <w:bookmarkStart w:id="16" w:name="_Toc240490924"/>
       <w:r>
         <w:t>11. Estado de avance F1-F4</w:t>
       </w:r>
@@ -4012,7 +5354,7 @@
       <w:pPr>
         <w:pStyle w:val="Ttulo1"/>
       </w:pPr>
-      <w:bookmarkStart w:id="17" w:name="_Toc240476991"/>
+      <w:bookmarkStart w:id="17" w:name="_Toc240490925"/>
       <w:r>
         <w:lastRenderedPageBreak/>
         <w:t>12. Conclusiones</w:t>
@@ -4055,11 +5397,16 @@
         <w:t xml:space="preserve">También quedó delimitado con claridad qué parte del proyecto corresponde al trabajo ya realizado y qué nos queda pendiente. </w:t>
       </w:r>
       <w:r>
-        <w:t>Las fases F1 y F2 se encuentran implementadas, mientras que F3 y F4 se proyectan para el desarrollo algorítmico, análisis de eficiencia, implementación orientada a objetos y posterior integración y comunicación de resultados.</w:t>
+        <w:t xml:space="preserve">Las fases F1 y F2 se encuentran implementadas, mientras que F3 y F4 se proyectan para el desarrollo algorítmico, análisis de eficiencia, implementación orientada a objetos y posterior integración y comunicación de </w:t>
+      </w:r>
+      <w:proofErr w:type="gramStart"/>
+      <w:r>
+        <w:t>resultados.</w:t>
       </w:r>
       <w:r>
         <w:t>.</w:t>
       </w:r>
+      <w:proofErr w:type="gramEnd"/>
     </w:p>
     <w:p>
       <w:pPr>
@@ -4115,7 +5462,7 @@
         <w:pStyle w:val="Ttulo1"/>
         <w:spacing w:before="0" w:line="240" w:lineRule="auto"/>
       </w:pPr>
-      <w:bookmarkStart w:id="18" w:name="_Toc240476992"/>
+      <w:bookmarkStart w:id="18" w:name="_Toc240490926"/>
       <w:r>
         <w:lastRenderedPageBreak/>
         <w:t>13. Bibliografía</w:t>
@@ -4142,7 +5489,7 @@
       <w:r>
         <w:t xml:space="preserve"> </w:t>
       </w:r>
-      <w:hyperlink r:id="rId11" w:history="1">
+      <w:hyperlink r:id="rId22" w:history="1">
         <w:r>
           <w:rPr>
             <w:rStyle w:val="Hipervnculo"/>
@@ -4174,7 +5521,7 @@
       <w:r>
         <w:t xml:space="preserve"> </w:t>
       </w:r>
-      <w:hyperlink r:id="rId12" w:history="1">
+      <w:hyperlink r:id="rId23" w:history="1">
         <w:r>
           <w:rPr>
             <w:rStyle w:val="Hipervnculo"/>
@@ -4203,7 +5550,7 @@
       <w:r>
         <w:t xml:space="preserve"> </w:t>
       </w:r>
-      <w:hyperlink r:id="rId13" w:history="1">
+      <w:hyperlink r:id="rId24" w:history="1">
         <w:r>
           <w:rPr>
             <w:rStyle w:val="Hipervnculo"/>
@@ -4235,7 +5582,7 @@
       <w:r>
         <w:t xml:space="preserve"> </w:t>
       </w:r>
-      <w:hyperlink r:id="rId14" w:history="1">
+      <w:hyperlink r:id="rId25" w:history="1">
         <w:r>
           <w:rPr>
             <w:rStyle w:val="Hipervnculo"/>
@@ -4280,7 +5627,7 @@
         </w:rPr>
         <w:t xml:space="preserve">. </w:t>
       </w:r>
-      <w:hyperlink r:id="rId15" w:history="1">
+      <w:hyperlink r:id="rId26" w:history="1">
         <w:r>
           <w:rPr>
             <w:rStyle w:val="Hipervnculo"/>
@@ -4329,7 +5676,7 @@
         </w:rPr>
         <w:t xml:space="preserve"> </w:t>
       </w:r>
-      <w:hyperlink r:id="rId16" w:tgtFrame="_new" w:history="1">
+      <w:hyperlink r:id="rId27" w:tgtFrame="_new" w:history="1">
         <w:r>
           <w:rPr>
             <w:rStyle w:val="Hipervnculo"/>
@@ -4343,11 +5690,19 @@
       <w:pPr>
         <w:ind w:left="720" w:hanging="720"/>
       </w:pPr>
+      <w:proofErr w:type="gramStart"/>
       <w:r>
         <w:rPr>
           <w:lang w:val="en-US"/>
         </w:rPr>
-        <w:t xml:space="preserve">pandas development team. </w:t>
+        <w:t>pandas</w:t>
+      </w:r>
+      <w:proofErr w:type="gramEnd"/>
+      <w:r>
+        <w:rPr>
+          <w:lang w:val="en-US"/>
+        </w:rPr>
+        <w:t xml:space="preserve"> development team. </w:t>
       </w:r>
       <w:r>
         <w:t xml:space="preserve">(2026). </w:t>
@@ -4374,7 +5729,7 @@
       <w:r>
         <w:t xml:space="preserve"> </w:t>
       </w:r>
-      <w:hyperlink r:id="rId17" w:tgtFrame="_new" w:history="1">
+      <w:hyperlink r:id="rId28" w:tgtFrame="_new" w:history="1">
         <w:r>
           <w:rPr>
             <w:rStyle w:val="Hipervnculo"/>
@@ -4413,7 +5768,7 @@
         </w:rPr>
         <w:t xml:space="preserve"> </w:t>
       </w:r>
-      <w:hyperlink r:id="rId18" w:tgtFrame="_new" w:history="1">
+      <w:hyperlink r:id="rId29" w:tgtFrame="_new" w:history="1">
         <w:r>
           <w:rPr>
             <w:rStyle w:val="Hipervnculo"/>
@@ -4439,7 +5794,7 @@
       <w:r>
         <w:t xml:space="preserve"> [Presentación de clase, Semana 1]. Magíster en Ciencia de Datos e Inteligencia Artificial, Universidad Andrés Bello. </w:t>
       </w:r>
-      <w:hyperlink r:id="rId19" w:tgtFrame="_new" w:history="1">
+      <w:hyperlink r:id="rId30" w:tgtFrame="_new" w:history="1">
         <w:r>
           <w:rPr>
             <w:rStyle w:val="Hipervnculo"/>
@@ -4452,10 +5807,11 @@
       </w:r>
     </w:p>
     <w:sectPr>
-      <w:footerReference w:type="default" r:id="rId20"/>
+      <w:footerReference w:type="default" r:id="rId31"/>
       <w:pgSz w:w="12240" w:h="15840"/>
       <w:pgMar w:top="1247" w:right="1417" w:bottom="1247" w:left="1417" w:header="720" w:footer="720" w:gutter="0"/>
       <w:cols w:space="720"/>
+      <w:titlePg/>
       <w:docGrid w:linePitch="360"/>
     </w:sectPr>
   </w:body>
@@ -4489,14 +5845,46 @@
 
 <file path=word/footer1.xml><?xml version="1.0" encoding="utf-8"?>
 <w:ftr xmlns:wpc="http://schemas.microsoft.com/office/word/2010/wordprocessingCanvas" xmlns:cx="http://schemas.microsoft.com/office/drawing/2014/chartex" xmlns:cx1="http://schemas.microsoft.com/office/drawing/2015/9/8/chartex" xmlns:cx2="http://schemas.microsoft.com/office/drawing/2015/10/21/chartex" xmlns:cx3="http://schemas.microsoft.com/office/drawing/2016/5/9/chartex" xmlns:cx4="http://schemas.microsoft.com/office/drawing/2016/5/10/chartex" xmlns:cx5="http://schemas.microsoft.com/office/drawing/2016/5/11/chartex" xmlns:cx6="http://schemas.microsoft.com/office/drawing/2016/5/12/chartex" xmlns:cx7="http://schemas.microsoft.com/office/drawing/2016/5/13/chartex" xmlns:cx8="http://schemas.microsoft.com/office/drawing/2016/5/14/chartex" xmlns:mc="http://schemas.openxmlformats.org/markup-compatibility/2006" xmlns:aink="http://schemas.microsoft.com/office/drawing/2016/ink" xmlns:am3d="http://schemas.microsoft.com/office/drawing/2017/model3d" xmlns:o="urn:schemas-microsoft-com:office:office" xmlns:oel="http://schemas.microsoft.com/office/2019/extlst" xmlns:r="http://schemas.openxmlformats.org/officeDocument/2006/relationships" xmlns:m="http://schemas.openxmlformats.org/officeDocument/2006/math" xmlns:v="urn:schemas-microsoft-com:vml" xmlns:wp14="http://schemas.microsoft.com/office/word/2010/wordprocessingDrawing" xmlns:wp="http://schemas.openxmlformats.org/drawingml/2006/wordprocessingDrawing" xmlns:w10="urn:schemas-microsoft-com:office:word" xmlns:w="http://schemas.openxmlformats.org/wordprocessingml/2006/main" xmlns:w14="http://schemas.microsoft.com/office/word/2010/wordml" xmlns:w15="http://schemas.microsoft.com/office/word/2012/wordml" xmlns:w16cex="http://schemas.microsoft.com/office/word/2018/wordml/cex" xmlns:w16cid="http://schemas.microsoft.com/office/word/2016/wordml/cid" xmlns:w16="http://schemas.microsoft.com/office/word/2018/wordml" xmlns:w16du="http://schemas.microsoft.com/office/word/2023/wordml/word16du" xmlns:w16sdtdh="http://schemas.microsoft.com/office/word/2020/wordml/sdtdatahash" xmlns:w16sdtfl="http://schemas.microsoft.com/office/word/2024/wordml/sdtformatlock" xmlns:w16se="http://schemas.microsoft.com/office/word/2015/wordml/symex" xmlns:wpg="http://schemas.microsoft.com/office/word/2010/wordprocessingGroup" xmlns:wpi="http://schemas.microsoft.com/office/word/2010/wordprocessingInk" xmlns:wne="http://schemas.microsoft.com/office/word/2006/wordml" xmlns:wps="http://schemas.microsoft.com/office/word/2010/wordprocessingShape" mc:Ignorable="w14 w15 w16se w16cid w16 w16cex w16sdtdh w16sdtfl w16du wp14">
+  <w:sdt>
+    <w:sdtPr>
+      <w:id w:val="556588257"/>
+      <w:docPartObj>
+        <w:docPartGallery w:val="Page Numbers (Bottom of Page)"/>
+        <w:docPartUnique/>
+      </w:docPartObj>
+    </w:sdtPr>
+    <w:sdtContent>
+      <w:p>
+        <w:pPr>
+          <w:pStyle w:val="Piedepgina"/>
+          <w:jc w:val="right"/>
+        </w:pPr>
+        <w:r>
+          <w:fldChar w:fldCharType="begin"/>
+        </w:r>
+        <w:r>
+          <w:instrText>PAGE   \* MERGEFORMAT</w:instrText>
+        </w:r>
+        <w:r>
+          <w:fldChar w:fldCharType="separate"/>
+        </w:r>
+        <w:r>
+          <w:rPr>
+            <w:lang w:val="es-ES"/>
+          </w:rPr>
+          <w:t>2</w:t>
+        </w:r>
+        <w:r>
+          <w:fldChar w:fldCharType="end"/>
+        </w:r>
+      </w:p>
+    </w:sdtContent>
+  </w:sdt>
   <w:p>
     <w:pPr>
       <w:pStyle w:val="Piedepgina"/>
       <w:jc w:val="center"/>
     </w:pPr>
-    <w:r>
-      <w:t>Sumativa 1 - Grupo 2</w:t>
-    </w:r>
   </w:p>
 </w:ftr>
 </file>
@@ -4700,6 +6088,119 @@
     </w:lvl>
   </w:abstractNum>
   <w:abstractNum w:abstractNumId="9" w15:restartNumberingAfterBreak="0">
+    <w:nsid w:val="07FE5DBC"/>
+    <w:multiLevelType w:val="hybridMultilevel"/>
+    <w:tmpl w:val="59129614"/>
+    <w:lvl w:ilvl="0" w:tplc="9C469CC4">
+      <w:start w:val="1"/>
+      <w:numFmt w:val="bullet"/>
+      <w:lvlText w:val="-"/>
+      <w:lvlJc w:val="left"/>
+      <w:pPr>
+        <w:ind w:left="473" w:hanging="360"/>
+      </w:pPr>
+      <w:rPr>
+        <w:rFonts w:ascii="Aptos" w:hAnsi="Aptos" w:hint="default"/>
+      </w:rPr>
+    </w:lvl>
+    <w:lvl w:ilvl="1" w:tplc="340A0003" w:tentative="1">
+      <w:start w:val="1"/>
+      <w:numFmt w:val="bullet"/>
+      <w:lvlText w:val="o"/>
+      <w:lvlJc w:val="left"/>
+      <w:pPr>
+        <w:ind w:left="1193" w:hanging="360"/>
+      </w:pPr>
+      <w:rPr>
+        <w:rFonts w:ascii="Courier New" w:hAnsi="Courier New" w:cs="Courier New" w:hint="default"/>
+      </w:rPr>
+    </w:lvl>
+    <w:lvl w:ilvl="2" w:tplc="340A0005" w:tentative="1">
+      <w:start w:val="1"/>
+      <w:numFmt w:val="bullet"/>
+      <w:lvlText w:val=""/>
+      <w:lvlJc w:val="left"/>
+      <w:pPr>
+        <w:ind w:left="1913" w:hanging="360"/>
+      </w:pPr>
+      <w:rPr>
+        <w:rFonts w:ascii="Wingdings" w:hAnsi="Wingdings" w:hint="default"/>
+      </w:rPr>
+    </w:lvl>
+    <w:lvl w:ilvl="3" w:tplc="340A0001" w:tentative="1">
+      <w:start w:val="1"/>
+      <w:numFmt w:val="bullet"/>
+      <w:lvlText w:val=""/>
+      <w:lvlJc w:val="left"/>
+      <w:pPr>
+        <w:ind w:left="2633" w:hanging="360"/>
+      </w:pPr>
+      <w:rPr>
+        <w:rFonts w:ascii="Symbol" w:hAnsi="Symbol" w:hint="default"/>
+      </w:rPr>
+    </w:lvl>
+    <w:lvl w:ilvl="4" w:tplc="340A0003" w:tentative="1">
+      <w:start w:val="1"/>
+      <w:numFmt w:val="bullet"/>
+      <w:lvlText w:val="o"/>
+      <w:lvlJc w:val="left"/>
+      <w:pPr>
+        <w:ind w:left="3353" w:hanging="360"/>
+      </w:pPr>
+      <w:rPr>
+        <w:rFonts w:ascii="Courier New" w:hAnsi="Courier New" w:cs="Courier New" w:hint="default"/>
+      </w:rPr>
+    </w:lvl>
+    <w:lvl w:ilvl="5" w:tplc="340A0005" w:tentative="1">
+      <w:start w:val="1"/>
+      <w:numFmt w:val="bullet"/>
+      <w:lvlText w:val=""/>
+      <w:lvlJc w:val="left"/>
+      <w:pPr>
+        <w:ind w:left="4073" w:hanging="360"/>
+      </w:pPr>
+      <w:rPr>
+        <w:rFonts w:ascii="Wingdings" w:hAnsi="Wingdings" w:hint="default"/>
+      </w:rPr>
+    </w:lvl>
+    <w:lvl w:ilvl="6" w:tplc="340A0001" w:tentative="1">
+      <w:start w:val="1"/>
+      <w:numFmt w:val="bullet"/>
+      <w:lvlText w:val=""/>
+      <w:lvlJc w:val="left"/>
+      <w:pPr>
+        <w:ind w:left="4793" w:hanging="360"/>
+      </w:pPr>
+      <w:rPr>
+        <w:rFonts w:ascii="Symbol" w:hAnsi="Symbol" w:hint="default"/>
+      </w:rPr>
+    </w:lvl>
+    <w:lvl w:ilvl="7" w:tplc="340A0003" w:tentative="1">
+      <w:start w:val="1"/>
+      <w:numFmt w:val="bullet"/>
+      <w:lvlText w:val="o"/>
+      <w:lvlJc w:val="left"/>
+      <w:pPr>
+        <w:ind w:left="5513" w:hanging="360"/>
+      </w:pPr>
+      <w:rPr>
+        <w:rFonts w:ascii="Courier New" w:hAnsi="Courier New" w:cs="Courier New" w:hint="default"/>
+      </w:rPr>
+    </w:lvl>
+    <w:lvl w:ilvl="8" w:tplc="340A0005" w:tentative="1">
+      <w:start w:val="1"/>
+      <w:numFmt w:val="bullet"/>
+      <w:lvlText w:val=""/>
+      <w:lvlJc w:val="left"/>
+      <w:pPr>
+        <w:ind w:left="6233" w:hanging="360"/>
+      </w:pPr>
+      <w:rPr>
+        <w:rFonts w:ascii="Wingdings" w:hAnsi="Wingdings" w:hint="default"/>
+      </w:rPr>
+    </w:lvl>
+  </w:abstractNum>
+  <w:abstractNum w:abstractNumId="10" w15:restartNumberingAfterBreak="0">
     <w:nsid w:val="1D3A5E0B"/>
     <w:multiLevelType w:val="hybridMultilevel"/>
     <w:tmpl w:val="517ED054"/>
@@ -4812,7 +6313,7 @@
       </w:rPr>
     </w:lvl>
   </w:abstractNum>
-  <w:abstractNum w:abstractNumId="10" w15:restartNumberingAfterBreak="0">
+  <w:abstractNum w:abstractNumId="11" w15:restartNumberingAfterBreak="0">
     <w:nsid w:val="3C7D3AD3"/>
     <w:multiLevelType w:val="hybridMultilevel"/>
     <w:tmpl w:val="DA64D386"/>
@@ -4924,7 +6425,120 @@
       </w:rPr>
     </w:lvl>
   </w:abstractNum>
-  <w:abstractNum w:abstractNumId="11" w15:restartNumberingAfterBreak="0">
+  <w:abstractNum w:abstractNumId="12" w15:restartNumberingAfterBreak="0">
+    <w:nsid w:val="443CF1DF"/>
+    <w:multiLevelType w:val="hybridMultilevel"/>
+    <w:tmpl w:val="6710296C"/>
+    <w:lvl w:ilvl="0" w:tplc="9C469CC4">
+      <w:start w:val="1"/>
+      <w:numFmt w:val="bullet"/>
+      <w:lvlText w:val="-"/>
+      <w:lvlJc w:val="left"/>
+      <w:pPr>
+        <w:ind w:left="473" w:hanging="360"/>
+      </w:pPr>
+      <w:rPr>
+        <w:rFonts w:ascii="Aptos" w:hAnsi="Aptos" w:hint="default"/>
+      </w:rPr>
+    </w:lvl>
+    <w:lvl w:ilvl="1" w:tplc="AA82DE56">
+      <w:start w:val="1"/>
+      <w:numFmt w:val="bullet"/>
+      <w:lvlText w:val="o"/>
+      <w:lvlJc w:val="left"/>
+      <w:pPr>
+        <w:ind w:left="1193" w:hanging="360"/>
+      </w:pPr>
+      <w:rPr>
+        <w:rFonts w:ascii="Courier New" w:hAnsi="Courier New" w:hint="default"/>
+      </w:rPr>
+    </w:lvl>
+    <w:lvl w:ilvl="2" w:tplc="1204A9BC">
+      <w:start w:val="1"/>
+      <w:numFmt w:val="bullet"/>
+      <w:lvlText w:val=""/>
+      <w:lvlJc w:val="left"/>
+      <w:pPr>
+        <w:ind w:left="1913" w:hanging="360"/>
+      </w:pPr>
+      <w:rPr>
+        <w:rFonts w:ascii="Wingdings" w:hAnsi="Wingdings" w:hint="default"/>
+      </w:rPr>
+    </w:lvl>
+    <w:lvl w:ilvl="3" w:tplc="23969962">
+      <w:start w:val="1"/>
+      <w:numFmt w:val="bullet"/>
+      <w:lvlText w:val=""/>
+      <w:lvlJc w:val="left"/>
+      <w:pPr>
+        <w:ind w:left="2633" w:hanging="360"/>
+      </w:pPr>
+      <w:rPr>
+        <w:rFonts w:ascii="Symbol" w:hAnsi="Symbol" w:hint="default"/>
+      </w:rPr>
+    </w:lvl>
+    <w:lvl w:ilvl="4" w:tplc="E4089B00">
+      <w:start w:val="1"/>
+      <w:numFmt w:val="bullet"/>
+      <w:lvlText w:val="o"/>
+      <w:lvlJc w:val="left"/>
+      <w:pPr>
+        <w:ind w:left="3353" w:hanging="360"/>
+      </w:pPr>
+      <w:rPr>
+        <w:rFonts w:ascii="Courier New" w:hAnsi="Courier New" w:hint="default"/>
+      </w:rPr>
+    </w:lvl>
+    <w:lvl w:ilvl="5" w:tplc="D22A12B2">
+      <w:start w:val="1"/>
+      <w:numFmt w:val="bullet"/>
+      <w:lvlText w:val=""/>
+      <w:lvlJc w:val="left"/>
+      <w:pPr>
+        <w:ind w:left="4073" w:hanging="360"/>
+      </w:pPr>
+      <w:rPr>
+        <w:rFonts w:ascii="Wingdings" w:hAnsi="Wingdings" w:hint="default"/>
+      </w:rPr>
+    </w:lvl>
+    <w:lvl w:ilvl="6" w:tplc="A964D5A0">
+      <w:start w:val="1"/>
+      <w:numFmt w:val="bullet"/>
+      <w:lvlText w:val=""/>
+      <w:lvlJc w:val="left"/>
+      <w:pPr>
+        <w:ind w:left="4793" w:hanging="360"/>
+      </w:pPr>
+      <w:rPr>
+        <w:rFonts w:ascii="Symbol" w:hAnsi="Symbol" w:hint="default"/>
+      </w:rPr>
+    </w:lvl>
+    <w:lvl w:ilvl="7" w:tplc="F05A3ECC">
+      <w:start w:val="1"/>
+      <w:numFmt w:val="bullet"/>
+      <w:lvlText w:val="o"/>
+      <w:lvlJc w:val="left"/>
+      <w:pPr>
+        <w:ind w:left="5513" w:hanging="360"/>
+      </w:pPr>
+      <w:rPr>
+        <w:rFonts w:ascii="Courier New" w:hAnsi="Courier New" w:hint="default"/>
+      </w:rPr>
+    </w:lvl>
+    <w:lvl w:ilvl="8" w:tplc="671C0B72">
+      <w:start w:val="1"/>
+      <w:numFmt w:val="bullet"/>
+      <w:lvlText w:val=""/>
+      <w:lvlJc w:val="left"/>
+      <w:pPr>
+        <w:ind w:left="6233" w:hanging="360"/>
+      </w:pPr>
+      <w:rPr>
+        <w:rFonts w:ascii="Wingdings" w:hAnsi="Wingdings" w:hint="default"/>
+      </w:rPr>
+    </w:lvl>
+  </w:abstractNum>
+  <w:abstractNum w:abstractNumId="13" w15:restartNumberingAfterBreak="0">
     <w:nsid w:val="47E67D63"/>
     <w:multiLevelType w:val="hybridMultilevel"/>
     <w:tmpl w:val="2D2A0F4A"/>
@@ -5037,7 +6651,7 @@
       </w:rPr>
     </w:lvl>
   </w:abstractNum>
-  <w:abstractNum w:abstractNumId="12" w15:restartNumberingAfterBreak="0">
+  <w:abstractNum w:abstractNumId="14" w15:restartNumberingAfterBreak="0">
     <w:nsid w:val="719A5EE8"/>
     <w:multiLevelType w:val="hybridMultilevel"/>
     <w:tmpl w:val="28606B58"/>
@@ -5177,15 +6791,21 @@
     <w:abstractNumId w:val="0"/>
   </w:num>
   <w:num w:numId="10" w16cid:durableId="1172336342">
+    <w:abstractNumId w:val="13"/>
+  </w:num>
+  <w:num w:numId="11" w16cid:durableId="404762316">
+    <w:abstractNumId w:val="14"/>
+  </w:num>
+  <w:num w:numId="12" w16cid:durableId="677580398">
     <w:abstractNumId w:val="11"/>
   </w:num>
-  <w:num w:numId="11" w16cid:durableId="404762316">
+  <w:num w:numId="13" w16cid:durableId="368996700">
+    <w:abstractNumId w:val="10"/>
+  </w:num>
+  <w:num w:numId="14" w16cid:durableId="807474437">
     <w:abstractNumId w:val="12"/>
   </w:num>
-  <w:num w:numId="12" w16cid:durableId="677580398">
-    <w:abstractNumId w:val="10"/>
-  </w:num>
-  <w:num w:numId="13" w16cid:durableId="368996700">
+  <w:num w:numId="15" w16cid:durableId="499540247">
     <w:abstractNumId w:val="9"/>
   </w:num>
 </w:numbering>
@@ -6000,6 +7620,7 @@
   <w:style w:type="paragraph" w:styleId="Prrafodelista">
     <w:name w:val="List Paragraph"/>
     <w:basedOn w:val="Normal"/>
+    <w:link w:val="PrrafodelistaCar"/>
     <w:uiPriority w:val="34"/>
     <w:qFormat/>
     <w:rsid w:val="00FC693F"/>
@@ -16635,6 +18256,17 @@
       <w:shd w:val="clear" w:color="auto" w:fill="E1DFDD"/>
     </w:rPr>
   </w:style>
+  <w:style w:type="character" w:customStyle="1" w:styleId="PrrafodelistaCar">
+    <w:name w:val="Párrafo de lista Car"/>
+    <w:link w:val="Prrafodelista"/>
+    <w:uiPriority w:val="34"/>
+    <w:qFormat/>
+    <w:rsid w:val="004731AB"/>
+    <w:rPr>
+      <w:rFonts w:ascii="Calibri" w:hAnsi="Calibri"/>
+      <w:lang w:val="es-CL"/>
+    </w:rPr>
+  </w:style>
 </w:styles>
 </file>
 

</xml_diff>

<commit_message>
docs: Agrega índice de tablas e ilustraciones automáticos a Informe_Técnico_Sumativa1_Grupo2.docx
</commit_message>
<xml_diff>
--- a/docs/Informe_Tecnico_Sumativa1_Grupo2.docx
+++ b/docs/Informe_Tecnico_Sumativa1_Grupo2.docx
@@ -1437,7 +1437,7 @@
         </w:rPr>
       </w:pPr>
     </w:p>
-    <w:bookmarkStart w:id="0" w:name="_Toc240490908" w:displacedByCustomXml="next"/>
+    <w:bookmarkStart w:id="0" w:name="_Toc240494032" w:displacedByCustomXml="next"/>
     <w:sdt>
       <w:sdtPr>
         <w:rPr>
@@ -1461,6 +1461,9 @@
           </w:pPr>
           <w:r>
             <w:t>Índice</w:t>
+          </w:r>
+          <w:r>
+            <w:t xml:space="preserve"> General</w:t>
           </w:r>
           <w:bookmarkEnd w:id="0"/>
         </w:p>
@@ -1489,13 +1492,13 @@
           <w:r>
             <w:fldChar w:fldCharType="separate"/>
           </w:r>
-          <w:hyperlink w:anchor="_Toc240490908" w:history="1">
+          <w:hyperlink w:anchor="_Toc240494032" w:history="1">
             <w:r>
               <w:rPr>
                 <w:rStyle w:val="Hipervnculo"/>
                 <w:noProof/>
               </w:rPr>
-              <w:t>Índice</w:t>
+              <w:t>Índice General</w:t>
             </w:r>
             <w:r>
               <w:rPr>
@@ -1516,7 +1519,7 @@
                 <w:noProof/>
                 <w:webHidden/>
               </w:rPr>
-              <w:instrText xml:space="preserve"> PAGEREF _Toc240490908 \h </w:instrText>
+              <w:instrText xml:space="preserve"> PAGEREF _Toc240494032 \h </w:instrText>
             </w:r>
             <w:r>
               <w:rPr>
@@ -1563,13 +1566,13 @@
               <w14:ligatures w14:val="standardContextual"/>
             </w:rPr>
           </w:pPr>
-          <w:hyperlink w:anchor="_Toc240490909" w:history="1">
+          <w:hyperlink w:anchor="_Toc240494033" w:history="1">
             <w:r>
               <w:rPr>
                 <w:rStyle w:val="Hipervnculo"/>
                 <w:noProof/>
               </w:rPr>
-              <w:t>1. Introducción y contextualización</w:t>
+              <w:t>Índice de Tablas</w:t>
             </w:r>
             <w:r>
               <w:rPr>
@@ -1590,7 +1593,7 @@
                 <w:noProof/>
                 <w:webHidden/>
               </w:rPr>
-              <w:instrText xml:space="preserve"> PAGEREF _Toc240490909 \h </w:instrText>
+              <w:instrText xml:space="preserve"> PAGEREF _Toc240494033 \h </w:instrText>
             </w:r>
             <w:r>
               <w:rPr>
@@ -1637,7 +1640,155 @@
               <w14:ligatures w14:val="standardContextual"/>
             </w:rPr>
           </w:pPr>
-          <w:hyperlink w:anchor="_Toc240490910" w:history="1">
+          <w:hyperlink w:anchor="_Toc240494034" w:history="1">
+            <w:r>
+              <w:rPr>
+                <w:rStyle w:val="Hipervnculo"/>
+                <w:noProof/>
+              </w:rPr>
+              <w:t>Indice de Figuras</w:t>
+            </w:r>
+            <w:r>
+              <w:rPr>
+                <w:noProof/>
+                <w:webHidden/>
+              </w:rPr>
+              <w:tab/>
+            </w:r>
+            <w:r>
+              <w:rPr>
+                <w:noProof/>
+                <w:webHidden/>
+              </w:rPr>
+              <w:fldChar w:fldCharType="begin"/>
+            </w:r>
+            <w:r>
+              <w:rPr>
+                <w:noProof/>
+                <w:webHidden/>
+              </w:rPr>
+              <w:instrText xml:space="preserve"> PAGEREF _Toc240494034 \h </w:instrText>
+            </w:r>
+            <w:r>
+              <w:rPr>
+                <w:noProof/>
+                <w:webHidden/>
+              </w:rPr>
+            </w:r>
+            <w:r>
+              <w:rPr>
+                <w:noProof/>
+                <w:webHidden/>
+              </w:rPr>
+              <w:fldChar w:fldCharType="separate"/>
+            </w:r>
+            <w:r>
+              <w:rPr>
+                <w:noProof/>
+                <w:webHidden/>
+              </w:rPr>
+              <w:t>3</w:t>
+            </w:r>
+            <w:r>
+              <w:rPr>
+                <w:noProof/>
+                <w:webHidden/>
+              </w:rPr>
+              <w:fldChar w:fldCharType="end"/>
+            </w:r>
+          </w:hyperlink>
+        </w:p>
+        <w:p>
+          <w:pPr>
+            <w:pStyle w:val="TDC1"/>
+            <w:tabs>
+              <w:tab w:val="right" w:leader="dot" w:pos="9396"/>
+            </w:tabs>
+            <w:rPr>
+              <w:rFonts w:asciiTheme="minorHAnsi" w:hAnsiTheme="minorHAnsi"/>
+              <w:noProof/>
+              <w:kern w:val="2"/>
+              <w:sz w:val="24"/>
+              <w:szCs w:val="24"/>
+              <w:lang w:eastAsia="es-CL"/>
+              <w14:ligatures w14:val="standardContextual"/>
+            </w:rPr>
+          </w:pPr>
+          <w:hyperlink w:anchor="_Toc240494035" w:history="1">
+            <w:r>
+              <w:rPr>
+                <w:rStyle w:val="Hipervnculo"/>
+                <w:noProof/>
+              </w:rPr>
+              <w:t>1. Introducción y contextualización</w:t>
+            </w:r>
+            <w:r>
+              <w:rPr>
+                <w:noProof/>
+                <w:webHidden/>
+              </w:rPr>
+              <w:tab/>
+            </w:r>
+            <w:r>
+              <w:rPr>
+                <w:noProof/>
+                <w:webHidden/>
+              </w:rPr>
+              <w:fldChar w:fldCharType="begin"/>
+            </w:r>
+            <w:r>
+              <w:rPr>
+                <w:noProof/>
+                <w:webHidden/>
+              </w:rPr>
+              <w:instrText xml:space="preserve"> PAGEREF _Toc240494035 \h </w:instrText>
+            </w:r>
+            <w:r>
+              <w:rPr>
+                <w:noProof/>
+                <w:webHidden/>
+              </w:rPr>
+            </w:r>
+            <w:r>
+              <w:rPr>
+                <w:noProof/>
+                <w:webHidden/>
+              </w:rPr>
+              <w:fldChar w:fldCharType="separate"/>
+            </w:r>
+            <w:r>
+              <w:rPr>
+                <w:noProof/>
+                <w:webHidden/>
+              </w:rPr>
+              <w:t>4</w:t>
+            </w:r>
+            <w:r>
+              <w:rPr>
+                <w:noProof/>
+                <w:webHidden/>
+              </w:rPr>
+              <w:fldChar w:fldCharType="end"/>
+            </w:r>
+          </w:hyperlink>
+        </w:p>
+        <w:p>
+          <w:pPr>
+            <w:pStyle w:val="TDC1"/>
+            <w:tabs>
+              <w:tab w:val="right" w:leader="dot" w:pos="9396"/>
+            </w:tabs>
+            <w:rPr>
+              <w:rFonts w:asciiTheme="minorHAnsi" w:hAnsiTheme="minorHAnsi"/>
+              <w:noProof/>
+              <w:kern w:val="2"/>
+              <w:sz w:val="24"/>
+              <w:szCs w:val="24"/>
+              <w:lang w:eastAsia="es-CL"/>
+              <w14:ligatures w14:val="standardContextual"/>
+            </w:rPr>
+          </w:pPr>
+          <w:hyperlink w:anchor="_Toc240494036" w:history="1">
             <w:r>
               <w:rPr>
                 <w:rStyle w:val="Hipervnculo"/>
@@ -1664,7 +1815,7 @@
                 <w:noProof/>
                 <w:webHidden/>
               </w:rPr>
-              <w:instrText xml:space="preserve"> PAGEREF _Toc240490910 \h </w:instrText>
+              <w:instrText xml:space="preserve"> PAGEREF _Toc240494036 \h </w:instrText>
             </w:r>
             <w:r>
               <w:rPr>
@@ -1684,7 +1835,7 @@
                 <w:noProof/>
                 <w:webHidden/>
               </w:rPr>
-              <w:t>3</w:t>
+              <w:t>4</w:t>
             </w:r>
             <w:r>
               <w:rPr>
@@ -1711,7 +1862,7 @@
               <w14:ligatures w14:val="standardContextual"/>
             </w:rPr>
           </w:pPr>
-          <w:hyperlink w:anchor="_Toc240490911" w:history="1">
+          <w:hyperlink w:anchor="_Toc240494037" w:history="1">
             <w:r>
               <w:rPr>
                 <w:rStyle w:val="Hipervnculo"/>
@@ -1738,7 +1889,7 @@
                 <w:noProof/>
                 <w:webHidden/>
               </w:rPr>
-              <w:instrText xml:space="preserve"> PAGEREF _Toc240490911 \h </w:instrText>
+              <w:instrText xml:space="preserve"> PAGEREF _Toc240494037 \h </w:instrText>
             </w:r>
             <w:r>
               <w:rPr>
@@ -1758,7 +1909,7 @@
                 <w:noProof/>
                 <w:webHidden/>
               </w:rPr>
-              <w:t>3</w:t>
+              <w:t>4</w:t>
             </w:r>
             <w:r>
               <w:rPr>
@@ -1785,7 +1936,7 @@
               <w14:ligatures w14:val="standardContextual"/>
             </w:rPr>
           </w:pPr>
-          <w:hyperlink w:anchor="_Toc240490912" w:history="1">
+          <w:hyperlink w:anchor="_Toc240494038" w:history="1">
             <w:r>
               <w:rPr>
                 <w:rStyle w:val="Hipervnculo"/>
@@ -1812,7 +1963,7 @@
                 <w:noProof/>
                 <w:webHidden/>
               </w:rPr>
-              <w:instrText xml:space="preserve"> PAGEREF _Toc240490912 \h </w:instrText>
+              <w:instrText xml:space="preserve"> PAGEREF _Toc240494038 \h </w:instrText>
             </w:r>
             <w:r>
               <w:rPr>
@@ -1832,7 +1983,7 @@
                 <w:noProof/>
                 <w:webHidden/>
               </w:rPr>
-              <w:t>3</w:t>
+              <w:t>4</w:t>
             </w:r>
             <w:r>
               <w:rPr>
@@ -1859,7 +2010,7 @@
               <w14:ligatures w14:val="standardContextual"/>
             </w:rPr>
           </w:pPr>
-          <w:hyperlink w:anchor="_Toc240490913" w:history="1">
+          <w:hyperlink w:anchor="_Toc240494039" w:history="1">
             <w:r>
               <w:rPr>
                 <w:rStyle w:val="Hipervnculo"/>
@@ -1886,7 +2037,7 @@
                 <w:noProof/>
                 <w:webHidden/>
               </w:rPr>
-              <w:instrText xml:space="preserve"> PAGEREF _Toc240490913 \h </w:instrText>
+              <w:instrText xml:space="preserve"> PAGEREF _Toc240494039 \h </w:instrText>
             </w:r>
             <w:r>
               <w:rPr>
@@ -1906,7 +2057,7 @@
                 <w:noProof/>
                 <w:webHidden/>
               </w:rPr>
-              <w:t>3</w:t>
+              <w:t>4</w:t>
             </w:r>
             <w:r>
               <w:rPr>
@@ -1933,7 +2084,7 @@
               <w14:ligatures w14:val="standardContextual"/>
             </w:rPr>
           </w:pPr>
-          <w:hyperlink w:anchor="_Toc240490914" w:history="1">
+          <w:hyperlink w:anchor="_Toc240494040" w:history="1">
             <w:r>
               <w:rPr>
                 <w:rStyle w:val="Hipervnculo"/>
@@ -1960,7 +2111,7 @@
                 <w:noProof/>
                 <w:webHidden/>
               </w:rPr>
-              <w:instrText xml:space="preserve"> PAGEREF _Toc240490914 \h </w:instrText>
+              <w:instrText xml:space="preserve"> PAGEREF _Toc240494040 \h </w:instrText>
             </w:r>
             <w:r>
               <w:rPr>
@@ -1980,7 +2131,7 @@
                 <w:noProof/>
                 <w:webHidden/>
               </w:rPr>
-              <w:t>4</w:t>
+              <w:t>5</w:t>
             </w:r>
             <w:r>
               <w:rPr>
@@ -2007,7 +2158,7 @@
               <w14:ligatures w14:val="standardContextual"/>
             </w:rPr>
           </w:pPr>
-          <w:hyperlink w:anchor="_Toc240490915" w:history="1">
+          <w:hyperlink w:anchor="_Toc240494041" w:history="1">
             <w:r>
               <w:rPr>
                 <w:rStyle w:val="Hipervnculo"/>
@@ -2034,7 +2185,7 @@
                 <w:noProof/>
                 <w:webHidden/>
               </w:rPr>
-              <w:instrText xml:space="preserve"> PAGEREF _Toc240490915 \h </w:instrText>
+              <w:instrText xml:space="preserve"> PAGEREF _Toc240494041 \h </w:instrText>
             </w:r>
             <w:r>
               <w:rPr>
@@ -2054,7 +2205,7 @@
                 <w:noProof/>
                 <w:webHidden/>
               </w:rPr>
-              <w:t>4</w:t>
+              <w:t>5</w:t>
             </w:r>
             <w:r>
               <w:rPr>
@@ -2081,7 +2232,7 @@
               <w14:ligatures w14:val="standardContextual"/>
             </w:rPr>
           </w:pPr>
-          <w:hyperlink w:anchor="_Toc240490916" w:history="1">
+          <w:hyperlink w:anchor="_Toc240494042" w:history="1">
             <w:r>
               <w:rPr>
                 <w:rStyle w:val="Hipervnculo"/>
@@ -2108,7 +2259,7 @@
                 <w:noProof/>
                 <w:webHidden/>
               </w:rPr>
-              <w:instrText xml:space="preserve"> PAGEREF _Toc240490916 \h </w:instrText>
+              <w:instrText xml:space="preserve"> PAGEREF _Toc240494042 \h </w:instrText>
             </w:r>
             <w:r>
               <w:rPr>
@@ -2128,7 +2279,7 @@
                 <w:noProof/>
                 <w:webHidden/>
               </w:rPr>
-              <w:t>5</w:t>
+              <w:t>6</w:t>
             </w:r>
             <w:r>
               <w:rPr>
@@ -2155,7 +2306,7 @@
               <w14:ligatures w14:val="standardContextual"/>
             </w:rPr>
           </w:pPr>
-          <w:hyperlink w:anchor="_Toc240490917" w:history="1">
+          <w:hyperlink w:anchor="_Toc240494043" w:history="1">
             <w:r>
               <w:rPr>
                 <w:rStyle w:val="Hipervnculo"/>
@@ -2182,7 +2333,7 @@
                 <w:noProof/>
                 <w:webHidden/>
               </w:rPr>
-              <w:instrText xml:space="preserve"> PAGEREF _Toc240490917 \h </w:instrText>
+              <w:instrText xml:space="preserve"> PAGEREF _Toc240494043 \h </w:instrText>
             </w:r>
             <w:r>
               <w:rPr>
@@ -2202,7 +2353,7 @@
                 <w:noProof/>
                 <w:webHidden/>
               </w:rPr>
-              <w:t>5</w:t>
+              <w:t>6</w:t>
             </w:r>
             <w:r>
               <w:rPr>
@@ -2229,7 +2380,7 @@
               <w14:ligatures w14:val="standardContextual"/>
             </w:rPr>
           </w:pPr>
-          <w:hyperlink w:anchor="_Toc240490918" w:history="1">
+          <w:hyperlink w:anchor="_Toc240494044" w:history="1">
             <w:r>
               <w:rPr>
                 <w:rStyle w:val="Hipervnculo"/>
@@ -2256,7 +2407,7 @@
                 <w:noProof/>
                 <w:webHidden/>
               </w:rPr>
-              <w:instrText xml:space="preserve"> PAGEREF _Toc240490918 \h </w:instrText>
+              <w:instrText xml:space="preserve"> PAGEREF _Toc240494044 \h </w:instrText>
             </w:r>
             <w:r>
               <w:rPr>
@@ -2276,7 +2427,7 @@
                 <w:noProof/>
                 <w:webHidden/>
               </w:rPr>
-              <w:t>5</w:t>
+              <w:t>6</w:t>
             </w:r>
             <w:r>
               <w:rPr>
@@ -2303,7 +2454,7 @@
               <w14:ligatures w14:val="standardContextual"/>
             </w:rPr>
           </w:pPr>
-          <w:hyperlink w:anchor="_Toc240490919" w:history="1">
+          <w:hyperlink w:anchor="_Toc240494045" w:history="1">
             <w:r>
               <w:rPr>
                 <w:rStyle w:val="Hipervnculo"/>
@@ -2330,7 +2481,7 @@
                 <w:noProof/>
                 <w:webHidden/>
               </w:rPr>
-              <w:instrText xml:space="preserve"> PAGEREF _Toc240490919 \h </w:instrText>
+              <w:instrText xml:space="preserve"> PAGEREF _Toc240494045 \h </w:instrText>
             </w:r>
             <w:r>
               <w:rPr>
@@ -2350,7 +2501,7 @@
                 <w:noProof/>
                 <w:webHidden/>
               </w:rPr>
-              <w:t>5</w:t>
+              <w:t>6</w:t>
             </w:r>
             <w:r>
               <w:rPr>
@@ -2377,7 +2528,7 @@
               <w14:ligatures w14:val="standardContextual"/>
             </w:rPr>
           </w:pPr>
-          <w:hyperlink w:anchor="_Toc240490920" w:history="1">
+          <w:hyperlink w:anchor="_Toc240494046" w:history="1">
             <w:r>
               <w:rPr>
                 <w:rStyle w:val="Hipervnculo"/>
@@ -2404,7 +2555,7 @@
                 <w:noProof/>
                 <w:webHidden/>
               </w:rPr>
-              <w:instrText xml:space="preserve"> PAGEREF _Toc240490920 \h </w:instrText>
+              <w:instrText xml:space="preserve"> PAGEREF _Toc240494046 \h </w:instrText>
             </w:r>
             <w:r>
               <w:rPr>
@@ -2424,7 +2575,7 @@
                 <w:noProof/>
                 <w:webHidden/>
               </w:rPr>
-              <w:t>6</w:t>
+              <w:t>7</w:t>
             </w:r>
             <w:r>
               <w:rPr>
@@ -2451,7 +2602,7 @@
               <w14:ligatures w14:val="standardContextual"/>
             </w:rPr>
           </w:pPr>
-          <w:hyperlink w:anchor="_Toc240490921" w:history="1">
+          <w:hyperlink w:anchor="_Toc240494047" w:history="1">
             <w:r>
               <w:rPr>
                 <w:rStyle w:val="Hipervnculo"/>
@@ -2478,7 +2629,7 @@
                 <w:noProof/>
                 <w:webHidden/>
               </w:rPr>
-              <w:instrText xml:space="preserve"> PAGEREF _Toc240490921 \h </w:instrText>
+              <w:instrText xml:space="preserve"> PAGEREF _Toc240494047 \h </w:instrText>
             </w:r>
             <w:r>
               <w:rPr>
@@ -2498,7 +2649,7 @@
                 <w:noProof/>
                 <w:webHidden/>
               </w:rPr>
-              <w:t>6</w:t>
+              <w:t>7</w:t>
             </w:r>
             <w:r>
               <w:rPr>
@@ -2525,7 +2676,7 @@
               <w14:ligatures w14:val="standardContextual"/>
             </w:rPr>
           </w:pPr>
-          <w:hyperlink w:anchor="_Toc240490922" w:history="1">
+          <w:hyperlink w:anchor="_Toc240494048" w:history="1">
             <w:r>
               <w:rPr>
                 <w:rStyle w:val="Hipervnculo"/>
@@ -2552,7 +2703,7 @@
                 <w:noProof/>
                 <w:webHidden/>
               </w:rPr>
-              <w:instrText xml:space="preserve"> PAGEREF _Toc240490922 \h </w:instrText>
+              <w:instrText xml:space="preserve"> PAGEREF _Toc240494048 \h </w:instrText>
             </w:r>
             <w:r>
               <w:rPr>
@@ -2572,7 +2723,7 @@
                 <w:noProof/>
                 <w:webHidden/>
               </w:rPr>
-              <w:t>6</w:t>
+              <w:t>8</w:t>
             </w:r>
             <w:r>
               <w:rPr>
@@ -2599,7 +2750,7 @@
               <w14:ligatures w14:val="standardContextual"/>
             </w:rPr>
           </w:pPr>
-          <w:hyperlink w:anchor="_Toc240490923" w:history="1">
+          <w:hyperlink w:anchor="_Toc240494049" w:history="1">
             <w:r>
               <w:rPr>
                 <w:rStyle w:val="Hipervnculo"/>
@@ -2626,7 +2777,7 @@
                 <w:noProof/>
                 <w:webHidden/>
               </w:rPr>
-              <w:instrText xml:space="preserve"> PAGEREF _Toc240490923 \h </w:instrText>
+              <w:instrText xml:space="preserve"> PAGEREF _Toc240494049 \h </w:instrText>
             </w:r>
             <w:r>
               <w:rPr>
@@ -2646,7 +2797,7 @@
                 <w:noProof/>
                 <w:webHidden/>
               </w:rPr>
-              <w:t>7</w:t>
+              <w:t>8</w:t>
             </w:r>
             <w:r>
               <w:rPr>
@@ -2673,7 +2824,7 @@
               <w14:ligatures w14:val="standardContextual"/>
             </w:rPr>
           </w:pPr>
-          <w:hyperlink w:anchor="_Toc240490924" w:history="1">
+          <w:hyperlink w:anchor="_Toc240494050" w:history="1">
             <w:r>
               <w:rPr>
                 <w:rStyle w:val="Hipervnculo"/>
@@ -2700,7 +2851,7 @@
                 <w:noProof/>
                 <w:webHidden/>
               </w:rPr>
-              <w:instrText xml:space="preserve"> PAGEREF _Toc240490924 \h </w:instrText>
+              <w:instrText xml:space="preserve"> PAGEREF _Toc240494050 \h </w:instrText>
             </w:r>
             <w:r>
               <w:rPr>
@@ -2720,7 +2871,7 @@
                 <w:noProof/>
                 <w:webHidden/>
               </w:rPr>
-              <w:t>9</w:t>
+              <w:t>10</w:t>
             </w:r>
             <w:r>
               <w:rPr>
@@ -2747,7 +2898,7 @@
               <w14:ligatures w14:val="standardContextual"/>
             </w:rPr>
           </w:pPr>
-          <w:hyperlink w:anchor="_Toc240490925" w:history="1">
+          <w:hyperlink w:anchor="_Toc240494051" w:history="1">
             <w:r>
               <w:rPr>
                 <w:rStyle w:val="Hipervnculo"/>
@@ -2774,7 +2925,7 @@
                 <w:noProof/>
                 <w:webHidden/>
               </w:rPr>
-              <w:instrText xml:space="preserve"> PAGEREF _Toc240490925 \h </w:instrText>
+              <w:instrText xml:space="preserve"> PAGEREF _Toc240494051 \h </w:instrText>
             </w:r>
             <w:r>
               <w:rPr>
@@ -2794,7 +2945,7 @@
                 <w:noProof/>
                 <w:webHidden/>
               </w:rPr>
-              <w:t>10</w:t>
+              <w:t>11</w:t>
             </w:r>
             <w:r>
               <w:rPr>
@@ -2821,7 +2972,7 @@
               <w14:ligatures w14:val="standardContextual"/>
             </w:rPr>
           </w:pPr>
-          <w:hyperlink w:anchor="_Toc240490926" w:history="1">
+          <w:hyperlink w:anchor="_Toc240494052" w:history="1">
             <w:r>
               <w:rPr>
                 <w:rStyle w:val="Hipervnculo"/>
@@ -2848,7 +2999,7 @@
                 <w:noProof/>
                 <w:webHidden/>
               </w:rPr>
-              <w:instrText xml:space="preserve"> PAGEREF _Toc240490926 \h </w:instrText>
+              <w:instrText xml:space="preserve"> PAGEREF _Toc240494052 \h </w:instrText>
             </w:r>
             <w:r>
               <w:rPr>
@@ -2868,7 +3019,7 @@
                 <w:noProof/>
                 <w:webHidden/>
               </w:rPr>
-              <w:t>11</w:t>
+              <w:t>12</w:t>
             </w:r>
             <w:r>
               <w:rPr>
@@ -2890,90 +3041,432 @@
         </w:p>
       </w:sdtContent>
     </w:sdt>
+    <w:p/>
+    <w:p/>
+    <w:p/>
+    <w:p/>
+    <w:p/>
+    <w:p/>
+    <w:p/>
+    <w:p/>
     <w:p>
-      <w:r>
-        <w:br w:type="page"/>
+      <w:pPr>
+        <w:pStyle w:val="Ttulo1"/>
+      </w:pPr>
+      <w:bookmarkStart w:id="1" w:name="_Toc240494033"/>
+      <w:r>
+        <w:t>Í</w:t>
+      </w:r>
+      <w:r>
+        <w:t>ndice de Tablas</w:t>
+      </w:r>
+      <w:bookmarkEnd w:id="1"/>
+      <w:r>
+        <w:t xml:space="preserve"> </w:t>
       </w:r>
     </w:p>
     <w:p>
       <w:pPr>
-        <w:pStyle w:val="Ttulo1"/>
-      </w:pPr>
-      <w:bookmarkStart w:id="1" w:name="_Toc240490909"/>
-      <w:r>
-        <w:lastRenderedPageBreak/>
-        <w:t>1. Introducción y contextualización</w:t>
-      </w:r>
-      <w:bookmarkEnd w:id="1"/>
+        <w:pStyle w:val="Tabladeilustraciones"/>
+        <w:tabs>
+          <w:tab w:val="right" w:leader="dot" w:pos="9396"/>
+        </w:tabs>
+        <w:rPr>
+          <w:noProof/>
+        </w:rPr>
+      </w:pPr>
+      <w:r>
+        <w:fldChar w:fldCharType="begin"/>
+      </w:r>
+      <w:r>
+        <w:instrText xml:space="preserve"> TOC \h \z \c "Tabla" </w:instrText>
+      </w:r>
+      <w:r>
+        <w:fldChar w:fldCharType="separate"/>
+      </w:r>
+      <w:hyperlink w:anchor="_Toc240493888" w:history="1">
+        <w:r>
+          <w:rPr>
+            <w:rStyle w:val="Hipervnculo"/>
+            <w:noProof/>
+          </w:rPr>
+          <w:t>Tabla 1: Diccionario de variables, roles analíticos y uso en el dataset procesado.</w:t>
+        </w:r>
+        <w:r>
+          <w:rPr>
+            <w:noProof/>
+            <w:webHidden/>
+          </w:rPr>
+          <w:tab/>
+        </w:r>
+        <w:r>
+          <w:rPr>
+            <w:noProof/>
+            <w:webHidden/>
+          </w:rPr>
+          <w:fldChar w:fldCharType="begin"/>
+        </w:r>
+        <w:r>
+          <w:rPr>
+            <w:noProof/>
+            <w:webHidden/>
+          </w:rPr>
+          <w:instrText xml:space="preserve"> PAGEREF _Toc240493888 \h </w:instrText>
+        </w:r>
+        <w:r>
+          <w:rPr>
+            <w:noProof/>
+            <w:webHidden/>
+          </w:rPr>
+        </w:r>
+        <w:r>
+          <w:rPr>
+            <w:noProof/>
+            <w:webHidden/>
+          </w:rPr>
+          <w:fldChar w:fldCharType="separate"/>
+        </w:r>
+        <w:r>
+          <w:rPr>
+            <w:noProof/>
+            <w:webHidden/>
+          </w:rPr>
+          <w:t>5</w:t>
+        </w:r>
+        <w:r>
+          <w:rPr>
+            <w:noProof/>
+            <w:webHidden/>
+          </w:rPr>
+          <w:fldChar w:fldCharType="end"/>
+        </w:r>
+      </w:hyperlink>
     </w:p>
     <w:p>
       <w:pPr>
-        <w:spacing w:after="120"/>
-        <w:jc w:val="both"/>
-      </w:pPr>
-      <w:r>
-        <w:t xml:space="preserve">El proyecto trabaja con datos públicos de generación real publicados por el Coordinador Eléctrico Nacional (CEN). El análisis se concentra en tres centrales </w:t>
-      </w:r>
-      <w:r>
-        <w:t>-</w:t>
-      </w:r>
-      <w:r>
-        <w:t>TER CMPC Laja, TER CMPC Pacífico y TER CMPC Santa Fe</w:t>
-      </w:r>
-      <w:r>
-        <w:t>-</w:t>
-      </w:r>
-      <w:r>
-        <w:t xml:space="preserve"> y considera el período comprendido entre enero y agosto de 2026. A partir de estos registros se busca caracterizar cómo varía la generación eléctrica a lo largo del tiempo e identificar patrones relevantes en su comportamiento. </w:t>
-      </w:r>
-      <w:r>
-        <w:t>La fuente oficial permite descargar los datos de generación real e incluye un diccionario asociado para interpretar sus variables (Coordinador Eléctrico Nacional, 2022)</w:t>
-      </w:r>
-      <w:r>
-        <w:t>. Además, el CEN señala que esta publicación responde al requisito legal establecido en la Ley 20.936, artículo 72-8 d) (Coordinador Eléctrico Nacional, 2026a).</w:t>
-      </w:r>
+        <w:pStyle w:val="Tabladeilustraciones"/>
+        <w:tabs>
+          <w:tab w:val="right" w:leader="dot" w:pos="9396"/>
+        </w:tabs>
+        <w:rPr>
+          <w:noProof/>
+        </w:rPr>
+      </w:pPr>
+      <w:hyperlink w:anchor="_Toc240493889" w:history="1">
+        <w:r>
+          <w:rPr>
+            <w:rStyle w:val="Hipervnculo"/>
+            <w:noProof/>
+          </w:rPr>
+          <w:t>Tabla 2: Matriz de evidencias técnicas del proyecto disponibles en el repositorio GitHub.</w:t>
+        </w:r>
+        <w:r>
+          <w:rPr>
+            <w:noProof/>
+            <w:webHidden/>
+          </w:rPr>
+          <w:tab/>
+        </w:r>
+        <w:r>
+          <w:rPr>
+            <w:noProof/>
+            <w:webHidden/>
+          </w:rPr>
+          <w:fldChar w:fldCharType="begin"/>
+        </w:r>
+        <w:r>
+          <w:rPr>
+            <w:noProof/>
+            <w:webHidden/>
+          </w:rPr>
+          <w:instrText xml:space="preserve"> PAGEREF _Toc240493889 \h </w:instrText>
+        </w:r>
+        <w:r>
+          <w:rPr>
+            <w:noProof/>
+            <w:webHidden/>
+          </w:rPr>
+        </w:r>
+        <w:r>
+          <w:rPr>
+            <w:noProof/>
+            <w:webHidden/>
+          </w:rPr>
+          <w:fldChar w:fldCharType="separate"/>
+        </w:r>
+        <w:r>
+          <w:rPr>
+            <w:noProof/>
+            <w:webHidden/>
+          </w:rPr>
+          <w:t>8</w:t>
+        </w:r>
+        <w:r>
+          <w:rPr>
+            <w:noProof/>
+            <w:webHidden/>
+          </w:rPr>
+          <w:fldChar w:fldCharType="end"/>
+        </w:r>
+      </w:hyperlink>
     </w:p>
     <w:p>
       <w:pPr>
-        <w:spacing w:after="120"/>
-        <w:jc w:val="both"/>
-      </w:pPr>
-      <w:r>
-        <w:t xml:space="preserve">La Sumativa 1 aborda las fases F1 y F2 del proyecto. En esta etapa se define el problema, se prepara el entorno de trabajo, se obtienen y exploran los datos y luego se aplican procesos de limpieza, transformación y validación. También se documentan las decisiones tomadas y se mantiene la trazabilidad del trabajo realizado. </w:t>
-      </w:r>
-      <w:r>
-        <w:t>Las fases F3 y F4 quedan destinadas al desarrollo del núcleo algorítmico, análisis de eficiencia e implementación orientada a objetos, para continuar posteriormente con la integración y comunicación de los resultados.</w:t>
-      </w:r>
-      <w:r>
-        <w:t xml:space="preserve"> </w:t>
-      </w:r>
+        <w:pStyle w:val="Tabladeilustraciones"/>
+        <w:tabs>
+          <w:tab w:val="right" w:leader="dot" w:pos="9396"/>
+        </w:tabs>
+        <w:rPr>
+          <w:noProof/>
+        </w:rPr>
+      </w:pPr>
+      <w:hyperlink w:anchor="_Toc240493890" w:history="1">
+        <w:r>
+          <w:rPr>
+            <w:rStyle w:val="Hipervnculo"/>
+            <w:noProof/>
+          </w:rPr>
+          <w:t>Tabla 3. Matriz de vinculación entre los elementos del mapa conceptual y su evidencia técnica.</w:t>
+        </w:r>
+        <w:r>
+          <w:rPr>
+            <w:noProof/>
+            <w:webHidden/>
+          </w:rPr>
+          <w:tab/>
+        </w:r>
+        <w:r>
+          <w:rPr>
+            <w:noProof/>
+            <w:webHidden/>
+          </w:rPr>
+          <w:fldChar w:fldCharType="begin"/>
+        </w:r>
+        <w:r>
+          <w:rPr>
+            <w:noProof/>
+            <w:webHidden/>
+          </w:rPr>
+          <w:instrText xml:space="preserve"> PAGEREF _Toc240493890 \h </w:instrText>
+        </w:r>
+        <w:r>
+          <w:rPr>
+            <w:noProof/>
+            <w:webHidden/>
+          </w:rPr>
+        </w:r>
+        <w:r>
+          <w:rPr>
+            <w:noProof/>
+            <w:webHidden/>
+          </w:rPr>
+          <w:fldChar w:fldCharType="separate"/>
+        </w:r>
+        <w:r>
+          <w:rPr>
+            <w:noProof/>
+            <w:webHidden/>
+          </w:rPr>
+          <w:t>10</w:t>
+        </w:r>
+        <w:r>
+          <w:rPr>
+            <w:noProof/>
+            <w:webHidden/>
+          </w:rPr>
+          <w:fldChar w:fldCharType="end"/>
+        </w:r>
+      </w:hyperlink>
     </w:p>
     <w:p>
       <w:pPr>
-        <w:spacing w:after="120"/>
-        <w:jc w:val="both"/>
-      </w:pPr>
-      <w:r>
-        <w:t>El volumen y la estructura horaria de los registros hacen necesario utilizar programación para transformar, validar y analizar los datos de manera reproducible.</w:t>
-      </w:r>
+        <w:pStyle w:val="Tabladeilustraciones"/>
+        <w:tabs>
+          <w:tab w:val="right" w:leader="dot" w:pos="9396"/>
+        </w:tabs>
+        <w:rPr>
+          <w:noProof/>
+        </w:rPr>
+      </w:pPr>
+      <w:hyperlink w:anchor="_Toc240493891" w:history="1">
+        <w:r>
+          <w:rPr>
+            <w:rStyle w:val="Hipervnculo"/>
+            <w:noProof/>
+          </w:rPr>
+          <w:t>Tabla 4. Resumen del estado de avance de las fases F1 a F4 del proyecto.</w:t>
+        </w:r>
+        <w:r>
+          <w:rPr>
+            <w:noProof/>
+            <w:webHidden/>
+          </w:rPr>
+          <w:tab/>
+        </w:r>
+        <w:r>
+          <w:rPr>
+            <w:noProof/>
+            <w:webHidden/>
+          </w:rPr>
+          <w:fldChar w:fldCharType="begin"/>
+        </w:r>
+        <w:r>
+          <w:rPr>
+            <w:noProof/>
+            <w:webHidden/>
+          </w:rPr>
+          <w:instrText xml:space="preserve"> PAGEREF _Toc240493891 \h </w:instrText>
+        </w:r>
+        <w:r>
+          <w:rPr>
+            <w:noProof/>
+            <w:webHidden/>
+          </w:rPr>
+        </w:r>
+        <w:r>
+          <w:rPr>
+            <w:noProof/>
+            <w:webHidden/>
+          </w:rPr>
+          <w:fldChar w:fldCharType="separate"/>
+        </w:r>
+        <w:r>
+          <w:rPr>
+            <w:noProof/>
+            <w:webHidden/>
+          </w:rPr>
+          <w:t>11</w:t>
+        </w:r>
+        <w:r>
+          <w:rPr>
+            <w:noProof/>
+            <w:webHidden/>
+          </w:rPr>
+          <w:fldChar w:fldCharType="end"/>
+        </w:r>
+      </w:hyperlink>
     </w:p>
     <w:p>
+      <w:r>
+        <w:fldChar w:fldCharType="end"/>
+      </w:r>
+    </w:p>
+    <w:p>
       <w:pPr>
         <w:pStyle w:val="Ttulo1"/>
       </w:pPr>
-      <w:bookmarkStart w:id="2" w:name="_Toc240490910"/>
-      <w:r>
-        <w:t>2. Definición de la problemática y objetivos</w:t>
+      <w:bookmarkStart w:id="2" w:name="_Toc240494034"/>
+      <w:proofErr w:type="spellStart"/>
+      <w:r>
+        <w:t>Indice</w:t>
+      </w:r>
+      <w:proofErr w:type="spellEnd"/>
+      <w:r>
+        <w:t xml:space="preserve"> de Figuras</w:t>
       </w:r>
       <w:bookmarkEnd w:id="2"/>
     </w:p>
     <w:p>
       <w:pPr>
-        <w:pStyle w:val="Ttulo2"/>
-      </w:pPr>
-      <w:bookmarkStart w:id="3" w:name="_Toc240490911"/>
-      <w:r>
-        <w:t>2.1 Pregunta de investigación</w:t>
+        <w:pStyle w:val="Tabladeilustraciones"/>
+        <w:tabs>
+          <w:tab w:val="right" w:leader="dot" w:pos="9396"/>
+        </w:tabs>
+        <w:rPr>
+          <w:rFonts w:asciiTheme="minorHAnsi" w:hAnsiTheme="minorHAnsi"/>
+          <w:noProof/>
+          <w:kern w:val="2"/>
+          <w:sz w:val="24"/>
+          <w:szCs w:val="24"/>
+          <w:lang w:eastAsia="es-CL"/>
+          <w14:ligatures w14:val="standardContextual"/>
+        </w:rPr>
+      </w:pPr>
+      <w:r>
+        <w:fldChar w:fldCharType="begin"/>
+      </w:r>
+      <w:r>
+        <w:instrText xml:space="preserve"> TOC \h \z \c "Ilustración" </w:instrText>
+      </w:r>
+      <w:r>
+        <w:fldChar w:fldCharType="separate"/>
+      </w:r>
+      <w:hyperlink w:anchor="_Toc240493957" w:history="1">
+        <w:r>
+          <w:rPr>
+            <w:rStyle w:val="Hipervnculo"/>
+            <w:noProof/>
+          </w:rPr>
+          <w:t>Ilustración 1. Mapa conceptual actualizado del proyecto</w:t>
+        </w:r>
+        <w:r>
+          <w:rPr>
+            <w:noProof/>
+            <w:webHidden/>
+          </w:rPr>
+          <w:tab/>
+        </w:r>
+        <w:r>
+          <w:rPr>
+            <w:noProof/>
+            <w:webHidden/>
+          </w:rPr>
+          <w:fldChar w:fldCharType="begin"/>
+        </w:r>
+        <w:r>
+          <w:rPr>
+            <w:noProof/>
+            <w:webHidden/>
+          </w:rPr>
+          <w:instrText xml:space="preserve"> PAGEREF _Toc240493957 \h </w:instrText>
+        </w:r>
+        <w:r>
+          <w:rPr>
+            <w:noProof/>
+            <w:webHidden/>
+          </w:rPr>
+        </w:r>
+        <w:r>
+          <w:rPr>
+            <w:noProof/>
+            <w:webHidden/>
+          </w:rPr>
+          <w:fldChar w:fldCharType="separate"/>
+        </w:r>
+        <w:r>
+          <w:rPr>
+            <w:noProof/>
+            <w:webHidden/>
+          </w:rPr>
+          <w:t>9</w:t>
+        </w:r>
+        <w:r>
+          <w:rPr>
+            <w:noProof/>
+            <w:webHidden/>
+          </w:rPr>
+          <w:fldChar w:fldCharType="end"/>
+        </w:r>
+      </w:hyperlink>
+    </w:p>
+    <w:p>
+      <w:r>
+        <w:fldChar w:fldCharType="end"/>
+      </w:r>
+    </w:p>
+    <w:p>
+      <w:r>
+        <w:br w:type="page"/>
+      </w:r>
+    </w:p>
+    <w:p>
+      <w:pPr>
+        <w:pStyle w:val="Ttulo1"/>
+      </w:pPr>
+      <w:bookmarkStart w:id="3" w:name="_Toc240494035"/>
+      <w:r>
+        <w:lastRenderedPageBreak/>
+        <w:t>1. Introducción y contextualización</w:t>
       </w:r>
       <w:bookmarkEnd w:id="3"/>
     </w:p>
@@ -2983,7 +3476,25 @@
         <w:jc w:val="both"/>
       </w:pPr>
       <w:r>
-        <w:t>¿Qué patrones temporales de generación eléctrica caracterizan a las centrales TER CMPC Laja, TER CMPC Pacífico y TER CMPC Santa Fe durante el período enero-agosto de 2026?</w:t>
+        <w:t xml:space="preserve">El proyecto trabaja con datos públicos de generación real publicados por el Coordinador Eléctrico Nacional (CEN). El análisis se concentra en tres centrales </w:t>
+      </w:r>
+      <w:r>
+        <w:t>-</w:t>
+      </w:r>
+      <w:r>
+        <w:t>TER CMPC Laja, TER CMPC Pacífico y TER CMPC Santa Fe</w:t>
+      </w:r>
+      <w:r>
+        <w:t>-</w:t>
+      </w:r>
+      <w:r>
+        <w:t xml:space="preserve"> y considera el período comprendido entre enero y agosto de 2026. A partir de estos registros se busca caracterizar cómo varía la generación eléctrica a lo largo del tiempo e identificar patrones relevantes en su comportamiento. </w:t>
+      </w:r>
+      <w:r>
+        <w:t>La fuente oficial permite descargar los datos de generación real e incluye un diccionario asociado para interpretar sus variables (Coordinador Eléctrico Nacional, 2022)</w:t>
+      </w:r>
+      <w:r>
+        <w:t>. Además, el CEN señala que esta publicación responde al requisito legal establecido en la Ley 20.936, artículo 72-8 d) (Coordinador Eléctrico Nacional, 2026a).</w:t>
       </w:r>
     </w:p>
     <w:p>
@@ -2992,37 +3503,90 @@
         <w:jc w:val="both"/>
       </w:pPr>
       <w:r>
-        <w:t>La pregunta se formuló con un alcance deliberadamente acotado. Busca responder solo aquello que puede observarse y analizarse a partir de las variables disponibles en el conjunto de datos, evitando extender el estudio hacia aspectos que la fuente no permite sustentar. Este enfoque sigue el criterio de pregunta analizable definido para la Fase 1 del proyecto (Salinas Silva, 2026).</w:t>
+        <w:t xml:space="preserve">La Sumativa 1 aborda las fases F1 y F2 del proyecto. En esta etapa se define el problema, se prepara el entorno de trabajo, se obtienen y exploran los datos y luego se aplican procesos de limpieza, transformación y validación. También se documentan las decisiones tomadas y se mantiene la trazabilidad del trabajo realizado. </w:t>
+      </w:r>
+      <w:r>
+        <w:t>Las fases F3 y F4 quedan destinadas al desarrollo del núcleo algorítmico, análisis de eficiencia e implementación orientada a objetos, para continuar posteriormente con la integración y comunicación de los resultados.</w:t>
+      </w:r>
+      <w:r>
+        <w:t xml:space="preserve"> </w:t>
       </w:r>
     </w:p>
     <w:p>
       <w:pPr>
-        <w:pStyle w:val="Ttulo2"/>
-      </w:pPr>
-      <w:bookmarkStart w:id="4" w:name="_Toc240490912"/>
-      <w:r>
-        <w:t>2.2 Objetivo general</w:t>
+        <w:spacing w:after="120"/>
+        <w:jc w:val="both"/>
+      </w:pPr>
+      <w:r>
+        <w:t>El volumen y la estructura horaria de los registros hacen necesario utilizar programación para transformar, validar y analizar los datos de manera reproducible.</w:t>
+      </w:r>
+    </w:p>
+    <w:p>
+      <w:pPr>
+        <w:pStyle w:val="Ttulo1"/>
+      </w:pPr>
+      <w:bookmarkStart w:id="4" w:name="_Toc240494036"/>
+      <w:r>
+        <w:t>2. Definición de la problemática y objetivos</w:t>
       </w:r>
       <w:bookmarkEnd w:id="4"/>
     </w:p>
     <w:p>
       <w:pPr>
+        <w:pStyle w:val="Ttulo2"/>
+      </w:pPr>
+      <w:bookmarkStart w:id="5" w:name="_Toc240494037"/>
+      <w:r>
+        <w:t>2.1 Pregunta de investigación</w:t>
+      </w:r>
+      <w:bookmarkEnd w:id="5"/>
+    </w:p>
+    <w:p>
+      <w:pPr>
         <w:spacing w:after="120"/>
         <w:jc w:val="both"/>
       </w:pPr>
       <w:r>
-        <w:t>Caracterizar los patrones temporales de generación eléctrica de las centrales TER CMPC Laja, TER CMPC Pacífico y TER CMPC Santa Fe durante enero-agosto de 2026, utilizando datos públicos del Coordinador Eléctrico Nacional mediante un proceso reproducible de preparación, validación y análisis.</w:t>
+        <w:t>¿Qué patrones temporales de generación eléctrica caracterizan a las centrales TER CMPC Laja, TER CMPC Pacífico y TER CMPC Santa Fe durante el período enero-agosto de 2026?</w:t>
       </w:r>
     </w:p>
     <w:p>
       <w:pPr>
+        <w:spacing w:after="120"/>
+        <w:jc w:val="both"/>
+      </w:pPr>
+      <w:r>
+        <w:t>La pregunta se formuló con un alcance deliberadamente acotado. Busca responder solo aquello que puede observarse y analizarse a partir de las variables disponibles en el conjunto de datos, evitando extender el estudio hacia aspectos que la fuente no permite sustentar. Este enfoque sigue el criterio de pregunta analizable definido para la Fase 1 del proyecto (Salinas Silva, 2026).</w:t>
+      </w:r>
+    </w:p>
+    <w:p>
+      <w:pPr>
         <w:pStyle w:val="Ttulo2"/>
       </w:pPr>
-      <w:bookmarkStart w:id="5" w:name="_Toc240490913"/>
+      <w:bookmarkStart w:id="6" w:name="_Toc240494038"/>
+      <w:r>
+        <w:t>2.2 Objetivo general</w:t>
+      </w:r>
+      <w:bookmarkEnd w:id="6"/>
+    </w:p>
+    <w:p>
+      <w:pPr>
+        <w:spacing w:after="120"/>
+        <w:jc w:val="both"/>
+      </w:pPr>
+      <w:r>
+        <w:t>Caracterizar los patrones temporales de generación eléctrica de las centrales TER CMPC Laja, TER CMPC Pacífico y TER CMPC Santa Fe durante enero-agosto de 2026, utilizando datos públicos del Coordinador Eléctrico Nacional mediante un proceso reproducible de preparación, validación y análisis.</w:t>
+      </w:r>
+    </w:p>
+    <w:p>
+      <w:pPr>
+        <w:pStyle w:val="Ttulo2"/>
+      </w:pPr>
+      <w:bookmarkStart w:id="7" w:name="_Toc240494039"/>
       <w:r>
         <w:t>2.3 Objetivos específicos</w:t>
       </w:r>
-      <w:bookmarkEnd w:id="5"/>
+      <w:bookmarkEnd w:id="7"/>
     </w:p>
     <w:p>
       <w:pPr>
@@ -3093,11 +3657,11 @@
       <w:pPr>
         <w:pStyle w:val="Ttulo2"/>
       </w:pPr>
-      <w:bookmarkStart w:id="6" w:name="_Toc240490914"/>
+      <w:bookmarkStart w:id="8" w:name="_Toc240494040"/>
       <w:r>
         <w:t>2.4 Alcance, restricciones y supuestos</w:t>
       </w:r>
-      <w:bookmarkEnd w:id="6"/>
+      <w:bookmarkEnd w:id="8"/>
     </w:p>
     <w:p>
       <w:pPr>
@@ -3138,11 +3702,11 @@
       <w:pPr>
         <w:pStyle w:val="Ttulo1"/>
       </w:pPr>
-      <w:bookmarkStart w:id="7" w:name="_Toc240490915"/>
+      <w:bookmarkStart w:id="9" w:name="_Toc240494041"/>
       <w:r>
         <w:t>3. Datos, alcance y variables</w:t>
       </w:r>
-      <w:bookmarkEnd w:id="7"/>
+      <w:bookmarkEnd w:id="9"/>
     </w:p>
     <w:p>
       <w:pPr>
@@ -3167,7 +3731,33 @@
       </w:r>
       <w:proofErr w:type="spellEnd"/>
       <w:r>
-        <w:t xml:space="preserve"> resultante contiene 17.496 filas y 13 columnas. Cada fila representa una combinación de central, fecha y hora. Se mantuvo la codificación horaria 1-24 utilizada por el CEN, sin asignarle una equivalencia horaria distinta que no esté documentada por la fuente.</w:t>
+        <w:t xml:space="preserve"> resultante contiene 17.496 filas y 13 columnas</w:t>
+      </w:r>
+      <w:r>
+        <w:t>. C</w:t>
+      </w:r>
+      <w:r>
+        <w:t>ada fila representa una combinación de central, fecha y hora. Se mantuvo la codificación horaria 1-24 utilizada por el CEN, sin asignarle una equivalencia horaria distinta que no esté documentada por la fuente.</w:t>
+      </w:r>
+      <w:r>
+        <w:t xml:space="preserve"> </w:t>
+      </w:r>
+    </w:p>
+    <w:p>
+      <w:pPr>
+        <w:spacing w:after="120"/>
+        <w:jc w:val="both"/>
+      </w:pPr>
+      <w:r>
+        <w:t xml:space="preserve">La Tabla N°1 muestra la clasificación de las variables contenidas en el </w:t>
+      </w:r>
+      <w:proofErr w:type="spellStart"/>
+      <w:r>
+        <w:t>dataset</w:t>
+      </w:r>
+      <w:proofErr w:type="spellEnd"/>
+      <w:r>
+        <w:t>, definiendo su rol analítico o tipo y función dentro del estudio.</w:t>
       </w:r>
     </w:p>
     <w:tbl>
@@ -3457,15 +4047,95 @@
     </w:tbl>
     <w:p>
       <w:pPr>
+        <w:pStyle w:val="Descripcin"/>
+        <w:rPr>
+          <w:b w:val="0"/>
+          <w:bCs w:val="0"/>
+          <w:color w:val="auto"/>
+        </w:rPr>
+      </w:pPr>
+      <w:bookmarkStart w:id="10" w:name="_Toc240493888"/>
+      <w:r>
+        <w:rPr>
+          <w:b w:val="0"/>
+          <w:bCs w:val="0"/>
+          <w:color w:val="auto"/>
+        </w:rPr>
+        <w:t xml:space="preserve">Tabla </w:t>
+      </w:r>
+      <w:r>
+        <w:rPr>
+          <w:b w:val="0"/>
+          <w:bCs w:val="0"/>
+          <w:color w:val="auto"/>
+        </w:rPr>
+        <w:fldChar w:fldCharType="begin"/>
+      </w:r>
+      <w:r>
+        <w:rPr>
+          <w:b w:val="0"/>
+          <w:bCs w:val="0"/>
+          <w:color w:val="auto"/>
+        </w:rPr>
+        <w:instrText xml:space="preserve"> SEQ Tabla \* ARABIC </w:instrText>
+      </w:r>
+      <w:r>
+        <w:rPr>
+          <w:b w:val="0"/>
+          <w:bCs w:val="0"/>
+          <w:color w:val="auto"/>
+        </w:rPr>
+        <w:fldChar w:fldCharType="separate"/>
+      </w:r>
+      <w:r>
+        <w:rPr>
+          <w:b w:val="0"/>
+          <w:bCs w:val="0"/>
+          <w:noProof/>
+          <w:color w:val="auto"/>
+        </w:rPr>
+        <w:t>1</w:t>
+      </w:r>
+      <w:r>
+        <w:rPr>
+          <w:b w:val="0"/>
+          <w:bCs w:val="0"/>
+          <w:color w:val="auto"/>
+        </w:rPr>
+        <w:fldChar w:fldCharType="end"/>
+      </w:r>
+      <w:r>
+        <w:rPr>
+          <w:b w:val="0"/>
+          <w:bCs w:val="0"/>
+          <w:color w:val="auto"/>
+        </w:rPr>
+        <w:t xml:space="preserve">: Diccionario de variables, roles analíticos y uso en el </w:t>
+      </w:r>
+      <w:proofErr w:type="spellStart"/>
+      <w:r>
+        <w:rPr>
+          <w:b w:val="0"/>
+          <w:bCs w:val="0"/>
+          <w:color w:val="auto"/>
+        </w:rPr>
+        <w:t>dataset</w:t>
+      </w:r>
+      <w:proofErr w:type="spellEnd"/>
+      <w:r>
+        <w:rPr>
+          <w:b w:val="0"/>
+          <w:bCs w:val="0"/>
+          <w:color w:val="auto"/>
+        </w:rPr>
+        <w:t xml:space="preserve"> procesado.</w:t>
+      </w:r>
+      <w:bookmarkEnd w:id="10"/>
+    </w:p>
+    <w:p>
+      <w:pPr>
         <w:spacing w:after="120"/>
         <w:jc w:val="both"/>
-      </w:pPr>
-      <w:r>
-        <w:t>Dentro del conjunto seleccionado, las variables Coordinado, Tipo y Subtipo mantienen el mismo valor en todos los registros. Se conservaron porque entregan contexto sobre los datos, aunque no permiten diferenciar las observaciones utilizadas en este análisis.</w:t>
-      </w:r>
-    </w:p>
-    <w:p>
-      <w:pPr>
         <w:rPr>
           <w:rFonts w:asciiTheme="majorHAnsi" w:eastAsiaTheme="majorEastAsia" w:hAnsiTheme="majorHAnsi" w:cstheme="majorBidi"/>
           <w:b/>
@@ -3476,260 +4146,17 @@
         </w:rPr>
       </w:pPr>
       <w:r>
-        <w:br w:type="page"/>
+        <w:lastRenderedPageBreak/>
+        <w:t>Dentro del conjunto seleccionado, las variables Coordinado, Tipo y Subtipo mantienen el mismo valor en todos los registros. Se conservaron porque entregan contexto sobre los datos, aunque no permiten diferenciar las observaciones utilizadas en este análisis.</w:t>
       </w:r>
     </w:p>
     <w:p>
       <w:pPr>
         <w:pStyle w:val="Ttulo2"/>
       </w:pPr>
-      <w:bookmarkStart w:id="8" w:name="_Toc240490916"/>
-      <w:r>
-        <w:lastRenderedPageBreak/>
+      <w:bookmarkStart w:id="11" w:name="_Toc240494042"/>
+      <w:r>
         <w:t>3.1 Condiciones de uso de los datos</w:t>
-      </w:r>
-      <w:bookmarkEnd w:id="8"/>
-    </w:p>
-    <w:p>
-      <w:pPr>
-        <w:spacing w:after="120"/>
-        <w:jc w:val="both"/>
-      </w:pPr>
-      <w:r>
-        <w:t>Los datos utilizados provienen de la plataforma pública de Generación Real del Coordinador Eléctrico Nacional (CEN). De acuerdo con los Términos y Condiciones de Uso de su sitio web, esta información puede descargarse para fines personales y/o académicos, siempre que se identifique y cite la fuente. En este proyecto se utiliza bajo esas condiciones y se mantiene explícitamente su procedencia (Coordinador Eléctrico Nacional, 2026b).</w:t>
-      </w:r>
-    </w:p>
-    <w:p>
-      <w:pPr>
-        <w:pStyle w:val="Ttulo1"/>
-      </w:pPr>
-      <w:bookmarkStart w:id="9" w:name="_Toc240490917"/>
-      <w:r>
-        <w:t>4. Aplicación de herramientas científicas</w:t>
-      </w:r>
-      <w:bookmarkEnd w:id="9"/>
-    </w:p>
-    <w:p>
-      <w:pPr>
-        <w:spacing w:after="120"/>
-        <w:jc w:val="both"/>
-      </w:pPr>
-      <w:r>
-        <w:t xml:space="preserve">El proyecto se desarrolla en Python utilizando </w:t>
-      </w:r>
-      <w:proofErr w:type="spellStart"/>
-      <w:r>
-        <w:t>Jupyter</w:t>
-      </w:r>
-      <w:proofErr w:type="spellEnd"/>
-      <w:r>
-        <w:t xml:space="preserve"> Notebook como entorno de trabajo. Pandas se usa para cargar, filtrar, transformar y validar los datos; </w:t>
-      </w:r>
-      <w:proofErr w:type="spellStart"/>
-      <w:r>
-        <w:t>NumPy</w:t>
-      </w:r>
-      <w:proofErr w:type="spellEnd"/>
-      <w:r>
-        <w:t xml:space="preserve"> apoya las operaciones numéricas y </w:t>
-      </w:r>
-      <w:proofErr w:type="spellStart"/>
-      <w:r>
-        <w:t>Matplotlib</w:t>
-      </w:r>
-      <w:proofErr w:type="spellEnd"/>
-      <w:r>
-        <w:t xml:space="preserve"> se emplea para generar visualizaciones. La implementación del pipeline se apoya tanto en documentación técnica oficial como en bibliografía especializada sobre análisis de datos con Python (Python Software </w:t>
-      </w:r>
-      <w:proofErr w:type="spellStart"/>
-      <w:r>
-        <w:t>Foundation</w:t>
-      </w:r>
-      <w:proofErr w:type="spellEnd"/>
-      <w:r>
-        <w:t xml:space="preserve">, 2026; pandas </w:t>
-      </w:r>
-      <w:proofErr w:type="spellStart"/>
-      <w:r>
-        <w:t>development</w:t>
-      </w:r>
-      <w:proofErr w:type="spellEnd"/>
-      <w:r>
-        <w:t xml:space="preserve"> </w:t>
-      </w:r>
-      <w:proofErr w:type="spellStart"/>
-      <w:r>
-        <w:t>team</w:t>
-      </w:r>
-      <w:proofErr w:type="spellEnd"/>
-      <w:r>
-        <w:t xml:space="preserve">, 2026; </w:t>
-      </w:r>
-      <w:proofErr w:type="spellStart"/>
-      <w:r>
-        <w:t>NumPy</w:t>
-      </w:r>
-      <w:proofErr w:type="spellEnd"/>
-      <w:r>
-        <w:t xml:space="preserve"> </w:t>
-      </w:r>
-      <w:proofErr w:type="spellStart"/>
-      <w:r>
-        <w:t>Developers</w:t>
-      </w:r>
-      <w:proofErr w:type="spellEnd"/>
-      <w:r>
-        <w:t>, 2026; McKinney, 2022).</w:t>
-      </w:r>
-    </w:p>
-    <w:p>
-      <w:pPr>
-        <w:spacing w:after="120"/>
-        <w:jc w:val="both"/>
-      </w:pPr>
-      <w:r>
-        <w:t>La lógica que puede reutilizarse se separó de los notebooks y se organizó en módulos dentro de src/: carga.py, transformacion.py y validacion.py. Con esta estructura se evita repetir código, se facilita el mantenimiento y las funciones pueden probarse de forma independiente antes de incorporarlas al flujo completo.</w:t>
-      </w:r>
-    </w:p>
-    <w:p>
-      <w:pPr>
-        <w:pStyle w:val="Ttulo1"/>
-      </w:pPr>
-      <w:bookmarkStart w:id="10" w:name="_Toc240490918"/>
-      <w:r>
-        <w:t>5. Reproducibilidad técnica</w:t>
-      </w:r>
-      <w:bookmarkEnd w:id="10"/>
-    </w:p>
-    <w:p>
-      <w:pPr>
-        <w:spacing w:after="120"/>
-        <w:jc w:val="both"/>
-      </w:pPr>
-      <w:r>
-        <w:t xml:space="preserve">El proyecto utiliza un entorno </w:t>
-      </w:r>
-      <w:proofErr w:type="gramStart"/>
-      <w:r>
-        <w:t>virtual .</w:t>
-      </w:r>
-      <w:proofErr w:type="spellStart"/>
-      <w:r>
-        <w:t>venv</w:t>
-      </w:r>
-      <w:proofErr w:type="spellEnd"/>
-      <w:proofErr w:type="gramEnd"/>
-      <w:r>
-        <w:t xml:space="preserve"> con Python 3.14.</w:t>
-      </w:r>
-      <w:r>
-        <w:t>3</w:t>
-      </w:r>
-      <w:r>
-        <w:t xml:space="preserve"> y un archivo requirements.txt para registrar las dependencias necesarias. Entre las principales librerías utilizadas se encuentran pandas 3.0.5, </w:t>
-      </w:r>
-      <w:proofErr w:type="spellStart"/>
-      <w:r>
-        <w:t>NumPy</w:t>
-      </w:r>
-      <w:proofErr w:type="spellEnd"/>
-      <w:r>
-        <w:t xml:space="preserve"> 2.5.3 y </w:t>
-      </w:r>
-      <w:proofErr w:type="spellStart"/>
-      <w:r>
-        <w:t>Matplotlib</w:t>
-      </w:r>
-      <w:proofErr w:type="spellEnd"/>
-      <w:r>
-        <w:t xml:space="preserve"> 3.11.1. Los notebooks F1 y F2 se comprobaron mediante </w:t>
-      </w:r>
-      <w:proofErr w:type="spellStart"/>
-      <w:r>
-        <w:t>Restart</w:t>
-      </w:r>
-      <w:proofErr w:type="spellEnd"/>
-      <w:r>
-        <w:t xml:space="preserve"> </w:t>
-      </w:r>
-      <w:proofErr w:type="spellStart"/>
-      <w:r>
-        <w:t>Kernel</w:t>
-      </w:r>
-      <w:proofErr w:type="spellEnd"/>
-      <w:r>
-        <w:t xml:space="preserve"> -&gt; Run </w:t>
-      </w:r>
-      <w:proofErr w:type="spellStart"/>
-      <w:r>
-        <w:t>All</w:t>
-      </w:r>
-      <w:proofErr w:type="spellEnd"/>
-      <w:r>
-        <w:t xml:space="preserve">, ejecutando todo el flujo desde un </w:t>
-      </w:r>
-      <w:proofErr w:type="spellStart"/>
-      <w:r>
-        <w:t>kernel</w:t>
-      </w:r>
-      <w:proofErr w:type="spellEnd"/>
-      <w:r>
-        <w:t xml:space="preserve"> reiniciado. De esta manera, la reproducibilidad se verifica desde la configuración del entorno y la instalación de dependencias hasta la obtención de resultados que pueden volver a comprobarse.</w:t>
-      </w:r>
-    </w:p>
-    <w:p>
-      <w:pPr>
-        <w:spacing w:after="120"/>
-        <w:jc w:val="both"/>
-      </w:pPr>
-      <w:r>
-        <w:t>El repositorio se organiza en las carpetas F1/, F2/, data/raw/, data/</w:t>
-      </w:r>
-      <w:proofErr w:type="spellStart"/>
-      <w:r>
-        <w:t>processed</w:t>
-      </w:r>
-      <w:proofErr w:type="spellEnd"/>
-      <w:r>
-        <w:t xml:space="preserve">/, </w:t>
-      </w:r>
-      <w:proofErr w:type="spellStart"/>
-      <w:r>
-        <w:t>docs</w:t>
-      </w:r>
-      <w:proofErr w:type="spellEnd"/>
-      <w:r>
-        <w:t xml:space="preserve">/, </w:t>
-      </w:r>
-      <w:proofErr w:type="spellStart"/>
-      <w:r>
-        <w:t>docs</w:t>
-      </w:r>
-      <w:proofErr w:type="spellEnd"/>
-      <w:r>
-        <w:t xml:space="preserve">/evidencias/ y src/. A esta estructura se suman archivos de apoyo técnico como README.md, requirements.txt </w:t>
-      </w:r>
-      <w:proofErr w:type="gramStart"/>
-      <w:r>
-        <w:t>y .</w:t>
-      </w:r>
-      <w:proofErr w:type="spellStart"/>
-      <w:r>
-        <w:t>gitignore</w:t>
-      </w:r>
-      <w:proofErr w:type="spellEnd"/>
-      <w:proofErr w:type="gramEnd"/>
-      <w:r>
-        <w:t>.</w:t>
-      </w:r>
-    </w:p>
-    <w:p>
-      <w:pPr>
-        <w:pStyle w:val="Ttulo1"/>
-      </w:pPr>
-      <w:bookmarkStart w:id="11" w:name="_Toc240490919"/>
-      <w:r>
-        <w:t>6. Control de versiones y trazabilidad</w:t>
       </w:r>
       <w:bookmarkEnd w:id="11"/>
     </w:p>
@@ -3739,92 +4166,16 @@
         <w:jc w:val="both"/>
       </w:pPr>
       <w:r>
-        <w:t xml:space="preserve">Git se utiliza para el control local de versiones y GitHub como repositorio remoto de trabajo colaborativo. Esta separación permite distinguir el mecanismo de </w:t>
-      </w:r>
-      <w:proofErr w:type="spellStart"/>
-      <w:r>
-        <w:t>versionamiento</w:t>
-      </w:r>
-      <w:proofErr w:type="spellEnd"/>
-      <w:r>
-        <w:t xml:space="preserve"> del servicio utilizado para almacenar, compartir y coordinar los avances del proyecto, tal como se plantea en la guía de Git y GitHub de la asignatura (Magíster en Ciencia de Datos e Inteligencia Artificial, 2026).</w:t>
+        <w:t>Los datos utilizados provienen de la plataforma pública de Generación Real del Coordinador Eléctrico Nacional (CEN). De acuerdo con los Términos y Condiciones de Uso de su sitio web, esta información puede descargarse para fines personales y/o académicos, siempre que se identifique y cite la fuente. En este proyecto se utiliza bajo esas condiciones y se mantiene explícitamente su procedencia (Coordinador Eléctrico Nacional, 2026b).</w:t>
       </w:r>
     </w:p>
     <w:p>
       <w:pPr>
-        <w:spacing w:after="120"/>
-        <w:jc w:val="both"/>
-      </w:pPr>
-      <w:r>
-        <w:t xml:space="preserve">Los </w:t>
-      </w:r>
-      <w:proofErr w:type="spellStart"/>
-      <w:r>
-        <w:t>commits</w:t>
-      </w:r>
-      <w:proofErr w:type="spellEnd"/>
-      <w:r>
-        <w:t xml:space="preserve"> registran cambios concretos realizados durante el desarrollo: correcciones en F1 y F2, </w:t>
-      </w:r>
-      <w:proofErr w:type="spellStart"/>
-      <w:r>
-        <w:t>modularización</w:t>
-      </w:r>
-      <w:proofErr w:type="spellEnd"/>
-      <w:r>
-        <w:t xml:space="preserve"> del código, incorporación del diccionario del CEN, eliminación de un </w:t>
-      </w:r>
-      <w:proofErr w:type="spellStart"/>
-      <w:r>
-        <w:t>dataset</w:t>
-      </w:r>
-      <w:proofErr w:type="spellEnd"/>
-      <w:r>
-        <w:t xml:space="preserve"> obsoleto, actualización del README y renovación de evidencias.</w:t>
-      </w:r>
-    </w:p>
-    <w:p>
-      <w:pPr>
-        <w:spacing w:after="120"/>
-        <w:jc w:val="both"/>
-      </w:pPr>
-      <w:r>
-        <w:lastRenderedPageBreak/>
-        <w:t xml:space="preserve">El historial del repositorio permite identificar contribuciones de los cuatro integrantes del equipo mediante </w:t>
-      </w:r>
-      <w:proofErr w:type="spellStart"/>
-      <w:r>
-        <w:t>commits</w:t>
-      </w:r>
-      <w:proofErr w:type="spellEnd"/>
-      <w:r>
-        <w:t xml:space="preserve"> asociados a documentación, carga y actualización de </w:t>
-      </w:r>
-      <w:proofErr w:type="spellStart"/>
-      <w:r>
-        <w:t>datasets</w:t>
-      </w:r>
-      <w:proofErr w:type="spellEnd"/>
-      <w:r>
-        <w:t>, definición del proyecto, preparación de datos, evidencias y ajustes del repositorio.</w:t>
-      </w:r>
-    </w:p>
-    <w:p>
-      <w:pPr>
-        <w:spacing w:after="120"/>
-        <w:jc w:val="both"/>
-      </w:pPr>
-      <w:r>
-        <w:t>Reproducibilidad y trazabilidad cumplen funciones distintas. La primera permite volver a ejecutar el proyecto bajo condiciones documentadas. La segunda permite reconstruir qué cambió, cuándo ocurrió y cómo cada modificación se relaciona con el código, la documentación y las evidencias generadas.</w:t>
-      </w:r>
-    </w:p>
-    <w:p>
-      <w:pPr>
         <w:pStyle w:val="Ttulo1"/>
       </w:pPr>
-      <w:bookmarkStart w:id="12" w:name="_Toc240490920"/>
-      <w:r>
-        <w:t>7. Fase 1 - Definición del proyecto</w:t>
+      <w:bookmarkStart w:id="12" w:name="_Toc240494043"/>
+      <w:r>
+        <w:t>4. Aplicación de herramientas científicas</w:t>
       </w:r>
       <w:bookmarkEnd w:id="12"/>
     </w:p>
@@ -3834,15 +4185,71 @@
         <w:jc w:val="both"/>
       </w:pPr>
       <w:r>
-        <w:t>F1_</w:t>
-      </w:r>
-      <w:proofErr w:type="gramStart"/>
-      <w:r>
-        <w:t>definicion.ipynb</w:t>
-      </w:r>
-      <w:proofErr w:type="gramEnd"/>
-      <w:r>
-        <w:t xml:space="preserve"> reúne la definición inicial del proyecto. Allí se establece la pregunta de investigación, los objetivos, el alcance, la fuente de datos, la unidad de observación, los roles de las variables, los supuestos y las principales decisiones metodológicas.</w:t>
+        <w:t xml:space="preserve">El proyecto se desarrolla en Python utilizando </w:t>
+      </w:r>
+      <w:proofErr w:type="spellStart"/>
+      <w:r>
+        <w:t>Jupyter</w:t>
+      </w:r>
+      <w:proofErr w:type="spellEnd"/>
+      <w:r>
+        <w:t xml:space="preserve"> Notebook como entorno de trabajo. Pandas se usa para cargar, filtrar, transformar y validar los datos; </w:t>
+      </w:r>
+      <w:proofErr w:type="spellStart"/>
+      <w:r>
+        <w:t>NumPy</w:t>
+      </w:r>
+      <w:proofErr w:type="spellEnd"/>
+      <w:r>
+        <w:t xml:space="preserve"> apoya las operaciones numéricas y </w:t>
+      </w:r>
+      <w:proofErr w:type="spellStart"/>
+      <w:r>
+        <w:t>Matplotlib</w:t>
+      </w:r>
+      <w:proofErr w:type="spellEnd"/>
+      <w:r>
+        <w:t xml:space="preserve"> se emplea para generar visualizaciones. La implementación del pipeline se apoya tanto en documentación técnica oficial como en bibliografía especializada sobre análisis de datos con Python (Python Software </w:t>
+      </w:r>
+      <w:proofErr w:type="spellStart"/>
+      <w:r>
+        <w:t>Foundation</w:t>
+      </w:r>
+      <w:proofErr w:type="spellEnd"/>
+      <w:r>
+        <w:t xml:space="preserve">, 2026; pandas </w:t>
+      </w:r>
+      <w:proofErr w:type="spellStart"/>
+      <w:r>
+        <w:t>development</w:t>
+      </w:r>
+      <w:proofErr w:type="spellEnd"/>
+      <w:r>
+        <w:t xml:space="preserve"> </w:t>
+      </w:r>
+      <w:proofErr w:type="spellStart"/>
+      <w:r>
+        <w:t>team</w:t>
+      </w:r>
+      <w:proofErr w:type="spellEnd"/>
+      <w:r>
+        <w:t xml:space="preserve">, 2026; </w:t>
+      </w:r>
+      <w:proofErr w:type="spellStart"/>
+      <w:r>
+        <w:t>NumPy</w:t>
+      </w:r>
+      <w:proofErr w:type="spellEnd"/>
+      <w:r>
+        <w:t xml:space="preserve"> </w:t>
+      </w:r>
+      <w:proofErr w:type="spellStart"/>
+      <w:r>
+        <w:t>Developers</w:t>
+      </w:r>
+      <w:proofErr w:type="spellEnd"/>
+      <w:r>
+        <w:t>, 2026; McKinney, 2022).</w:t>
       </w:r>
     </w:p>
     <w:p>
@@ -3851,16 +4258,16 @@
         <w:jc w:val="both"/>
       </w:pPr>
       <w:r>
-        <w:t>El notebook también documenta el entorno técnico y la relación entre reproducibilidad y trazabilidad. Además, incorpora celdas ejecutables para localizar la raíz del proyecto, cargar la fuente de datos y realizar verificaciones iniciales. Así, F1 no queda limitado a una descripción conceptual: también establece el punto de partida técnico desde el cual se ejecuta el resto del trabajo.</w:t>
+        <w:t>La lógica que puede reutilizarse se separó de los notebooks y se organizó en módulos dentro de src/: carga.py, transformacion.py y validacion.py. Con esta estructura se evita repetir código, se facilita el mantenimiento y las funciones pueden probarse de forma independiente antes de incorporarlas al flujo completo.</w:t>
       </w:r>
     </w:p>
     <w:p>
       <w:pPr>
         <w:pStyle w:val="Ttulo1"/>
       </w:pPr>
-      <w:bookmarkStart w:id="13" w:name="_Toc240490921"/>
-      <w:r>
-        <w:t>8. Fase 2 - Preparación, transformación y validación</w:t>
+      <w:bookmarkStart w:id="13" w:name="_Toc240494044"/>
+      <w:r>
+        <w:t>5. Reproducibilidad técnica</w:t>
       </w:r>
       <w:bookmarkEnd w:id="13"/>
     </w:p>
@@ -3870,23 +4277,74 @@
         <w:jc w:val="both"/>
       </w:pPr>
       <w:r>
-        <w:t>F2_preparacion_</w:t>
+        <w:t xml:space="preserve">El proyecto utiliza un entorno </w:t>
       </w:r>
       <w:proofErr w:type="gramStart"/>
       <w:r>
-        <w:t>datos.ipynb</w:t>
-      </w:r>
+        <w:t>virtual .</w:t>
+      </w:r>
+      <w:proofErr w:type="spellStart"/>
+      <w:r>
+        <w:t>venv</w:t>
+      </w:r>
+      <w:proofErr w:type="spellEnd"/>
       <w:proofErr w:type="gramEnd"/>
       <w:r>
-        <w:t xml:space="preserve"> desarrolla el flujo de preparación de los datos. Incluye la carga y exploración inicial, el filtrado de las centrales y fechas seleccionadas, la transformación desde formato ancho a largo, la creación de variables derivadas, las validaciones y la exportación del </w:t>
+        <w:t xml:space="preserve"> con Python 3.14.</w:t>
+      </w:r>
+      <w:r>
+        <w:t>3</w:t>
+      </w:r>
+      <w:r>
+        <w:t xml:space="preserve"> y un archivo requirements.txt para registrar las dependencias necesarias. Entre las principales librerías utilizadas se encuentran pandas 3.0.5, </w:t>
       </w:r>
       <w:proofErr w:type="spellStart"/>
       <w:r>
-        <w:t>dataset</w:t>
+        <w:t>NumPy</w:t>
       </w:r>
       <w:proofErr w:type="spellEnd"/>
       <w:r>
-        <w:t xml:space="preserve"> procesado. Después de la transformación se mantienen 24 observaciones por cada combinación central-fecha, condición que se comprueba mediante código.</w:t>
+        <w:t xml:space="preserve"> 2.5.3 y </w:t>
+      </w:r>
+      <w:proofErr w:type="spellStart"/>
+      <w:r>
+        <w:t>Matplotlib</w:t>
+      </w:r>
+      <w:proofErr w:type="spellEnd"/>
+      <w:r>
+        <w:t xml:space="preserve"> 3.11.1. Los notebooks F1 y F2 se comprobaron mediante </w:t>
+      </w:r>
+      <w:proofErr w:type="spellStart"/>
+      <w:r>
+        <w:t>Restart</w:t>
+      </w:r>
+      <w:proofErr w:type="spellEnd"/>
+      <w:r>
+        <w:t xml:space="preserve"> </w:t>
+      </w:r>
+      <w:proofErr w:type="spellStart"/>
+      <w:r>
+        <w:t>Kernel</w:t>
+      </w:r>
+      <w:proofErr w:type="spellEnd"/>
+      <w:r>
+        <w:t xml:space="preserve"> -&gt; Run </w:t>
+      </w:r>
+      <w:proofErr w:type="spellStart"/>
+      <w:r>
+        <w:t>All</w:t>
+      </w:r>
+      <w:proofErr w:type="spellEnd"/>
+      <w:r>
+        <w:t xml:space="preserve">, ejecutando todo el flujo desde un </w:t>
+      </w:r>
+      <w:proofErr w:type="spellStart"/>
+      <w:r>
+        <w:t>kernel</w:t>
+      </w:r>
+      <w:proofErr w:type="spellEnd"/>
+      <w:r>
+        <w:t xml:space="preserve"> reiniciado. De esta manera, la reproducibilidad se verifica desde la configuración del entorno y la instalación de dependencias hasta la obtención de resultados que pueden volver a comprobarse.</w:t>
       </w:r>
     </w:p>
     <w:p>
@@ -3895,57 +4353,53 @@
         <w:jc w:val="both"/>
       </w:pPr>
       <w:r>
-        <w:t xml:space="preserve">El </w:t>
+        <w:t>El repositorio se organiza en las carpetas F1/, F2/, data/raw/, data/</w:t>
       </w:r>
       <w:proofErr w:type="spellStart"/>
       <w:r>
-        <w:t>dataset</w:t>
+        <w:t>processed</w:t>
       </w:r>
       <w:proofErr w:type="spellEnd"/>
       <w:r>
-        <w:t xml:space="preserve"> final contiene 17.496 observaciones y 13 variables. Las validaciones muestran 0 valores nulos, 0 duplicados exactos, 0 identificadores duplicados y 0 valores negativos en </w:t>
+        <w:t xml:space="preserve">/, </w:t>
       </w:r>
       <w:proofErr w:type="spellStart"/>
       <w:r>
-        <w:t>Generacion_MWh</w:t>
+        <w:t>docs</w:t>
       </w:r>
       <w:proofErr w:type="spellEnd"/>
       <w:r>
-        <w:t>. El conjunto incluye 3 centrales y 243 fechas. No se aplicó imputación, porque no existen valores nulos en el resultado, ni normalización, ya que en esta etapa interesa conservar la escala original de generación para el análisis descriptivo.</w:t>
+        <w:t xml:space="preserve">/, </w:t>
+      </w:r>
+      <w:proofErr w:type="spellStart"/>
+      <w:r>
+        <w:t>docs</w:t>
+      </w:r>
+      <w:proofErr w:type="spellEnd"/>
+      <w:r>
+        <w:t xml:space="preserve">/evidencias/ y src/. A esta estructura se suman archivos de apoyo técnico como README.md, requirements.txt </w:t>
+      </w:r>
+      <w:proofErr w:type="gramStart"/>
+      <w:r>
+        <w:t>y .</w:t>
+      </w:r>
+      <w:proofErr w:type="spellStart"/>
+      <w:r>
+        <w:t>gitignore</w:t>
+      </w:r>
+      <w:proofErr w:type="spellEnd"/>
+      <w:proofErr w:type="gramEnd"/>
+      <w:r>
+        <w:t>.</w:t>
       </w:r>
     </w:p>
     <w:p>
       <w:pPr>
-        <w:spacing w:after="120"/>
-        <w:jc w:val="both"/>
-      </w:pPr>
-      <w:r>
-        <w:t xml:space="preserve">También se identificaron 4.438 observaciones con generación igual a 0 </w:t>
-      </w:r>
-      <w:proofErr w:type="spellStart"/>
-      <w:r>
-        <w:t>MWh</w:t>
-      </w:r>
-      <w:proofErr w:type="spellEnd"/>
-      <w:r>
-        <w:t xml:space="preserve">, equivalentes al 25,37 % del </w:t>
-      </w:r>
-      <w:proofErr w:type="spellStart"/>
-      <w:r>
-        <w:t>dataset</w:t>
-      </w:r>
-      <w:proofErr w:type="spellEnd"/>
-      <w:r>
-        <w:t xml:space="preserve"> final. La proporción varía entre centrales: 54,75 % en TER CMPC Laja, 6,36 % en TER CMPC Pacífico y 14,99 % en TER CMPC Santa Fe. Estos registros se mantienen en el conjunto de datos y no se clasifican automáticamente como fallas, detenciones o mantenciones, porque la fuente disponible no entrega antecedentes suficientes para atribuirles una causa operacional.</w:t>
-      </w:r>
-    </w:p>
-    <w:p>
-      <w:pPr>
         <w:pStyle w:val="Ttulo1"/>
       </w:pPr>
-      <w:bookmarkStart w:id="14" w:name="_Toc240490922"/>
-      <w:r>
-        <w:t>9. Validación técnica y evidencias</w:t>
+      <w:bookmarkStart w:id="14" w:name="_Toc240494045"/>
+      <w:r>
+        <w:t>6. Control de versiones y trazabilidad</w:t>
       </w:r>
       <w:bookmarkEnd w:id="14"/>
     </w:p>
@@ -3955,7 +4409,15 @@
         <w:jc w:val="both"/>
       </w:pPr>
       <w:r>
-        <w:t>La lógica de validación se concentra en src/validacion.py. Este módulo comprueba dimensiones, valores nulos, duplicados, unicidad del identificador, presencia de valores negativos, número de centrales y existencia de exactamente 24 observaciones por cada combinación central-fecha.</w:t>
+        <w:t xml:space="preserve">Git se utiliza para el control local de versiones y GitHub como repositorio remoto de trabajo colaborativo. Esta separación permite distinguir el mecanismo de </w:t>
+      </w:r>
+      <w:proofErr w:type="spellStart"/>
+      <w:r>
+        <w:t>versionamiento</w:t>
+      </w:r>
+      <w:proofErr w:type="spellEnd"/>
+      <w:r>
+        <w:t xml:space="preserve"> del servicio utilizado para almacenar, compartir y coordinar los avances del proyecto, tal como se plantea en la guía de Git y GitHub de la asignatura (Magíster en Ciencia de Datos e Inteligencia Artificial, 2026).</w:t>
       </w:r>
     </w:p>
     <w:p>
@@ -3965,6 +4427,214 @@
       </w:pPr>
       <w:r>
         <w:lastRenderedPageBreak/>
+        <w:t xml:space="preserve">Los </w:t>
+      </w:r>
+      <w:proofErr w:type="spellStart"/>
+      <w:r>
+        <w:t>commits</w:t>
+      </w:r>
+      <w:proofErr w:type="spellEnd"/>
+      <w:r>
+        <w:t xml:space="preserve"> registran cambios concretos realizados durante el desarrollo: correcciones en F1 y F2, </w:t>
+      </w:r>
+      <w:proofErr w:type="spellStart"/>
+      <w:r>
+        <w:t>modularización</w:t>
+      </w:r>
+      <w:proofErr w:type="spellEnd"/>
+      <w:r>
+        <w:t xml:space="preserve"> del código, incorporación del diccionario del CEN, eliminación de un </w:t>
+      </w:r>
+      <w:proofErr w:type="spellStart"/>
+      <w:r>
+        <w:t>dataset</w:t>
+      </w:r>
+      <w:proofErr w:type="spellEnd"/>
+      <w:r>
+        <w:t xml:space="preserve"> obsoleto, actualización del README y renovación de evidencias.</w:t>
+      </w:r>
+    </w:p>
+    <w:p>
+      <w:pPr>
+        <w:spacing w:after="120"/>
+        <w:jc w:val="both"/>
+      </w:pPr>
+      <w:r>
+        <w:t xml:space="preserve">El historial del repositorio permite identificar contribuciones de los cuatro integrantes del equipo mediante </w:t>
+      </w:r>
+      <w:proofErr w:type="spellStart"/>
+      <w:r>
+        <w:t>commits</w:t>
+      </w:r>
+      <w:proofErr w:type="spellEnd"/>
+      <w:r>
+        <w:t xml:space="preserve"> asociados a documentación, carga y actualización de </w:t>
+      </w:r>
+      <w:proofErr w:type="spellStart"/>
+      <w:r>
+        <w:t>datasets</w:t>
+      </w:r>
+      <w:proofErr w:type="spellEnd"/>
+      <w:r>
+        <w:t>, definición del proyecto, preparación de datos, evidencias y ajustes del repositorio.</w:t>
+      </w:r>
+    </w:p>
+    <w:p>
+      <w:pPr>
+        <w:spacing w:after="120"/>
+        <w:jc w:val="both"/>
+      </w:pPr>
+      <w:r>
+        <w:t>Reproducibilidad y trazabilidad cumplen funciones distintas. La primera permite volver a ejecutar el proyecto bajo condiciones documentadas. La segunda permite reconstruir qué cambió, cuándo ocurrió y cómo cada modificación se relaciona con el código, la documentación y las evidencias generadas.</w:t>
+      </w:r>
+    </w:p>
+    <w:p>
+      <w:pPr>
+        <w:pStyle w:val="Ttulo1"/>
+      </w:pPr>
+      <w:bookmarkStart w:id="15" w:name="_Toc240494046"/>
+      <w:r>
+        <w:t>7. Fase 1 - Definición del proyecto</w:t>
+      </w:r>
+      <w:bookmarkEnd w:id="15"/>
+    </w:p>
+    <w:p>
+      <w:pPr>
+        <w:spacing w:after="120"/>
+        <w:jc w:val="both"/>
+      </w:pPr>
+      <w:r>
+        <w:t>F1_</w:t>
+      </w:r>
+      <w:proofErr w:type="gramStart"/>
+      <w:r>
+        <w:t>definicion.ipynb</w:t>
+      </w:r>
+      <w:proofErr w:type="gramEnd"/>
+      <w:r>
+        <w:t xml:space="preserve"> reúne la definición inicial del proyecto. Allí se establece la pregunta de investigación, los objetivos, el alcance, la fuente de datos, la unidad de observación, los roles de las variables, los supuestos y las principales decisiones metodológicas.</w:t>
+      </w:r>
+    </w:p>
+    <w:p>
+      <w:pPr>
+        <w:spacing w:after="120"/>
+        <w:jc w:val="both"/>
+      </w:pPr>
+      <w:r>
+        <w:t>El notebook también documenta el entorno técnico y la relación entre reproducibilidad y trazabilidad. Además, incorpora celdas ejecutables para localizar la raíz del proyecto, cargar la fuente de datos y realizar verificaciones iniciales. Así, F1 no queda limitado a una descripción conceptual: también establece el punto de partida técnico desde el cual se ejecuta el resto del trabajo.</w:t>
+      </w:r>
+    </w:p>
+    <w:p>
+      <w:pPr>
+        <w:pStyle w:val="Ttulo1"/>
+      </w:pPr>
+      <w:bookmarkStart w:id="16" w:name="_Toc240494047"/>
+      <w:r>
+        <w:t>8. Fase 2 - Preparación, transformación y validación</w:t>
+      </w:r>
+      <w:bookmarkEnd w:id="16"/>
+    </w:p>
+    <w:p>
+      <w:pPr>
+        <w:spacing w:after="120"/>
+        <w:jc w:val="both"/>
+      </w:pPr>
+      <w:r>
+        <w:t>F2_preparacion_</w:t>
+      </w:r>
+      <w:proofErr w:type="gramStart"/>
+      <w:r>
+        <w:t>datos.ipynb</w:t>
+      </w:r>
+      <w:proofErr w:type="gramEnd"/>
+      <w:r>
+        <w:t xml:space="preserve"> desarrolla el flujo de preparación de los datos. Incluye la carga y exploración inicial, el filtrado de las centrales y fechas seleccionadas, la transformación desde formato ancho a largo, la creación de variables derivadas, las validaciones y la exportación del </w:t>
+      </w:r>
+      <w:proofErr w:type="spellStart"/>
+      <w:r>
+        <w:t>dataset</w:t>
+      </w:r>
+      <w:proofErr w:type="spellEnd"/>
+      <w:r>
+        <w:t xml:space="preserve"> procesado. Después de la transformación se mantienen 24 observaciones por cada combinación central-fecha, condición que se comprueba mediante código.</w:t>
+      </w:r>
+    </w:p>
+    <w:p>
+      <w:pPr>
+        <w:spacing w:after="120"/>
+        <w:jc w:val="both"/>
+      </w:pPr>
+      <w:r>
+        <w:t xml:space="preserve">El </w:t>
+      </w:r>
+      <w:proofErr w:type="spellStart"/>
+      <w:r>
+        <w:t>dataset</w:t>
+      </w:r>
+      <w:proofErr w:type="spellEnd"/>
+      <w:r>
+        <w:t xml:space="preserve"> final contiene 17.496 observaciones y 13 variables. Las validaciones muestran 0 valores nulos, 0 duplicados exactos, 0 identificadores duplicados y 0 valores negativos en </w:t>
+      </w:r>
+      <w:proofErr w:type="spellStart"/>
+      <w:r>
+        <w:t>Generacion_MWh</w:t>
+      </w:r>
+      <w:proofErr w:type="spellEnd"/>
+      <w:r>
+        <w:t>. El conjunto incluye 3 centrales y 243 fechas. No se aplicó imputación, porque no existen valores nulos en el resultado, ni normalización, ya que en esta etapa interesa conservar la escala original de generación para el análisis descriptivo.</w:t>
+      </w:r>
+    </w:p>
+    <w:p>
+      <w:pPr>
+        <w:spacing w:after="120"/>
+        <w:jc w:val="both"/>
+      </w:pPr>
+      <w:r>
+        <w:t xml:space="preserve">También se identificaron 4.438 observaciones con generación igual a 0 </w:t>
+      </w:r>
+      <w:proofErr w:type="spellStart"/>
+      <w:r>
+        <w:t>MWh</w:t>
+      </w:r>
+      <w:proofErr w:type="spellEnd"/>
+      <w:r>
+        <w:t xml:space="preserve">, equivalentes al 25,37 % del </w:t>
+      </w:r>
+      <w:proofErr w:type="spellStart"/>
+      <w:r>
+        <w:t>dataset</w:t>
+      </w:r>
+      <w:proofErr w:type="spellEnd"/>
+      <w:r>
+        <w:t xml:space="preserve"> final. La proporción varía entre centrales: 54,75 % en TER CMPC Laja, 6,36 % en TER CMPC Pacífico y 14,99 % en TER CMPC Santa Fe. Estos registros se mantienen en el conjunto de datos y no se clasifican automáticamente como fallas, detenciones o mantenciones, porque la fuente disponible no entrega antecedentes suficientes para atribuirles una causa operacional.</w:t>
+      </w:r>
+    </w:p>
+    <w:p>
+      <w:pPr>
+        <w:pStyle w:val="Ttulo1"/>
+      </w:pPr>
+      <w:bookmarkStart w:id="17" w:name="_Toc240494048"/>
+      <w:r>
+        <w:lastRenderedPageBreak/>
+        <w:t>9. Validación técnica y evidencias</w:t>
+      </w:r>
+      <w:bookmarkEnd w:id="17"/>
+    </w:p>
+    <w:p>
+      <w:pPr>
+        <w:spacing w:after="120"/>
+        <w:jc w:val="both"/>
+      </w:pPr>
+      <w:r>
+        <w:t>La lógica de validación se concentra en src/validacion.py. Este módulo comprueba dimensiones, valores nulos, duplicados, unicidad del identificador, presencia de valores negativos, número de centrales y existencia de exactamente 24 observaciones por cada combinación central-fecha.</w:t>
+      </w:r>
+    </w:p>
+    <w:p>
+      <w:pPr>
+        <w:spacing w:after="120"/>
+        <w:jc w:val="both"/>
+      </w:pPr>
+      <w:r>
         <w:t>Las pruebas consideran tres escenarios distintos. El caso normal verifica el funcionamiento esperado del flujo. El caso límite introduce de manera artificial un registro duplicado para comprobar que la validación lo detecte. Finalmente, el caso de excepción utiliza una ruta de archivo inexistente para verificar que el sistema controle correctamente ese tipo de error.</w:t>
       </w:r>
     </w:p>
@@ -4232,30 +4902,83 @@
     </w:tbl>
     <w:p>
       <w:pPr>
-        <w:spacing w:after="0" w:line="240" w:lineRule="auto"/>
-        <w:jc w:val="center"/>
+        <w:pStyle w:val="Descripcin"/>
+        <w:ind w:left="720"/>
         <w:rPr>
+          <w:b w:val="0"/>
+          <w:bCs w:val="0"/>
           <w:i/>
           <w:iCs/>
+          <w:color w:val="auto"/>
         </w:rPr>
       </w:pPr>
       <w:r>
         <w:rPr>
-          <w:i/>
-          <w:iCs/>
+          <w:b w:val="0"/>
+          <w:bCs w:val="0"/>
+          <w:color w:val="auto"/>
         </w:rPr>
-        <w:t xml:space="preserve">Evidencias disponibles en el repositorio </w:t>
-      </w:r>
-      <w:hyperlink r:id="rId20" w:history="1">
-        <w:r>
-          <w:rPr>
-            <w:rStyle w:val="Hipervnculo"/>
-            <w:i/>
-            <w:iCs/>
-          </w:rPr>
-          <w:t>GitHub</w:t>
-        </w:r>
-      </w:hyperlink>
+        <w:t xml:space="preserve">          </w:t>
+      </w:r>
+      <w:bookmarkStart w:id="18" w:name="_Toc240493889"/>
+      <w:r>
+        <w:rPr>
+          <w:b w:val="0"/>
+          <w:bCs w:val="0"/>
+          <w:color w:val="auto"/>
+        </w:rPr>
+        <w:t xml:space="preserve">Tabla </w:t>
+      </w:r>
+      <w:r>
+        <w:rPr>
+          <w:b w:val="0"/>
+          <w:bCs w:val="0"/>
+          <w:color w:val="auto"/>
+        </w:rPr>
+        <w:fldChar w:fldCharType="begin"/>
+      </w:r>
+      <w:r>
+        <w:rPr>
+          <w:b w:val="0"/>
+          <w:bCs w:val="0"/>
+          <w:color w:val="auto"/>
+        </w:rPr>
+        <w:instrText xml:space="preserve"> SEQ Tabla \* ARABIC </w:instrText>
+      </w:r>
+      <w:r>
+        <w:rPr>
+          <w:b w:val="0"/>
+          <w:bCs w:val="0"/>
+          <w:color w:val="auto"/>
+        </w:rPr>
+        <w:fldChar w:fldCharType="separate"/>
+      </w:r>
+      <w:r>
+        <w:rPr>
+          <w:b w:val="0"/>
+          <w:bCs w:val="0"/>
+          <w:noProof/>
+          <w:color w:val="auto"/>
+        </w:rPr>
+        <w:t>2</w:t>
+      </w:r>
+      <w:r>
+        <w:rPr>
+          <w:b w:val="0"/>
+          <w:bCs w:val="0"/>
+          <w:color w:val="auto"/>
+        </w:rPr>
+        <w:fldChar w:fldCharType="end"/>
+      </w:r>
+      <w:r>
+        <w:rPr>
+          <w:b w:val="0"/>
+          <w:bCs w:val="0"/>
+          <w:color w:val="auto"/>
+        </w:rPr>
+        <w:t>: Matriz de evidencias técnicas del proyecto disponibles en el repositorio GitHub.</w:t>
+      </w:r>
+      <w:bookmarkEnd w:id="18"/>
     </w:p>
     <w:p>
       <w:pPr>
@@ -4269,18 +4992,24 @@
         <w:jc w:val="both"/>
       </w:pPr>
       <w:r>
-        <w:t>Cada evidencia se encuentra identificada con el mismo nombre utilizado en el repositorio, lo que permite relacionar directamente el contenido del informe con los archivos de respaldo.</w:t>
+        <w:t xml:space="preserve">Cada evidencia se encuentra identificada </w:t>
+      </w:r>
+      <w:r>
+        <w:t xml:space="preserve">en la Tabla N°2 </w:t>
+      </w:r>
+      <w:r>
+        <w:t>con el mismo nombre utilizado en el repositorio, lo que permite relacionar directamente el contenido del informe con los archivos de respaldo.</w:t>
       </w:r>
     </w:p>
     <w:p>
       <w:pPr>
         <w:pStyle w:val="Ttulo1"/>
       </w:pPr>
-      <w:bookmarkStart w:id="15" w:name="_Toc240490923"/>
+      <w:bookmarkStart w:id="19" w:name="_Toc240494049"/>
       <w:r>
         <w:t>10. Vinculación con el mapa conceptual</w:t>
       </w:r>
-      <w:bookmarkEnd w:id="15"/>
+      <w:bookmarkEnd w:id="19"/>
     </w:p>
     <w:p>
       <w:pPr>
@@ -4344,7 +5073,7 @@
                     <pic:cNvPicPr/>
                   </pic:nvPicPr>
                   <pic:blipFill rotWithShape="1">
-                    <a:blip r:embed="rId21"/>
+                    <a:blip r:embed="rId20"/>
                     <a:srcRect l="8982" t="38543" r="8349" b="1573"/>
                     <a:stretch>
                       <a:fillRect/>
@@ -4582,25 +5311,74 @@
     </w:p>
     <w:p>
       <w:pPr>
+        <w:pStyle w:val="Descripcin"/>
         <w:jc w:val="center"/>
         <w:rPr>
+          <w:b w:val="0"/>
+          <w:bCs w:val="0"/>
           <w:iCs/>
+          <w:color w:val="auto"/>
         </w:rPr>
       </w:pPr>
+      <w:bookmarkStart w:id="20" w:name="_Toc240493957"/>
       <w:r>
         <w:rPr>
-          <w:i/>
+          <w:b w:val="0"/>
+          <w:bCs w:val="0"/>
+          <w:color w:val="auto"/>
         </w:rPr>
-        <w:t>Figura 1. Mapa conceptual actualizado del proyecto.</w:t>
-      </w:r>
-    </w:p>
-    <w:p>
-      <w:pPr>
-        <w:jc w:val="center"/>
+        <w:t xml:space="preserve">Ilustración </w:t>
+      </w:r>
+      <w:r>
         <w:rPr>
-          <w:iCs/>
+          <w:b w:val="0"/>
+          <w:bCs w:val="0"/>
+          <w:color w:val="auto"/>
         </w:rPr>
-      </w:pPr>
+        <w:fldChar w:fldCharType="begin"/>
+      </w:r>
+      <w:r>
+        <w:rPr>
+          <w:b w:val="0"/>
+          <w:bCs w:val="0"/>
+          <w:color w:val="auto"/>
+        </w:rPr>
+        <w:instrText xml:space="preserve"> SEQ Ilustración \* ARABIC </w:instrText>
+      </w:r>
+      <w:r>
+        <w:rPr>
+          <w:b w:val="0"/>
+          <w:bCs w:val="0"/>
+          <w:color w:val="auto"/>
+        </w:rPr>
+        <w:fldChar w:fldCharType="separate"/>
+      </w:r>
+      <w:r>
+        <w:rPr>
+          <w:b w:val="0"/>
+          <w:bCs w:val="0"/>
+          <w:noProof/>
+          <w:color w:val="auto"/>
+        </w:rPr>
+        <w:t>1</w:t>
+      </w:r>
+      <w:r>
+        <w:rPr>
+          <w:b w:val="0"/>
+          <w:bCs w:val="0"/>
+          <w:color w:val="auto"/>
+        </w:rPr>
+        <w:fldChar w:fldCharType="end"/>
+      </w:r>
+      <w:r>
+        <w:rPr>
+          <w:b w:val="0"/>
+          <w:bCs w:val="0"/>
+          <w:color w:val="auto"/>
+        </w:rPr>
+        <w:t>. Mapa conceptual actualizado del proyecto</w:t>
+      </w:r>
+      <w:bookmarkEnd w:id="20"/>
     </w:p>
     <w:tbl>
       <w:tblPr>
@@ -4636,6 +5414,7 @@
                 <w:b/>
                 <w:bCs/>
               </w:rPr>
+              <w:lastRenderedPageBreak/>
               <w:t>Elemento</w:t>
             </w:r>
           </w:p>
@@ -5114,22 +5893,103 @@
     </w:tbl>
     <w:p>
       <w:pPr>
+        <w:pStyle w:val="Descripcin"/>
+        <w:rPr>
+          <w:b w:val="0"/>
+          <w:bCs w:val="0"/>
+          <w:color w:val="auto"/>
+        </w:rPr>
+      </w:pPr>
+      <w:bookmarkStart w:id="21" w:name="_Toc240493890"/>
+      <w:r>
+        <w:rPr>
+          <w:b w:val="0"/>
+          <w:bCs w:val="0"/>
+          <w:color w:val="auto"/>
+        </w:rPr>
+        <w:t xml:space="preserve">Tabla </w:t>
+      </w:r>
+      <w:r>
+        <w:rPr>
+          <w:b w:val="0"/>
+          <w:bCs w:val="0"/>
+          <w:color w:val="auto"/>
+        </w:rPr>
+        <w:fldChar w:fldCharType="begin"/>
+      </w:r>
+      <w:r>
+        <w:rPr>
+          <w:b w:val="0"/>
+          <w:bCs w:val="0"/>
+          <w:color w:val="auto"/>
+        </w:rPr>
+        <w:instrText xml:space="preserve"> SEQ Tabla \* ARABIC </w:instrText>
+      </w:r>
+      <w:r>
+        <w:rPr>
+          <w:b w:val="0"/>
+          <w:bCs w:val="0"/>
+          <w:color w:val="auto"/>
+        </w:rPr>
+        <w:fldChar w:fldCharType="separate"/>
+      </w:r>
+      <w:r>
+        <w:rPr>
+          <w:b w:val="0"/>
+          <w:bCs w:val="0"/>
+          <w:noProof/>
+          <w:color w:val="auto"/>
+        </w:rPr>
+        <w:t>3</w:t>
+      </w:r>
+      <w:r>
+        <w:rPr>
+          <w:b w:val="0"/>
+          <w:bCs w:val="0"/>
+          <w:color w:val="auto"/>
+        </w:rPr>
+        <w:fldChar w:fldCharType="end"/>
+      </w:r>
+      <w:r>
+        <w:rPr>
+          <w:b w:val="0"/>
+          <w:bCs w:val="0"/>
+          <w:color w:val="auto"/>
+        </w:rPr>
+        <w:t>. Matriz de vinculación entre los elementos del mapa conceptual y su evidencia técnica.</w:t>
+      </w:r>
+      <w:bookmarkEnd w:id="21"/>
+    </w:p>
+    <w:p>
+      <w:pPr>
         <w:spacing w:after="120"/>
         <w:jc w:val="both"/>
       </w:pPr>
       <w:r>
-        <w:t>La tabla permite comprobar en ambos sentidos la relación entre el mapa conceptual y lo que efectivamente se implementó. Cada componente desarrollado cuenta con una evidencia concreta, ya sea en un notebook, un módulo, un archivo de apoyo técnico o una captura. Los elementos correspondientes a F3 y F4 se mantienen separados, de modo que el informe no presente como realizado aquello que todavía pertenece a etapas posteriores.</w:t>
+        <w:t xml:space="preserve">La </w:t>
+      </w:r>
+      <w:r>
+        <w:t>T</w:t>
+      </w:r>
+      <w:r>
+        <w:t>abla</w:t>
+      </w:r>
+      <w:r>
+        <w:t xml:space="preserve"> N°3</w:t>
+      </w:r>
+      <w:r>
+        <w:t xml:space="preserve"> permite comprobar en ambos sentidos la relación entre el mapa conceptual y lo que efectivamente se implementó. Cada componente desarrollado cuenta con una evidencia concreta, ya sea en un notebook, un módulo, un archivo de apoyo técnico o una captura. Los elementos correspondientes a F3 y F4 se mantienen separados, de modo que el informe no presente como realizado aquello que todavía pertenece a etapas posteriores.</w:t>
       </w:r>
     </w:p>
     <w:p>
       <w:pPr>
         <w:pStyle w:val="Ttulo1"/>
       </w:pPr>
-      <w:bookmarkStart w:id="16" w:name="_Toc240490924"/>
+      <w:bookmarkStart w:id="22" w:name="_Toc240494050"/>
       <w:r>
         <w:t>11. Estado de avance F1-F4</w:t>
       </w:r>
-      <w:bookmarkEnd w:id="16"/>
+      <w:bookmarkEnd w:id="22"/>
     </w:p>
     <w:tbl>
       <w:tblPr>
@@ -5352,14 +6212,83 @@
     </w:tbl>
     <w:p>
       <w:pPr>
+        <w:pStyle w:val="Descripcin"/>
+        <w:rPr>
+          <w:b w:val="0"/>
+          <w:bCs w:val="0"/>
+          <w:color w:val="auto"/>
+        </w:rPr>
+      </w:pPr>
+      <w:bookmarkStart w:id="23" w:name="_Toc240493891"/>
+      <w:r>
+        <w:rPr>
+          <w:b w:val="0"/>
+          <w:bCs w:val="0"/>
+          <w:color w:val="auto"/>
+        </w:rPr>
+        <w:t xml:space="preserve">Tabla </w:t>
+      </w:r>
+      <w:r>
+        <w:rPr>
+          <w:b w:val="0"/>
+          <w:bCs w:val="0"/>
+          <w:color w:val="auto"/>
+        </w:rPr>
+        <w:fldChar w:fldCharType="begin"/>
+      </w:r>
+      <w:r>
+        <w:rPr>
+          <w:b w:val="0"/>
+          <w:bCs w:val="0"/>
+          <w:color w:val="auto"/>
+        </w:rPr>
+        <w:instrText xml:space="preserve"> SEQ Tabla \* ARABIC </w:instrText>
+      </w:r>
+      <w:r>
+        <w:rPr>
+          <w:b w:val="0"/>
+          <w:bCs w:val="0"/>
+          <w:color w:val="auto"/>
+        </w:rPr>
+        <w:fldChar w:fldCharType="separate"/>
+      </w:r>
+      <w:r>
+        <w:rPr>
+          <w:b w:val="0"/>
+          <w:bCs w:val="0"/>
+          <w:noProof/>
+          <w:color w:val="auto"/>
+        </w:rPr>
+        <w:t>4</w:t>
+      </w:r>
+      <w:r>
+        <w:rPr>
+          <w:b w:val="0"/>
+          <w:bCs w:val="0"/>
+          <w:color w:val="auto"/>
+        </w:rPr>
+        <w:fldChar w:fldCharType="end"/>
+      </w:r>
+      <w:r>
+        <w:rPr>
+          <w:b w:val="0"/>
+          <w:bCs w:val="0"/>
+          <w:color w:val="auto"/>
+        </w:rPr>
+        <w:t>. Resumen del estado de avance de las fases F1 a F4 del proyecto.</w:t>
+      </w:r>
+      <w:bookmarkEnd w:id="23"/>
+    </w:p>
+    <w:p>
+      <w:pPr>
         <w:pStyle w:val="Ttulo1"/>
       </w:pPr>
-      <w:bookmarkStart w:id="17" w:name="_Toc240490925"/>
+      <w:bookmarkStart w:id="24" w:name="_Toc240494051"/>
       <w:r>
         <w:lastRenderedPageBreak/>
         <w:t>12. Conclusiones</w:t>
       </w:r>
-      <w:bookmarkEnd w:id="17"/>
+      <w:bookmarkEnd w:id="24"/>
     </w:p>
     <w:p/>
     <w:p>
@@ -5462,12 +6391,12 @@
         <w:pStyle w:val="Ttulo1"/>
         <w:spacing w:before="0" w:line="240" w:lineRule="auto"/>
       </w:pPr>
-      <w:bookmarkStart w:id="18" w:name="_Toc240490926"/>
+      <w:bookmarkStart w:id="25" w:name="_Toc240494052"/>
       <w:r>
         <w:lastRenderedPageBreak/>
         <w:t>13. Bibliografía</w:t>
       </w:r>
-      <w:bookmarkEnd w:id="18"/>
+      <w:bookmarkEnd w:id="25"/>
     </w:p>
     <w:p>
       <w:pPr>
@@ -5489,7 +6418,7 @@
       <w:r>
         <w:t xml:space="preserve"> </w:t>
       </w:r>
-      <w:hyperlink r:id="rId22" w:history="1">
+      <w:hyperlink r:id="rId21" w:history="1">
         <w:r>
           <w:rPr>
             <w:rStyle w:val="Hipervnculo"/>
@@ -5521,7 +6450,7 @@
       <w:r>
         <w:t xml:space="preserve"> </w:t>
       </w:r>
-      <w:hyperlink r:id="rId23" w:history="1">
+      <w:hyperlink r:id="rId22" w:history="1">
         <w:r>
           <w:rPr>
             <w:rStyle w:val="Hipervnculo"/>
@@ -5550,7 +6479,7 @@
       <w:r>
         <w:t xml:space="preserve"> </w:t>
       </w:r>
-      <w:hyperlink r:id="rId24" w:history="1">
+      <w:hyperlink r:id="rId23" w:history="1">
         <w:r>
           <w:rPr>
             <w:rStyle w:val="Hipervnculo"/>
@@ -5582,7 +6511,7 @@
       <w:r>
         <w:t xml:space="preserve"> </w:t>
       </w:r>
-      <w:hyperlink r:id="rId25" w:history="1">
+      <w:hyperlink r:id="rId24" w:history="1">
         <w:r>
           <w:rPr>
             <w:rStyle w:val="Hipervnculo"/>
@@ -5627,7 +6556,7 @@
         </w:rPr>
         <w:t xml:space="preserve">. </w:t>
       </w:r>
-      <w:hyperlink r:id="rId26" w:history="1">
+      <w:hyperlink r:id="rId25" w:history="1">
         <w:r>
           <w:rPr>
             <w:rStyle w:val="Hipervnculo"/>
@@ -5676,7 +6605,7 @@
         </w:rPr>
         <w:t xml:space="preserve"> </w:t>
       </w:r>
-      <w:hyperlink r:id="rId27" w:tgtFrame="_new" w:history="1">
+      <w:hyperlink r:id="rId26" w:tgtFrame="_new" w:history="1">
         <w:r>
           <w:rPr>
             <w:rStyle w:val="Hipervnculo"/>
@@ -5729,7 +6658,7 @@
       <w:r>
         <w:t xml:space="preserve"> </w:t>
       </w:r>
-      <w:hyperlink r:id="rId28" w:tgtFrame="_new" w:history="1">
+      <w:hyperlink r:id="rId27" w:tgtFrame="_new" w:history="1">
         <w:r>
           <w:rPr>
             <w:rStyle w:val="Hipervnculo"/>
@@ -5768,7 +6697,7 @@
         </w:rPr>
         <w:t xml:space="preserve"> </w:t>
       </w:r>
-      <w:hyperlink r:id="rId29" w:tgtFrame="_new" w:history="1">
+      <w:hyperlink r:id="rId28" w:tgtFrame="_new" w:history="1">
         <w:r>
           <w:rPr>
             <w:rStyle w:val="Hipervnculo"/>
@@ -5794,7 +6723,7 @@
       <w:r>
         <w:t xml:space="preserve"> [Presentación de clase, Semana 1]. Magíster en Ciencia de Datos e Inteligencia Artificial, Universidad Andrés Bello. </w:t>
       </w:r>
-      <w:hyperlink r:id="rId30" w:tgtFrame="_new" w:history="1">
+      <w:hyperlink r:id="rId29" w:tgtFrame="_new" w:history="1">
         <w:r>
           <w:rPr>
             <w:rStyle w:val="Hipervnculo"/>
@@ -5807,7 +6736,7 @@
       </w:r>
     </w:p>
     <w:sectPr>
-      <w:footerReference w:type="default" r:id="rId31"/>
+      <w:footerReference w:type="default" r:id="rId30"/>
       <w:pgSz w:w="12240" w:h="15840"/>
       <w:pgMar w:top="1247" w:right="1417" w:bottom="1247" w:left="1417" w:header="720" w:footer="720" w:gutter="0"/>
       <w:cols w:space="720"/>
@@ -7990,7 +8919,6 @@
     <w:basedOn w:val="Normal"/>
     <w:next w:val="Normal"/>
     <w:uiPriority w:val="35"/>
-    <w:semiHidden/>
     <w:unhideWhenUsed/>
     <w:qFormat/>
     <w:rsid w:val="00FC693F"/>
@@ -18266,6 +19194,17 @@
       <w:rFonts w:ascii="Calibri" w:hAnsi="Calibri"/>
       <w:lang w:val="es-CL"/>
     </w:rPr>
+  </w:style>
+  <w:style w:type="paragraph" w:styleId="Tabladeilustraciones">
+    <w:name w:val="table of figures"/>
+    <w:basedOn w:val="Normal"/>
+    <w:next w:val="Normal"/>
+    <w:uiPriority w:val="99"/>
+    <w:unhideWhenUsed/>
+    <w:rsid w:val="00556D88"/>
+    <w:pPr>
+      <w:spacing w:after="0"/>
+    </w:pPr>
   </w:style>
 </w:styles>
 </file>

</xml_diff>